<commit_message>
Feat: Arrumando a formatação da documentação.
</commit_message>
<xml_diff>
--- a/Documentação do Projeto AgroFlux.docx
+++ b/Documentação do Projeto AgroFlux.docx
@@ -3,6 +3,8 @@
 <w:document xmlns:wpc="http://schemas.microsoft.com/office/word/2010/wordprocessingCanvas" xmlns:cx="http://schemas.microsoft.com/office/drawing/2014/chartex" xmlns:cx1="http://schemas.microsoft.com/office/drawing/2015/9/8/chartex" xmlns:cx2="http://schemas.microsoft.com/office/drawing/2015/10/21/chartex" xmlns:cx3="http://schemas.microsoft.com/office/drawing/2016/5/9/chartex" xmlns:cx4="http://schemas.microsoft.com/office/drawing/2016/5/10/chartex" xmlns:cx5="http://schemas.microsoft.com/office/drawing/2016/5/11/chartex" xmlns:cx6="http://schemas.microsoft.com/office/drawing/2016/5/12/chartex" xmlns:cx7="http://schemas.microsoft.com/office/drawing/2016/5/13/chartex" xmlns:cx8="http://schemas.microsoft.com/office/drawing/2016/5/14/chartex" xmlns:mc="http://schemas.openxmlformats.org/markup-compatibility/2006" xmlns:aink="http://schemas.microsoft.com/office/drawing/2016/ink" xmlns:am3d="http://schemas.microsoft.com/office/drawing/2017/model3d" xmlns:o="urn:schemas-microsoft-com:office:office" xmlns:r="http://schemas.openxmlformats.org/officeDocument/2006/relationships" xmlns:m="http://schemas.openxmlformats.org/officeDocument/2006/math" xmlns:v="urn:schemas-microsoft-com:vml" xmlns:wp14="http://schemas.microsoft.com/office/word/2010/wordprocessingDrawing" xmlns:wp="http://schemas.openxmlformats.org/drawingml/2006/wordprocessingDrawing" xmlns:w10="urn:schemas-microsoft-com:office:word" xmlns:w="http://schemas.openxmlformats.org/wordprocessingml/2006/main" xmlns:w14="http://schemas.microsoft.com/office/word/2010/wordml" xmlns:w15="http://schemas.microsoft.com/office/word/2012/wordml" xmlns:w16cid="http://schemas.microsoft.com/office/word/2016/wordml/cid" xmlns:w16se="http://schemas.microsoft.com/office/word/2015/wordml/symex" xmlns:wpg="http://schemas.microsoft.com/office/word/2010/wordprocessingGroup" xmlns:wpi="http://schemas.microsoft.com/office/word/2010/wordprocessingInk" xmlns:wne="http://schemas.microsoft.com/office/word/2006/wordml" xmlns:wps="http://schemas.microsoft.com/office/word/2010/wordprocessingShape" mc:Ignorable="w14 w15 w16se w16cid wp14">
   <w:body>
     <w:p>
+      <w:bookmarkStart w:id="0" w:name="_GoBack"/>
+      <w:bookmarkEnd w:id="0"/>
       <w:r>
         <w:rPr>
           <w:noProof/>
@@ -1589,6 +1591,7 @@
           <w:color w:val="auto"/>
           <w:sz w:val="22"/>
           <w:szCs w:val="22"/>
+          <w:lang w:eastAsia="en-US"/>
         </w:rPr>
         <w:id w:val="-1182196434"/>
         <w:docPartObj>
@@ -1599,7 +1602,6 @@
       <w:sdtEndPr>
         <w:rPr>
           <w:rFonts w:ascii="Arial" w:eastAsiaTheme="minorHAnsi" w:hAnsi="Arial" w:cs="Arial"/>
-          <w:lang w:eastAsia="en-US"/>
         </w:rPr>
       </w:sdtEndPr>
       <w:sdtContent>
@@ -1630,7 +1632,16 @@
               <w:bCs/>
               <w:color w:val="000000" w:themeColor="text1"/>
             </w:rPr>
-            <w:t>1. INTRODUÇÃO...................................................................................................................9</w:t>
+            <w:t>1. INTRODUÇÃO...................................................................................................................</w:t>
+          </w:r>
+          <w:r>
+            <w:rPr>
+              <w:rFonts w:ascii="Arial" w:hAnsi="Arial" w:cs="Arial"/>
+              <w:b/>
+              <w:bCs/>
+              <w:color w:val="000000" w:themeColor="text1"/>
+            </w:rPr>
+            <w:t>6</w:t>
           </w:r>
         </w:p>
         <w:p>
@@ -1650,7 +1661,16 @@
               <w:bCs/>
               <w:color w:val="000000" w:themeColor="text1"/>
             </w:rPr>
-            <w:t>2. DESENVOLVIMENTO.....................................................................................................10</w:t>
+            <w:t>2. DESENVOLVIMENTO.....................................................................................................</w:t>
+          </w:r>
+          <w:r>
+            <w:rPr>
+              <w:rFonts w:ascii="Arial" w:hAnsi="Arial" w:cs="Arial"/>
+              <w:b/>
+              <w:bCs/>
+              <w:color w:val="000000" w:themeColor="text1"/>
+            </w:rPr>
+            <w:t>..6</w:t>
           </w:r>
         </w:p>
         <w:p>
@@ -1670,7 +1690,16 @@
               <w:bCs/>
               <w:color w:val="000000" w:themeColor="text1"/>
             </w:rPr>
-            <w:t>2.1 Objetivo geral ..............................................................................................................10</w:t>
+            <w:t>2.1 Objetivo geral ..............................................................................................................</w:t>
+          </w:r>
+          <w:r>
+            <w:rPr>
+              <w:rFonts w:ascii="Arial" w:hAnsi="Arial" w:cs="Arial"/>
+              <w:b/>
+              <w:bCs/>
+              <w:color w:val="000000" w:themeColor="text1"/>
+            </w:rPr>
+            <w:t>..7</w:t>
           </w:r>
         </w:p>
         <w:p>
@@ -1690,17 +1719,25 @@
               <w:bCs/>
               <w:color w:val="000000" w:themeColor="text1"/>
             </w:rPr>
-            <w:t>2.2 Objetivos específicos..................................................................................................10</w:t>
+            <w:t>2.2 Objetivos específicos..................................................................................................</w:t>
+          </w:r>
+          <w:r>
+            <w:rPr>
+              <w:rFonts w:ascii="Arial" w:hAnsi="Arial" w:cs="Arial"/>
+              <w:b/>
+              <w:bCs/>
+              <w:color w:val="000000" w:themeColor="text1"/>
+            </w:rPr>
+            <w:t>..7</w:t>
           </w:r>
         </w:p>
         <w:p>
           <w:pPr>
             <w:pStyle w:val="Sumrio1"/>
             <w:rPr>
-              <w:rFonts w:ascii="Arial" w:hAnsi="Arial" w:cs="Arial"/>
+              <w:rFonts w:ascii="Arial" w:eastAsia="Arial" w:hAnsi="Arial" w:cs="Arial"/>
               <w:b/>
               <w:bCs/>
-              <w:color w:val="000000"/>
             </w:rPr>
           </w:pPr>
           <w:r>
@@ -1710,7 +1747,58 @@
               <w:bCs/>
               <w:color w:val="000000" w:themeColor="text1"/>
             </w:rPr>
-            <w:t>3. REVISÃO BIBLIOGRÁFICA...........................................................................................11</w:t>
+            <w:t xml:space="preserve">3. </w:t>
+          </w:r>
+          <w:r>
+            <w:rPr>
+              <w:rFonts w:ascii="Arial" w:eastAsia="Arial" w:hAnsi="Arial" w:cs="Arial"/>
+              <w:b/>
+              <w:bCs/>
+            </w:rPr>
+            <w:t>METODOLOGIA OU PROCESSOS</w:t>
+          </w:r>
+          <w:r>
+            <w:rPr>
+              <w:rFonts w:ascii="Arial" w:eastAsia="Arial" w:hAnsi="Arial" w:cs="Arial"/>
+              <w:b/>
+              <w:bCs/>
+            </w:rPr>
+            <w:t xml:space="preserve">  </w:t>
+          </w:r>
+          <w:r>
+            <w:rPr>
+              <w:rFonts w:ascii="Arial" w:eastAsia="Arial" w:hAnsi="Arial" w:cs="Arial"/>
+              <w:b/>
+              <w:bCs/>
+            </w:rPr>
+            <w:t>METODOLÓGICOS</w:t>
+          </w:r>
+          <w:r>
+            <w:rPr>
+              <w:rFonts w:ascii="Arial" w:hAnsi="Arial" w:cs="Arial"/>
+              <w:b/>
+              <w:bCs/>
+              <w:color w:val="000000" w:themeColor="text1"/>
+            </w:rPr>
+            <w:t>.................</w:t>
+          </w:r>
+          <w:r>
+            <w:rPr>
+              <w:rFonts w:ascii="Arial" w:hAnsi="Arial" w:cs="Arial"/>
+              <w:b/>
+              <w:bCs/>
+              <w:color w:val="000000" w:themeColor="text1"/>
+            </w:rPr>
+            <w:t>.............................</w:t>
+          </w:r>
+          <w:r>
+            <w:rPr>
+              <w:rFonts w:ascii="Arial" w:hAnsi="Arial" w:cs="Arial"/>
+              <w:b/>
+              <w:bCs/>
+              <w:color w:val="000000" w:themeColor="text1"/>
+            </w:rPr>
+            <w:t>.7</w:t>
           </w:r>
         </w:p>
         <w:p>
@@ -1730,7 +1818,25 @@
               <w:bCs/>
               <w:color w:val="000000" w:themeColor="text1"/>
             </w:rPr>
-            <w:t>4. METODOLOGIA............................................................................................................. 11</w:t>
+            <w:t>4</w:t>
+          </w:r>
+          <w:r>
+            <w:rPr>
+              <w:rFonts w:ascii="Arial" w:hAnsi="Arial" w:cs="Arial"/>
+              <w:b/>
+              <w:bCs/>
+              <w:color w:val="000000" w:themeColor="text1"/>
+            </w:rPr>
+            <w:t>. MÉTODOS.......................................................................................................................</w:t>
+          </w:r>
+          <w:r>
+            <w:rPr>
+              <w:rFonts w:ascii="Arial" w:hAnsi="Arial" w:cs="Arial"/>
+              <w:b/>
+              <w:bCs/>
+              <w:color w:val="000000" w:themeColor="text1"/>
+            </w:rPr>
+            <w:t>..7</w:t>
           </w:r>
         </w:p>
         <w:p>
@@ -1750,7 +1856,25 @@
               <w:bCs/>
               <w:color w:val="000000" w:themeColor="text1"/>
             </w:rPr>
-            <w:t>5. MÉTODOS.......................................................................................................................11</w:t>
+            <w:t>4</w:t>
+          </w:r>
+          <w:r>
+            <w:rPr>
+              <w:rFonts w:ascii="Arial" w:hAnsi="Arial" w:cs="Arial"/>
+              <w:b/>
+              <w:bCs/>
+              <w:color w:val="000000" w:themeColor="text1"/>
+            </w:rPr>
+            <w:t>.1 VsCode..........................................................................................................................</w:t>
+          </w:r>
+          <w:r>
+            <w:rPr>
+              <w:rFonts w:ascii="Arial" w:hAnsi="Arial" w:cs="Arial"/>
+              <w:b/>
+              <w:bCs/>
+              <w:color w:val="000000" w:themeColor="text1"/>
+            </w:rPr>
+            <w:t>..7</w:t>
           </w:r>
         </w:p>
         <w:p>
@@ -1770,7 +1894,25 @@
               <w:bCs/>
               <w:color w:val="000000" w:themeColor="text1"/>
             </w:rPr>
-            <w:t>5.1 VsCode..........................................................................................................................11</w:t>
+            <w:t>4</w:t>
+          </w:r>
+          <w:r>
+            <w:rPr>
+              <w:rFonts w:ascii="Arial" w:hAnsi="Arial" w:cs="Arial"/>
+              <w:b/>
+              <w:bCs/>
+              <w:color w:val="000000" w:themeColor="text1"/>
+            </w:rPr>
+            <w:t>.2 API.................................................................................................................................</w:t>
+          </w:r>
+          <w:r>
+            <w:rPr>
+              <w:rFonts w:ascii="Arial" w:hAnsi="Arial" w:cs="Arial"/>
+              <w:b/>
+              <w:bCs/>
+              <w:color w:val="000000" w:themeColor="text1"/>
+            </w:rPr>
+            <w:t>..8</w:t>
           </w:r>
         </w:p>
         <w:p>
@@ -1790,7 +1932,25 @@
               <w:bCs/>
               <w:color w:val="000000" w:themeColor="text1"/>
             </w:rPr>
-            <w:t>5.2 API.................................................................................................................................12</w:t>
+            <w:t>5</w:t>
+          </w:r>
+          <w:r>
+            <w:rPr>
+              <w:rFonts w:ascii="Arial" w:hAnsi="Arial" w:cs="Arial"/>
+              <w:b/>
+              <w:bCs/>
+              <w:color w:val="000000" w:themeColor="text1"/>
+            </w:rPr>
+            <w:t>. FRAMEWORK.................................................................................................................</w:t>
+          </w:r>
+          <w:r>
+            <w:rPr>
+              <w:rFonts w:ascii="Arial" w:hAnsi="Arial" w:cs="Arial"/>
+              <w:b/>
+              <w:bCs/>
+              <w:color w:val="000000" w:themeColor="text1"/>
+            </w:rPr>
+            <w:t>..8</w:t>
           </w:r>
         </w:p>
         <w:p>
@@ -1810,7 +1970,25 @@
               <w:bCs/>
               <w:color w:val="000000" w:themeColor="text1"/>
             </w:rPr>
-            <w:t>6. FRAMEWORK.................................................................................................................13</w:t>
+            <w:t>5</w:t>
+          </w:r>
+          <w:r>
+            <w:rPr>
+              <w:rFonts w:ascii="Arial" w:hAnsi="Arial" w:cs="Arial"/>
+              <w:b/>
+              <w:bCs/>
+              <w:color w:val="000000" w:themeColor="text1"/>
+            </w:rPr>
+            <w:t>.1 React Native..................................................................................................................</w:t>
+          </w:r>
+          <w:r>
+            <w:rPr>
+              <w:rFonts w:ascii="Arial" w:hAnsi="Arial" w:cs="Arial"/>
+              <w:b/>
+              <w:bCs/>
+              <w:color w:val="000000" w:themeColor="text1"/>
+            </w:rPr>
+            <w:t>..9</w:t>
           </w:r>
         </w:p>
         <w:p>
@@ -1830,7 +2008,25 @@
               <w:bCs/>
               <w:color w:val="000000" w:themeColor="text1"/>
             </w:rPr>
-            <w:t>6.1 React Native..................................................................................................................14</w:t>
+            <w:t>5</w:t>
+          </w:r>
+          <w:r>
+            <w:rPr>
+              <w:rFonts w:ascii="Arial" w:hAnsi="Arial" w:cs="Arial"/>
+              <w:b/>
+              <w:bCs/>
+              <w:color w:val="000000" w:themeColor="text1"/>
+            </w:rPr>
+            <w:t>.2 JavaScript.....................................................................................................................</w:t>
+          </w:r>
+          <w:r>
+            <w:rPr>
+              <w:rFonts w:ascii="Arial" w:hAnsi="Arial" w:cs="Arial"/>
+              <w:b/>
+              <w:bCs/>
+              <w:color w:val="000000" w:themeColor="text1"/>
+            </w:rPr>
+            <w:t>..9</w:t>
           </w:r>
         </w:p>
         <w:p>
@@ -1850,7 +2046,25 @@
               <w:bCs/>
               <w:color w:val="000000" w:themeColor="text1"/>
             </w:rPr>
-            <w:t>6.2 JavaScript.....................................................................................................................14</w:t>
+            <w:t>5</w:t>
+          </w:r>
+          <w:r>
+            <w:rPr>
+              <w:rFonts w:ascii="Arial" w:hAnsi="Arial" w:cs="Arial"/>
+              <w:b/>
+              <w:bCs/>
+              <w:color w:val="000000" w:themeColor="text1"/>
+            </w:rPr>
+            <w:t>.3 NodeJS..........................................................................................................................</w:t>
+          </w:r>
+          <w:r>
+            <w:rPr>
+              <w:rFonts w:ascii="Arial" w:hAnsi="Arial" w:cs="Arial"/>
+              <w:b/>
+              <w:bCs/>
+              <w:color w:val="000000" w:themeColor="text1"/>
+            </w:rPr>
+            <w:t>10</w:t>
           </w:r>
         </w:p>
         <w:p>
@@ -1870,7 +2084,25 @@
               <w:bCs/>
               <w:color w:val="000000" w:themeColor="text1"/>
             </w:rPr>
-            <w:t>6.3 NodeJS..........................................................................................................................15</w:t>
+            <w:t>5</w:t>
+          </w:r>
+          <w:r>
+            <w:rPr>
+              <w:rFonts w:ascii="Arial" w:hAnsi="Arial" w:cs="Arial"/>
+              <w:b/>
+              <w:bCs/>
+              <w:color w:val="000000" w:themeColor="text1"/>
+            </w:rPr>
+            <w:t>.4 Scrum ...........................................................................................................................</w:t>
+          </w:r>
+          <w:r>
+            <w:rPr>
+              <w:rFonts w:ascii="Arial" w:hAnsi="Arial" w:cs="Arial"/>
+              <w:b/>
+              <w:bCs/>
+              <w:color w:val="000000" w:themeColor="text1"/>
+            </w:rPr>
+            <w:t>10</w:t>
           </w:r>
         </w:p>
         <w:p>
@@ -1890,7 +2122,25 @@
               <w:bCs/>
               <w:color w:val="000000" w:themeColor="text1"/>
             </w:rPr>
-            <w:t>6.4 Scrum ...........................................................................................................................15</w:t>
+            <w:t>5</w:t>
+          </w:r>
+          <w:r>
+            <w:rPr>
+              <w:rFonts w:ascii="Arial" w:hAnsi="Arial" w:cs="Arial"/>
+              <w:b/>
+              <w:bCs/>
+              <w:color w:val="000000" w:themeColor="text1"/>
+            </w:rPr>
+            <w:t>.5 Jest................................................................................................................................</w:t>
+          </w:r>
+          <w:r>
+            <w:rPr>
+              <w:rFonts w:ascii="Arial" w:hAnsi="Arial" w:cs="Arial"/>
+              <w:b/>
+              <w:bCs/>
+              <w:color w:val="000000" w:themeColor="text1"/>
+            </w:rPr>
+            <w:t>10</w:t>
           </w:r>
         </w:p>
         <w:p>
@@ -1910,7 +2160,25 @@
               <w:bCs/>
               <w:color w:val="000000" w:themeColor="text1"/>
             </w:rPr>
-            <w:t>6.5 Jest................................................................................................................................16</w:t>
+            <w:t>6</w:t>
+          </w:r>
+          <w:r>
+            <w:rPr>
+              <w:rFonts w:ascii="Arial" w:hAnsi="Arial" w:cs="Arial"/>
+              <w:b/>
+              <w:bCs/>
+              <w:color w:val="000000" w:themeColor="text1"/>
+            </w:rPr>
+            <w:t>. Figma...............................................................................................................................</w:t>
+          </w:r>
+          <w:r>
+            <w:rPr>
+              <w:rFonts w:ascii="Arial" w:hAnsi="Arial" w:cs="Arial"/>
+              <w:b/>
+              <w:bCs/>
+              <w:color w:val="000000" w:themeColor="text1"/>
+            </w:rPr>
+            <w:t>11</w:t>
           </w:r>
         </w:p>
         <w:p>
@@ -1930,7 +2198,25 @@
               <w:bCs/>
               <w:color w:val="000000" w:themeColor="text1"/>
             </w:rPr>
-            <w:t>7. Figma...............................................................................................................................16</w:t>
+            <w:t>7</w:t>
+          </w:r>
+          <w:r>
+            <w:rPr>
+              <w:rFonts w:ascii="Arial" w:hAnsi="Arial" w:cs="Arial"/>
+              <w:b/>
+              <w:bCs/>
+              <w:color w:val="000000" w:themeColor="text1"/>
+            </w:rPr>
+            <w:t>. Trello...............................................................................................................................1</w:t>
+          </w:r>
+          <w:r>
+            <w:rPr>
+              <w:rFonts w:ascii="Arial" w:hAnsi="Arial" w:cs="Arial"/>
+              <w:b/>
+              <w:bCs/>
+              <w:color w:val="000000" w:themeColor="text1"/>
+            </w:rPr>
+            <w:t>2</w:t>
           </w:r>
         </w:p>
         <w:p>
@@ -1950,7 +2236,25 @@
               <w:bCs/>
               <w:color w:val="000000" w:themeColor="text1"/>
             </w:rPr>
-            <w:t>8. Trello...............................................................................................................................17</w:t>
+            <w:t>8</w:t>
+          </w:r>
+          <w:r>
+            <w:rPr>
+              <w:rFonts w:ascii="Arial" w:hAnsi="Arial" w:cs="Arial"/>
+              <w:b/>
+              <w:bCs/>
+              <w:color w:val="000000" w:themeColor="text1"/>
+            </w:rPr>
+            <w:t>. GitHub e Git ...................................................................................................................1</w:t>
+          </w:r>
+          <w:r>
+            <w:rPr>
+              <w:rFonts w:ascii="Arial" w:hAnsi="Arial" w:cs="Arial"/>
+              <w:b/>
+              <w:bCs/>
+              <w:color w:val="000000" w:themeColor="text1"/>
+            </w:rPr>
+            <w:t>2</w:t>
           </w:r>
         </w:p>
         <w:p>
@@ -1970,7 +2274,25 @@
               <w:bCs/>
               <w:color w:val="000000" w:themeColor="text1"/>
             </w:rPr>
-            <w:t>9. GitHub e Git ...................................................................................................................18</w:t>
+            <w:t>9</w:t>
+          </w:r>
+          <w:r>
+            <w:rPr>
+              <w:rFonts w:ascii="Arial" w:hAnsi="Arial" w:cs="Arial"/>
+              <w:b/>
+              <w:bCs/>
+              <w:color w:val="000000" w:themeColor="text1"/>
+            </w:rPr>
+            <w:t>. Package.json ...............................................................................................................1</w:t>
+          </w:r>
+          <w:r>
+            <w:rPr>
+              <w:rFonts w:ascii="Arial" w:hAnsi="Arial" w:cs="Arial"/>
+              <w:b/>
+              <w:bCs/>
+              <w:color w:val="000000" w:themeColor="text1"/>
+            </w:rPr>
+            <w:t>3</w:t>
           </w:r>
         </w:p>
         <w:p>
@@ -1990,7 +2312,34 @@
               <w:bCs/>
               <w:color w:val="000000" w:themeColor="text1"/>
             </w:rPr>
-            <w:t>10. Package.json ...............................................................................................................19</w:t>
+            <w:t>1</w:t>
+          </w:r>
+          <w:r>
+            <w:rPr>
+              <w:rFonts w:ascii="Arial" w:hAnsi="Arial" w:cs="Arial"/>
+              <w:b/>
+              <w:bCs/>
+              <w:color w:val="000000" w:themeColor="text1"/>
+            </w:rPr>
+            <w:t>0</w:t>
+          </w:r>
+          <w:r>
+            <w:rPr>
+              <w:rFonts w:ascii="Arial" w:hAnsi="Arial" w:cs="Arial"/>
+              <w:b/>
+              <w:bCs/>
+              <w:color w:val="000000" w:themeColor="text1"/>
+            </w:rPr>
+            <w:t xml:space="preserve">. Banco de dados.......................................................................................................... </w:t>
+          </w:r>
+          <w:r>
+            <w:rPr>
+              <w:rFonts w:ascii="Arial" w:hAnsi="Arial" w:cs="Arial"/>
+              <w:b/>
+              <w:bCs/>
+              <w:color w:val="000000" w:themeColor="text1"/>
+            </w:rPr>
+            <w:t>14</w:t>
           </w:r>
         </w:p>
         <w:p>
@@ -2010,7 +2359,34 @@
               <w:bCs/>
               <w:color w:val="000000" w:themeColor="text1"/>
             </w:rPr>
-            <w:t>11. Banco de dados.......................................................................................................... 20</w:t>
+            <w:t>1</w:t>
+          </w:r>
+          <w:r>
+            <w:rPr>
+              <w:rFonts w:ascii="Arial" w:hAnsi="Arial" w:cs="Arial"/>
+              <w:b/>
+              <w:bCs/>
+              <w:color w:val="000000" w:themeColor="text1"/>
+            </w:rPr>
+            <w:t>1</w:t>
+          </w:r>
+          <w:r>
+            <w:rPr>
+              <w:rFonts w:ascii="Arial" w:hAnsi="Arial" w:cs="Arial"/>
+              <w:b/>
+              <w:bCs/>
+              <w:color w:val="000000" w:themeColor="text1"/>
+            </w:rPr>
+            <w:t>.RESULTADOS...............................................................................................................</w:t>
+          </w:r>
+          <w:r>
+            <w:rPr>
+              <w:rFonts w:ascii="Arial" w:hAnsi="Arial" w:cs="Arial"/>
+              <w:b/>
+              <w:bCs/>
+              <w:color w:val="000000" w:themeColor="text1"/>
+            </w:rPr>
+            <w:t>15</w:t>
           </w:r>
         </w:p>
         <w:p>
@@ -2030,7 +2406,34 @@
               <w:bCs/>
               <w:color w:val="000000" w:themeColor="text1"/>
             </w:rPr>
-            <w:t>12.RESULTADOS...............................................................................................................22</w:t>
+            <w:t>1</w:t>
+          </w:r>
+          <w:r>
+            <w:rPr>
+              <w:rFonts w:ascii="Arial" w:hAnsi="Arial" w:cs="Arial"/>
+              <w:b/>
+              <w:bCs/>
+              <w:color w:val="000000" w:themeColor="text1"/>
+            </w:rPr>
+            <w:t>2</w:t>
+          </w:r>
+          <w:r>
+            <w:rPr>
+              <w:rFonts w:ascii="Arial" w:hAnsi="Arial" w:cs="Arial"/>
+              <w:b/>
+              <w:bCs/>
+              <w:color w:val="000000" w:themeColor="text1"/>
+            </w:rPr>
+            <w:t>.CONSIDERAÇÕES FINAIS............................................................................................</w:t>
+          </w:r>
+          <w:r>
+            <w:rPr>
+              <w:rFonts w:ascii="Arial" w:hAnsi="Arial" w:cs="Arial"/>
+              <w:b/>
+              <w:bCs/>
+              <w:color w:val="000000" w:themeColor="text1"/>
+            </w:rPr>
+            <w:t>16</w:t>
           </w:r>
         </w:p>
         <w:p>
@@ -2040,7 +2443,7 @@
               <w:rFonts w:ascii="Arial" w:hAnsi="Arial" w:cs="Arial"/>
               <w:b/>
               <w:bCs/>
-              <w:color w:val="000000"/>
+              <w:color w:val="000000" w:themeColor="text1"/>
             </w:rPr>
           </w:pPr>
           <w:r>
@@ -2050,19 +2453,17 @@
               <w:bCs/>
               <w:color w:val="000000" w:themeColor="text1"/>
             </w:rPr>
-            <w:t>13.CONSIDERAÇÕES FINAIS............................................................................................23</w:t>
+            <w:t>1</w:t>
           </w:r>
-        </w:p>
-        <w:p>
-          <w:pPr>
-            <w:pStyle w:val="Sumrio1"/>
+          <w:r>
             <w:rPr>
               <w:rFonts w:ascii="Arial" w:hAnsi="Arial" w:cs="Arial"/>
               <w:b/>
               <w:bCs/>
               <w:color w:val="000000" w:themeColor="text1"/>
             </w:rPr>
-          </w:pPr>
+            <w:t>3</w:t>
+          </w:r>
           <w:r>
             <w:rPr>
               <w:rFonts w:ascii="Arial" w:hAnsi="Arial" w:cs="Arial"/>
@@ -2070,7 +2471,16 @@
               <w:bCs/>
               <w:color w:val="000000" w:themeColor="text1"/>
             </w:rPr>
-            <w:t>14. REFERÊNCIAS ............................................................................................................24</w:t>
+            <w:t>. REFERÊNCIAS ............................................................................................................</w:t>
+          </w:r>
+          <w:r>
+            <w:rPr>
+              <w:rFonts w:ascii="Arial" w:hAnsi="Arial" w:cs="Arial"/>
+              <w:b/>
+              <w:bCs/>
+              <w:color w:val="000000" w:themeColor="text1"/>
+            </w:rPr>
+            <w:t>17</w:t>
           </w:r>
         </w:p>
         <w:p>
@@ -2101,11 +2511,9 @@
               <w:szCs w:val="22"/>
               <w:lang w:eastAsia="pt-BR"/>
             </w:rPr>
-            <w:t xml:space="preserve"> A – BIBLIOTECAS UTILIZADAS NO PROJETO............................................25</w:t>
+            <w:t xml:space="preserve"> A – BIBLIOTECAS UTILIZADAS NO PROJETO............................................</w:t>
           </w:r>
-        </w:p>
-        <w:p>
-          <w:pPr>
+          <w:r>
             <w:rPr>
               <w:rFonts w:ascii="Arial" w:hAnsi="Arial" w:cs="Arial"/>
               <w:b/>
@@ -2113,8 +2521,11 @@
               <w:szCs w:val="22"/>
               <w:lang w:eastAsia="pt-BR"/>
             </w:rPr>
-          </w:pPr>
-          <w:r>
+            <w:t>19</w:t>
+          </w:r>
+        </w:p>
+        <w:p>
+          <w:pPr>
             <w:rPr>
               <w:rFonts w:ascii="Arial" w:hAnsi="Arial" w:cs="Arial"/>
               <w:b/>
@@ -2122,8 +2533,7 @@
               <w:szCs w:val="22"/>
               <w:lang w:eastAsia="pt-BR"/>
             </w:rPr>
-            <w:t>APÊNDICE</w:t>
-          </w:r>
+          </w:pPr>
           <w:r>
             <w:rPr>
               <w:rFonts w:ascii="Arial" w:hAnsi="Arial" w:cs="Arial"/>
@@ -2132,7 +2542,7 @@
               <w:szCs w:val="22"/>
               <w:lang w:eastAsia="pt-BR"/>
             </w:rPr>
-            <w:t xml:space="preserve"> </w:t>
+            <w:t>APÊNDICE</w:t>
           </w:r>
           <w:r>
             <w:rPr>
@@ -2142,7 +2552,7 @@
               <w:szCs w:val="22"/>
               <w:lang w:eastAsia="pt-BR"/>
             </w:rPr>
-            <w:t>B</w:t>
+            <w:t xml:space="preserve"> </w:t>
           </w:r>
           <w:r>
             <w:rPr>
@@ -2152,7 +2562,7 @@
               <w:szCs w:val="22"/>
               <w:lang w:eastAsia="pt-BR"/>
             </w:rPr>
-            <w:t xml:space="preserve"> – </w:t>
+            <w:t>B</w:t>
           </w:r>
           <w:r>
             <w:rPr>
@@ -2162,7 +2572,7 @@
               <w:szCs w:val="22"/>
               <w:lang w:eastAsia="pt-BR"/>
             </w:rPr>
-            <w:t>DIAGRAMA DO BANCO DE DADOS...........</w:t>
+            <w:t xml:space="preserve"> – </w:t>
           </w:r>
           <w:r>
             <w:rPr>
@@ -2172,7 +2582,7 @@
               <w:szCs w:val="22"/>
               <w:lang w:eastAsia="pt-BR"/>
             </w:rPr>
-            <w:t>............................................2</w:t>
+            <w:t>DIAGRAMA DO BANCO DE DADOS...........</w:t>
           </w:r>
           <w:r>
             <w:rPr>
@@ -2182,18 +2592,8 @@
               <w:szCs w:val="22"/>
               <w:lang w:eastAsia="pt-BR"/>
             </w:rPr>
-            <w:t>6</w:t>
+            <w:t>............................................</w:t>
           </w:r>
-        </w:p>
-        <w:p>
-          <w:pPr>
-            <w:rPr>
-              <w:rFonts w:ascii="Arial" w:hAnsi="Arial" w:cs="Arial"/>
-              <w:sz w:val="22"/>
-              <w:szCs w:val="22"/>
-              <w:lang w:eastAsia="pt-BR"/>
-            </w:rPr>
-          </w:pPr>
           <w:r>
             <w:rPr>
               <w:rFonts w:ascii="Arial" w:hAnsi="Arial" w:cs="Arial"/>
@@ -2202,8 +2602,18 @@
               <w:szCs w:val="22"/>
               <w:lang w:eastAsia="pt-BR"/>
             </w:rPr>
-            <w:t>APÊNDICE</w:t>
+            <w:t>21</w:t>
           </w:r>
+        </w:p>
+        <w:p>
+          <w:pPr>
+            <w:rPr>
+              <w:rFonts w:ascii="Arial" w:hAnsi="Arial" w:cs="Arial"/>
+              <w:sz w:val="22"/>
+              <w:szCs w:val="22"/>
+              <w:lang w:eastAsia="pt-BR"/>
+            </w:rPr>
+          </w:pPr>
           <w:r>
             <w:rPr>
               <w:rFonts w:ascii="Arial" w:hAnsi="Arial" w:cs="Arial"/>
@@ -2212,7 +2622,7 @@
               <w:szCs w:val="22"/>
               <w:lang w:eastAsia="pt-BR"/>
             </w:rPr>
-            <w:t xml:space="preserve"> </w:t>
+            <w:t>APÊNDICE</w:t>
           </w:r>
           <w:r>
             <w:rPr>
@@ -2222,7 +2632,7 @@
               <w:szCs w:val="22"/>
               <w:lang w:eastAsia="pt-BR"/>
             </w:rPr>
-            <w:t>C</w:t>
+            <w:t xml:space="preserve"> C –PROTOTIPAÇÃO DAS TELAS DO PROJETO.........................................</w:t>
           </w:r>
           <w:r>
             <w:rPr>
@@ -2232,37 +2642,7 @@
               <w:szCs w:val="22"/>
               <w:lang w:eastAsia="pt-BR"/>
             </w:rPr>
-            <w:t xml:space="preserve"> –</w:t>
-          </w:r>
-          <w:r>
-            <w:rPr>
-              <w:rFonts w:ascii="Arial" w:hAnsi="Arial" w:cs="Arial"/>
-              <w:b/>
-              <w:sz w:val="22"/>
-              <w:szCs w:val="22"/>
-              <w:lang w:eastAsia="pt-BR"/>
-            </w:rPr>
-            <w:t>PROTOTIPAÇÃO DAS TELAS DO PROJETO</w:t>
-          </w:r>
-          <w:r>
-            <w:rPr>
-              <w:rFonts w:ascii="Arial" w:hAnsi="Arial" w:cs="Arial"/>
-              <w:b/>
-              <w:sz w:val="22"/>
-              <w:szCs w:val="22"/>
-              <w:lang w:eastAsia="pt-BR"/>
-            </w:rPr>
-            <w:t>.........................................2</w:t>
-          </w:r>
-          <w:r>
-            <w:rPr>
-              <w:rFonts w:ascii="Arial" w:hAnsi="Arial" w:cs="Arial"/>
-              <w:b/>
-              <w:sz w:val="22"/>
-              <w:szCs w:val="22"/>
-              <w:lang w:eastAsia="pt-BR"/>
-            </w:rPr>
-            <w:t>7</w:t>
+            <w:t>22</w:t>
           </w:r>
         </w:p>
       </w:sdtContent>
@@ -2323,46 +2703,9 @@
     </w:p>
     <w:p>
       <w:pPr>
-        <w:pStyle w:val="PargrafodaLista"/>
-        <w:rPr>
-          <w:lang w:val="en-US"/>
-        </w:rPr>
-      </w:pPr>
-    </w:p>
-    <w:p>
-      <w:pPr>
-        <w:pStyle w:val="CabealhodoSumrio"/>
-      </w:pPr>
-    </w:p>
-    <w:p>
-      <w:pPr>
-        <w:pStyle w:val="PargrafodaLista"/>
-        <w:rPr>
-          <w:lang w:val="en-US"/>
-        </w:rPr>
-      </w:pPr>
-    </w:p>
-    <w:p>
-      <w:pPr>
-        <w:pStyle w:val="PargrafodaLista"/>
-        <w:rPr>
-          <w:lang w:val="en-US"/>
-        </w:rPr>
-      </w:pPr>
-    </w:p>
-    <w:p>
-      <w:pPr>
-        <w:pStyle w:val="PargrafodaLista"/>
-        <w:rPr>
-          <w:lang w:val="en-US"/>
-        </w:rPr>
-      </w:pPr>
-    </w:p>
-    <w:p>
-      <w:pPr>
         <w:pStyle w:val="Ttulo"/>
         <w:rPr>
-          <w:rFonts w:asciiTheme="minorHAnsi" w:eastAsiaTheme="minorEastAsia" w:hAnsiTheme="minorHAnsi" w:cstheme="minorBidi"/>
+          <w:rFonts w:asciiTheme="minorHAnsi" w:eastAsiaTheme="minorHAnsi" w:hAnsiTheme="minorHAnsi" w:cstheme="minorBidi"/>
           <w:sz w:val="24"/>
           <w:szCs w:val="24"/>
           <w:lang w:val="en-US"/>
@@ -2371,6 +2714,13 @@
     </w:p>
     <w:p>
       <w:pPr>
+        <w:rPr>
+          <w:lang w:val="en-US"/>
+        </w:rPr>
+      </w:pPr>
+    </w:p>
+    <w:p>
+      <w:pPr>
         <w:pStyle w:val="Ttulo"/>
         <w:rPr>
           <w:rFonts w:ascii="Arial" w:eastAsia="Arial" w:hAnsi="Arial" w:cs="Arial"/>
@@ -2378,17 +2728,30 @@
           <w:bCs/>
           <w:sz w:val="28"/>
           <w:szCs w:val="28"/>
-          <w:lang w:val="en-US"/>
-        </w:rPr>
-      </w:pPr>
-      <w:r>
-        <w:rPr>
-          <w:rFonts w:ascii="Arial" w:eastAsia="Arial" w:hAnsi="Arial" w:cs="Arial"/>
-          <w:b/>
-          <w:bCs/>
-          <w:sz w:val="28"/>
-          <w:szCs w:val="28"/>
-        </w:rPr>
+        </w:rPr>
+      </w:pPr>
+    </w:p>
+    <w:p>
+      <w:pPr>
+        <w:pStyle w:val="Ttulo"/>
+        <w:rPr>
+          <w:rFonts w:ascii="Arial" w:eastAsia="Arial" w:hAnsi="Arial" w:cs="Arial"/>
+          <w:b/>
+          <w:bCs/>
+          <w:sz w:val="28"/>
+          <w:szCs w:val="28"/>
+          <w:lang w:val="en-US"/>
+        </w:rPr>
+      </w:pPr>
+      <w:r>
+        <w:rPr>
+          <w:rFonts w:ascii="Arial" w:eastAsia="Arial" w:hAnsi="Arial" w:cs="Arial"/>
+          <w:b/>
+          <w:bCs/>
+          <w:sz w:val="28"/>
+          <w:szCs w:val="28"/>
+        </w:rPr>
+        <w:lastRenderedPageBreak/>
         <w:t>1</w:t>
       </w:r>
       <w:r>
@@ -2607,202 +2970,6 @@
           <w:bCs/>
           <w:sz w:val="28"/>
           <w:szCs w:val="28"/>
-          <w:lang w:val="en-US"/>
-        </w:rPr>
-      </w:pPr>
-    </w:p>
-    <w:p>
-      <w:pPr>
-        <w:spacing w:after="0" w:line="360" w:lineRule="auto"/>
-        <w:ind w:firstLine="283"/>
-        <w:contextualSpacing/>
-        <w:rPr>
-          <w:rFonts w:ascii="Arial" w:eastAsia="Arial" w:hAnsi="Arial" w:cs="Arial"/>
-          <w:b/>
-          <w:bCs/>
-          <w:sz w:val="28"/>
-          <w:szCs w:val="28"/>
-          <w:lang w:val="en-US"/>
-        </w:rPr>
-      </w:pPr>
-    </w:p>
-    <w:p>
-      <w:pPr>
-        <w:spacing w:after="0" w:line="360" w:lineRule="auto"/>
-        <w:ind w:firstLine="283"/>
-        <w:contextualSpacing/>
-        <w:rPr>
-          <w:rFonts w:ascii="Arial" w:eastAsia="Arial" w:hAnsi="Arial" w:cs="Arial"/>
-          <w:b/>
-          <w:bCs/>
-          <w:sz w:val="28"/>
-          <w:szCs w:val="28"/>
-          <w:lang w:val="en-US"/>
-        </w:rPr>
-      </w:pPr>
-    </w:p>
-    <w:p>
-      <w:pPr>
-        <w:spacing w:after="0" w:line="360" w:lineRule="auto"/>
-        <w:ind w:firstLine="283"/>
-        <w:contextualSpacing/>
-        <w:rPr>
-          <w:rFonts w:ascii="Arial" w:eastAsia="Arial" w:hAnsi="Arial" w:cs="Arial"/>
-          <w:b/>
-          <w:bCs/>
-          <w:sz w:val="28"/>
-          <w:szCs w:val="28"/>
-          <w:lang w:val="en-US"/>
-        </w:rPr>
-      </w:pPr>
-    </w:p>
-    <w:p>
-      <w:pPr>
-        <w:spacing w:after="0" w:line="360" w:lineRule="auto"/>
-        <w:ind w:firstLine="283"/>
-        <w:contextualSpacing/>
-        <w:rPr>
-          <w:rFonts w:ascii="Arial" w:eastAsia="Arial" w:hAnsi="Arial" w:cs="Arial"/>
-          <w:b/>
-          <w:bCs/>
-          <w:sz w:val="28"/>
-          <w:szCs w:val="28"/>
-          <w:lang w:val="en-US"/>
-        </w:rPr>
-      </w:pPr>
-    </w:p>
-    <w:p>
-      <w:pPr>
-        <w:spacing w:after="0" w:line="360" w:lineRule="auto"/>
-        <w:ind w:firstLine="283"/>
-        <w:contextualSpacing/>
-        <w:rPr>
-          <w:rFonts w:ascii="Arial" w:eastAsia="Arial" w:hAnsi="Arial" w:cs="Arial"/>
-          <w:b/>
-          <w:bCs/>
-          <w:sz w:val="28"/>
-          <w:szCs w:val="28"/>
-          <w:lang w:val="en-US"/>
-        </w:rPr>
-      </w:pPr>
-    </w:p>
-    <w:p>
-      <w:pPr>
-        <w:spacing w:after="0" w:line="360" w:lineRule="auto"/>
-        <w:ind w:firstLine="283"/>
-        <w:contextualSpacing/>
-        <w:rPr>
-          <w:rFonts w:ascii="Arial" w:eastAsia="Arial" w:hAnsi="Arial" w:cs="Arial"/>
-          <w:b/>
-          <w:bCs/>
-          <w:sz w:val="28"/>
-          <w:szCs w:val="28"/>
-          <w:lang w:val="en-US"/>
-        </w:rPr>
-      </w:pPr>
-    </w:p>
-    <w:p>
-      <w:pPr>
-        <w:spacing w:after="0" w:line="360" w:lineRule="auto"/>
-        <w:ind w:firstLine="283"/>
-        <w:contextualSpacing/>
-        <w:rPr>
-          <w:rFonts w:ascii="Arial" w:eastAsia="Arial" w:hAnsi="Arial" w:cs="Arial"/>
-          <w:b/>
-          <w:bCs/>
-          <w:sz w:val="28"/>
-          <w:szCs w:val="28"/>
-          <w:lang w:val="en-US"/>
-        </w:rPr>
-      </w:pPr>
-    </w:p>
-    <w:p>
-      <w:pPr>
-        <w:spacing w:after="0" w:line="360" w:lineRule="auto"/>
-        <w:ind w:firstLine="283"/>
-        <w:contextualSpacing/>
-        <w:rPr>
-          <w:rFonts w:ascii="Arial" w:eastAsia="Arial" w:hAnsi="Arial" w:cs="Arial"/>
-          <w:b/>
-          <w:bCs/>
-          <w:sz w:val="28"/>
-          <w:szCs w:val="28"/>
-          <w:lang w:val="en-US"/>
-        </w:rPr>
-      </w:pPr>
-    </w:p>
-    <w:p>
-      <w:pPr>
-        <w:spacing w:after="0" w:line="360" w:lineRule="auto"/>
-        <w:ind w:firstLine="283"/>
-        <w:contextualSpacing/>
-        <w:rPr>
-          <w:rFonts w:ascii="Arial" w:eastAsia="Arial" w:hAnsi="Arial" w:cs="Arial"/>
-          <w:b/>
-          <w:bCs/>
-          <w:sz w:val="28"/>
-          <w:szCs w:val="28"/>
-          <w:lang w:val="en-US"/>
-        </w:rPr>
-      </w:pPr>
-    </w:p>
-    <w:p>
-      <w:pPr>
-        <w:spacing w:after="0" w:line="360" w:lineRule="auto"/>
-        <w:ind w:firstLine="283"/>
-        <w:contextualSpacing/>
-        <w:rPr>
-          <w:rFonts w:ascii="Arial" w:eastAsia="Arial" w:hAnsi="Arial" w:cs="Arial"/>
-          <w:b/>
-          <w:bCs/>
-          <w:sz w:val="28"/>
-          <w:szCs w:val="28"/>
-          <w:lang w:val="en-US"/>
-        </w:rPr>
-      </w:pPr>
-    </w:p>
-    <w:p>
-      <w:pPr>
-        <w:spacing w:after="0" w:line="360" w:lineRule="auto"/>
-        <w:ind w:firstLine="283"/>
-        <w:contextualSpacing/>
-        <w:rPr>
-          <w:rFonts w:ascii="Arial" w:eastAsia="Arial" w:hAnsi="Arial" w:cs="Arial"/>
-          <w:b/>
-          <w:bCs/>
-          <w:sz w:val="28"/>
-          <w:szCs w:val="28"/>
-          <w:lang w:val="en-US"/>
-        </w:rPr>
-      </w:pPr>
-    </w:p>
-    <w:p>
-      <w:pPr>
-        <w:spacing w:after="0" w:line="360" w:lineRule="auto"/>
-        <w:ind w:firstLine="283"/>
-        <w:contextualSpacing/>
-        <w:rPr>
-          <w:rFonts w:ascii="Arial" w:eastAsia="Arial" w:hAnsi="Arial" w:cs="Arial"/>
-          <w:b/>
-          <w:bCs/>
-          <w:sz w:val="28"/>
-          <w:szCs w:val="28"/>
-          <w:lang w:val="en-US"/>
-        </w:rPr>
-      </w:pPr>
-    </w:p>
-    <w:p>
-      <w:pPr>
-        <w:spacing w:after="0" w:line="360" w:lineRule="auto"/>
-        <w:ind w:firstLine="283"/>
-        <w:contextualSpacing/>
-        <w:rPr>
-          <w:rFonts w:ascii="Arial" w:eastAsia="Arial" w:hAnsi="Arial" w:cs="Arial"/>
-          <w:b/>
-          <w:bCs/>
-          <w:sz w:val="28"/>
-          <w:szCs w:val="28"/>
-          <w:lang w:val="en-US"/>
         </w:rPr>
       </w:pPr>
     </w:p>
@@ -2896,8 +3063,6 @@
         </w:rPr>
         <w:t>s</w:t>
       </w:r>
-      <w:bookmarkStart w:id="0" w:name="_GoBack"/>
-      <w:bookmarkEnd w:id="0"/>
       <w:r>
         <w:rPr>
           <w:rFonts w:ascii="Arial" w:eastAsia="Arial" w:hAnsi="Arial" w:cs="Arial"/>
@@ -2952,6 +3117,7 @@
           <w:sz w:val="28"/>
           <w:szCs w:val="28"/>
         </w:rPr>
+        <w:lastRenderedPageBreak/>
         <w:t>2.1 Objetivo geral</w:t>
       </w:r>
     </w:p>
@@ -3085,51 +3251,10 @@
         <w:contextualSpacing/>
         <w:rPr>
           <w:rFonts w:ascii="Arial" w:eastAsia="Arial" w:hAnsi="Arial" w:cs="Arial"/>
-          <w:lang w:val="en-US"/>
-        </w:rPr>
-      </w:pPr>
-    </w:p>
-    <w:p>
-      <w:pPr>
-        <w:spacing w:after="0" w:line="360" w:lineRule="auto"/>
-        <w:ind w:firstLine="283"/>
-        <w:contextualSpacing/>
-        <w:rPr>
-          <w:rFonts w:ascii="Arial" w:eastAsia="Arial" w:hAnsi="Arial" w:cs="Arial"/>
-          <w:lang w:val="en-US"/>
-        </w:rPr>
-      </w:pPr>
-    </w:p>
-    <w:p>
-      <w:pPr>
-        <w:spacing w:after="0" w:line="360" w:lineRule="auto"/>
-        <w:ind w:firstLine="283"/>
-        <w:contextualSpacing/>
-        <w:rPr>
-          <w:rFonts w:ascii="Arial" w:eastAsia="Arial" w:hAnsi="Arial" w:cs="Arial"/>
-          <w:lang w:val="en-US"/>
-        </w:rPr>
-      </w:pPr>
-    </w:p>
-    <w:p>
-      <w:pPr>
-        <w:spacing w:after="0" w:line="360" w:lineRule="auto"/>
-        <w:ind w:firstLine="283"/>
-        <w:contextualSpacing/>
-        <w:rPr>
-          <w:rFonts w:ascii="Arial" w:eastAsia="Arial" w:hAnsi="Arial" w:cs="Arial"/>
-          <w:lang w:val="en-US"/>
-        </w:rPr>
-      </w:pPr>
-    </w:p>
-    <w:p>
-      <w:pPr>
-        <w:spacing w:after="0" w:line="360" w:lineRule="auto"/>
-        <w:ind w:firstLine="283"/>
-        <w:contextualSpacing/>
-        <w:rPr>
-          <w:rFonts w:ascii="Arial" w:eastAsia="Arial" w:hAnsi="Arial" w:cs="Arial"/>
-          <w:lang w:val="en-US"/>
+          <w:b/>
+          <w:bCs/>
+          <w:sz w:val="28"/>
+          <w:szCs w:val="28"/>
         </w:rPr>
       </w:pPr>
     </w:p>
@@ -3187,10 +3312,17 @@
         <w:ind w:firstLine="709"/>
         <w:jc w:val="both"/>
         <w:rPr>
-          <w:rFonts w:ascii="Times New Roman" w:eastAsia="Times New Roman" w:hAnsi="Times New Roman" w:cs="Times New Roman"/>
+          <w:rFonts w:ascii="Arial" w:eastAsia="Arial" w:hAnsi="Arial" w:cs="Arial"/>
           <w:color w:val="000000" w:themeColor="text1"/>
         </w:rPr>
       </w:pPr>
+      <w:r>
+        <w:rPr>
+          <w:rFonts w:ascii="Arial" w:eastAsia="Arial" w:hAnsi="Arial" w:cs="Arial"/>
+          <w:color w:val="000000" w:themeColor="text1"/>
+        </w:rPr>
+        <w:t>Para o desenvolvimento dos métodos do projeto, foi realizado análises em diferentes bases cientificas e sites autênticos das documentações e tecnologias aplicadas, detalhando as suas principais funcionalidades e usabilidades. Utilizou-se de artigos científicos, pesquisas, para realizar análises e estudos sobre as tecnologias referentes com o projeto.</w:t>
+      </w:r>
     </w:p>
     <w:p>
       <w:pPr>
@@ -3201,17 +3333,10 @@
         <w:ind w:firstLine="709"/>
         <w:jc w:val="both"/>
         <w:rPr>
-          <w:rFonts w:ascii="Arial" w:eastAsia="Arial" w:hAnsi="Arial" w:cs="Arial"/>
+          <w:rFonts w:ascii="Times New Roman" w:eastAsia="Times New Roman" w:hAnsi="Times New Roman" w:cs="Times New Roman"/>
           <w:color w:val="000000" w:themeColor="text1"/>
         </w:rPr>
       </w:pPr>
-      <w:r>
-        <w:rPr>
-          <w:rFonts w:ascii="Arial" w:eastAsia="Arial" w:hAnsi="Arial" w:cs="Arial"/>
-          <w:color w:val="000000" w:themeColor="text1"/>
-        </w:rPr>
-        <w:t>Para o desenvolvimento dos métodos do projeto, foi realizado análises em diferentes bases cientificas e sites autênticos das documentações e tecnologias aplicadas, detalhando as suas principais funcionalidades e usabilidades. Utilizou-se de artigos científicos, pesquisas, para realizar análises e estudos sobre as tecnologias referentes com o projeto.</w:t>
-      </w:r>
     </w:p>
     <w:p>
       <w:pPr>
@@ -3219,13 +3344,49 @@
           <w:tab w:val="left" w:pos="2400"/>
         </w:tabs>
         <w:spacing w:after="0" w:line="360" w:lineRule="auto"/>
-        <w:ind w:firstLine="709"/>
         <w:jc w:val="both"/>
         <w:rPr>
-          <w:rFonts w:ascii="Times New Roman" w:eastAsia="Times New Roman" w:hAnsi="Times New Roman" w:cs="Times New Roman"/>
+          <w:rFonts w:ascii="Arial" w:eastAsia="Arial" w:hAnsi="Arial" w:cs="Arial"/>
+          <w:b/>
+          <w:bCs/>
           <w:color w:val="000000" w:themeColor="text1"/>
-        </w:rPr>
-      </w:pPr>
+          <w:sz w:val="28"/>
+          <w:szCs w:val="28"/>
+        </w:rPr>
+      </w:pPr>
+      <w:r>
+        <w:rPr>
+          <w:rFonts w:ascii="Arial" w:eastAsia="Arial" w:hAnsi="Arial" w:cs="Arial"/>
+          <w:b/>
+          <w:bCs/>
+          <w:color w:val="000000" w:themeColor="text1"/>
+          <w:sz w:val="28"/>
+          <w:szCs w:val="28"/>
+        </w:rPr>
+        <w:t>4</w:t>
+      </w:r>
+      <w:r>
+        <w:rPr>
+          <w:rFonts w:ascii="Arial" w:eastAsia="Arial" w:hAnsi="Arial" w:cs="Arial"/>
+          <w:b/>
+          <w:bCs/>
+          <w:color w:val="000000" w:themeColor="text1"/>
+          <w:sz w:val="28"/>
+          <w:szCs w:val="28"/>
+        </w:rPr>
+        <w:t>.</w:t>
+      </w:r>
+      <w:r>
+        <w:rPr>
+          <w:rFonts w:ascii="Arial" w:eastAsia="Arial" w:hAnsi="Arial" w:cs="Arial"/>
+          <w:b/>
+          <w:bCs/>
+          <w:color w:val="000000" w:themeColor="text1"/>
+          <w:sz w:val="28"/>
+          <w:szCs w:val="28"/>
+        </w:rPr>
+        <w:t>MÉTODOS</w:t>
+      </w:r>
     </w:p>
     <w:p>
       <w:pPr>
@@ -3252,29 +3413,44 @@
           <w:sz w:val="28"/>
           <w:szCs w:val="28"/>
         </w:rPr>
-        <w:t>4</w:t>
-      </w:r>
-      <w:r>
-        <w:rPr>
-          <w:rFonts w:ascii="Arial" w:eastAsia="Arial" w:hAnsi="Arial" w:cs="Arial"/>
-          <w:b/>
-          <w:bCs/>
-          <w:color w:val="000000" w:themeColor="text1"/>
-          <w:sz w:val="28"/>
-          <w:szCs w:val="28"/>
-        </w:rPr>
-        <w:t>.</w:t>
-      </w:r>
-      <w:r>
-        <w:rPr>
-          <w:rFonts w:ascii="Arial" w:eastAsia="Arial" w:hAnsi="Arial" w:cs="Arial"/>
-          <w:b/>
-          <w:bCs/>
-          <w:color w:val="000000" w:themeColor="text1"/>
-          <w:sz w:val="28"/>
-          <w:szCs w:val="28"/>
-        </w:rPr>
-        <w:t>MÉTODOS</w:t>
+        <w:t>4.1 VSCode</w:t>
+      </w:r>
+    </w:p>
+    <w:p>
+      <w:pPr>
+        <w:spacing w:before="240" w:after="240"/>
+        <w:jc w:val="both"/>
+        <w:rPr>
+          <w:rFonts w:ascii="Arial" w:eastAsia="Arial" w:hAnsi="Arial" w:cs="Arial"/>
+        </w:rPr>
+      </w:pPr>
+      <w:r>
+        <w:rPr>
+          <w:rFonts w:ascii="Arial" w:eastAsia="Arial" w:hAnsi="Arial" w:cs="Arial"/>
+        </w:rPr>
+        <w:t>O Visual Studio Code (VSCode) é um editor de código-fonte desenvolvido para auxiliar na criação, edição e organização de projetos de programação de forma prática e eficiente. Ele permite trabalhar com diversas linguagens, como HTML, CSS, JavaScript, entre outras, oferecendo recursos como destaque de sintaxe, sugestões automáticas de código (IntelliSense) e extensões que ampliam suas funcionalidades.</w:t>
+      </w:r>
+    </w:p>
+    <w:p>
+      <w:pPr>
+        <w:spacing w:before="240" w:after="240"/>
+        <w:jc w:val="both"/>
+        <w:rPr>
+          <w:rFonts w:ascii="Arial" w:eastAsia="Arial" w:hAnsi="Arial" w:cs="Arial"/>
+        </w:rPr>
+      </w:pPr>
+      <w:r>
+        <w:rPr>
+          <w:rFonts w:ascii="Arial" w:eastAsia="Arial" w:hAnsi="Arial" w:cs="Arial"/>
+        </w:rPr>
+        <w:t xml:space="preserve">Utilizamos o VSCode em nosso projeto devido à sua facilidade de uso, interface intuitiva e grande variedade de ferramentas que tornam o desenvolvimento mais ágil. Além disso, ele possui alta compatibilidade com diferentes sistemas e tecnologias, facilitando a integração com navegadores e outras plataformas. O VSCode contribuiu para a organização do código e do projeto como um todo, permitindo uma estrutura </w:t>
+      </w:r>
+      <w:r>
+        <w:rPr>
+          <w:rFonts w:ascii="Arial" w:eastAsia="Arial" w:hAnsi="Arial" w:cs="Arial"/>
+        </w:rPr>
+        <w:lastRenderedPageBreak/>
+        <w:t>clara e eficiente, o que melhora a produtividade e proporciona uma experiência de desenvolvimento mais fluida.</w:t>
       </w:r>
     </w:p>
     <w:p>
@@ -3289,8 +3465,6 @@
           <w:b/>
           <w:bCs/>
           <w:color w:val="000000" w:themeColor="text1"/>
-          <w:sz w:val="28"/>
-          <w:szCs w:val="28"/>
         </w:rPr>
       </w:pPr>
       <w:r>
@@ -3299,62 +3473,6 @@
           <w:b/>
           <w:bCs/>
           <w:color w:val="000000" w:themeColor="text1"/>
-          <w:sz w:val="28"/>
-          <w:szCs w:val="28"/>
-        </w:rPr>
-        <w:t>4.1 VSCode</w:t>
-      </w:r>
-    </w:p>
-    <w:p>
-      <w:pPr>
-        <w:spacing w:before="240" w:after="240"/>
-        <w:jc w:val="both"/>
-        <w:rPr>
-          <w:rFonts w:ascii="Arial" w:eastAsia="Arial" w:hAnsi="Arial" w:cs="Arial"/>
-        </w:rPr>
-      </w:pPr>
-      <w:r>
-        <w:rPr>
-          <w:rFonts w:ascii="Arial" w:eastAsia="Arial" w:hAnsi="Arial" w:cs="Arial"/>
-        </w:rPr>
-        <w:t>O Visual Studio Code (VSCode) é um editor de código-fonte desenvolvido para auxiliar na criação, edição e organização de projetos de programação de forma prática e eficiente. Ele permite trabalhar com diversas linguagens, como HTML, CSS, JavaScript, entre outras, oferecendo recursos como destaque de sintaxe, sugestões automáticas de código (IntelliSense) e extensões que ampliam suas funcionalidades.</w:t>
-      </w:r>
-    </w:p>
-    <w:p>
-      <w:pPr>
-        <w:spacing w:before="240" w:after="240"/>
-        <w:jc w:val="both"/>
-        <w:rPr>
-          <w:rFonts w:ascii="Arial" w:eastAsia="Arial" w:hAnsi="Arial" w:cs="Arial"/>
-        </w:rPr>
-      </w:pPr>
-      <w:r>
-        <w:rPr>
-          <w:rFonts w:ascii="Arial" w:eastAsia="Arial" w:hAnsi="Arial" w:cs="Arial"/>
-        </w:rPr>
-        <w:t>Utilizamos o VSCode em nosso projeto devido à sua facilidade de uso, interface intuitiva e grande variedade de ferramentas que tornam o desenvolvimento mais ágil. Além disso, ele possui alta compatibilidade com diferentes sistemas e tecnologias, facilitando a integração com navegadores e outras plataformas. O VSCode contribuiu para a organização do código e do projeto como um todo, permitindo uma estrutura clara e eficiente, o que melhora a produtividade e proporciona uma experiência de desenvolvimento mais fluida.</w:t>
-      </w:r>
-    </w:p>
-    <w:p>
-      <w:pPr>
-        <w:tabs>
-          <w:tab w:val="left" w:pos="2400"/>
-        </w:tabs>
-        <w:spacing w:after="0" w:line="360" w:lineRule="auto"/>
-        <w:jc w:val="both"/>
-        <w:rPr>
-          <w:rFonts w:ascii="Arial" w:eastAsia="Arial" w:hAnsi="Arial" w:cs="Arial"/>
-          <w:b/>
-          <w:bCs/>
-          <w:color w:val="000000" w:themeColor="text1"/>
-        </w:rPr>
-      </w:pPr>
-      <w:r>
-        <w:rPr>
-          <w:rFonts w:ascii="Arial" w:eastAsia="Arial" w:hAnsi="Arial" w:cs="Arial"/>
-          <w:b/>
-          <w:bCs/>
-          <w:color w:val="000000" w:themeColor="text1"/>
         </w:rPr>
         <w:t>FIGURA 1 - VScode</w:t>
       </w:r>
@@ -3378,15 +3496,15 @@
           <w:rFonts w:ascii="Arial" w:eastAsia="Arial" w:hAnsi="Arial" w:cs="Arial"/>
           <w:b/>
           <w:bCs/>
-          <w:sz w:val="28"/>
-          <w:szCs w:val="28"/>
-          <w:lang w:val="en-US"/>
-        </w:rPr>
-        <w:lastRenderedPageBreak/>
+          <w:noProof/>
+          <w:sz w:val="28"/>
+          <w:szCs w:val="28"/>
+          <w:lang w:val="en-US"/>
+        </w:rPr>
         <w:drawing>
-          <wp:inline distT="0" distB="0" distL="0" distR="0" wp14:anchorId="54BAD7AE" wp14:editId="23B2C4AA">
+          <wp:inline distT="0" distB="0" distL="0" distR="0" wp14:anchorId="54BAD7AE" wp14:editId="17B8AFAE">
             <wp:extent cx="5731510" cy="3039110"/>
-            <wp:effectExtent l="76200" t="76200" r="135890" b="142240"/>
+            <wp:effectExtent l="38100" t="38100" r="40640" b="46990"/>
             <wp:docPr id="1" name="Imagem 1"/>
             <wp:cNvGraphicFramePr>
               <a:graphicFrameLocks xmlns:a="http://schemas.openxmlformats.org/drawingml/2006/main" noChangeAspect="1"/>
@@ -3412,17 +3530,13 @@
                     <a:prstGeom prst="rect">
                       <a:avLst/>
                     </a:prstGeom>
-                    <a:ln w="38100" cap="sq">
-                      <a:solidFill>
-                        <a:srgbClr val="000000"/>
-                      </a:solidFill>
-                      <a:prstDash val="solid"/>
-                      <a:miter lim="800000"/>
+                    <a:ln>
+                      <a:noFill/>
                     </a:ln>
                     <a:effectLst>
-                      <a:outerShdw blurRad="50800" dist="38100" dir="2700000" algn="tl" rotWithShape="0">
-                        <a:srgbClr val="000000">
-                          <a:alpha val="43000"/>
+                      <a:outerShdw blurRad="292100" dist="139700" dir="2700000" algn="tl" rotWithShape="0">
+                        <a:srgbClr val="333333">
+                          <a:alpha val="0"/>
                         </a:srgbClr>
                       </a:outerShdw>
                     </a:effectLst>
@@ -3636,7 +3750,8 @@
           <w:sz w:val="28"/>
           <w:szCs w:val="28"/>
         </w:rPr>
-        <w:t>6</w:t>
+        <w:lastRenderedPageBreak/>
+        <w:t>5</w:t>
       </w:r>
       <w:r>
         <w:rPr>
@@ -3671,225 +3786,236 @@
         <w:rPr>
           <w:rFonts w:ascii="Arial" w:eastAsia="Arial" w:hAnsi="Arial" w:cs="Arial"/>
         </w:rPr>
-        <w:t xml:space="preserve">Um framework é uma estrutura de desenvolvimento que fornece um conjunto de ferramentas, padrões e componentes prontos para auxiliar na criação de aplicações. </w:t>
-      </w:r>
+        <w:t>Um framework é uma estrutura de desenvolvimento que fornece um conjunto de ferramentas, padrões e componentes prontos para auxiliar na criação de aplicações. Ele serve como uma base organizada, onde o desenvolvedor pode construir seu projeto seguindo uma arquitetura já definida, evitando a necessidade de começar tudo do zero. Frameworks podem ser utilizados em diversas linguagens e áreas, como desenvolvimento web, mobile e sistemas em geral.</w:t>
+      </w:r>
+    </w:p>
+    <w:p>
+      <w:pPr>
+        <w:spacing w:before="240" w:after="240"/>
+        <w:rPr>
+          <w:rFonts w:ascii="Arial" w:eastAsia="Arial" w:hAnsi="Arial" w:cs="Arial"/>
+          <w:lang w:val="en-US"/>
+        </w:rPr>
+      </w:pPr>
+      <w:r>
+        <w:rPr>
+          <w:rFonts w:ascii="Arial" w:eastAsia="Arial" w:hAnsi="Arial" w:cs="Arial"/>
+        </w:rPr>
+        <w:t>A utilização de frameworks em projetos traz mais agilidade e padronização ao desenvolvimento, pois muitas funcionalidades comuns já estão implementadas, como organização de pastas, rotas e conexão com banco de dados. Além disso, eles incentivam boas práticas de programação e facilitam a manutenção do código. Com isso, o desenvolvedor consegue focar mais nas funcionalidades específicas do projeto, tornando o processo mais eficiente e confiável.</w:t>
+      </w:r>
+    </w:p>
+    <w:p>
+      <w:pPr>
+        <w:spacing w:after="0" w:line="360" w:lineRule="auto"/>
+        <w:contextualSpacing/>
+        <w:rPr>
+          <w:rFonts w:ascii="Arial" w:eastAsia="Arial" w:hAnsi="Arial" w:cs="Arial"/>
+          <w:b/>
+          <w:bCs/>
+          <w:sz w:val="28"/>
+          <w:szCs w:val="28"/>
+          <w:lang w:val="en-US"/>
+        </w:rPr>
+      </w:pPr>
+      <w:r>
+        <w:rPr>
+          <w:rFonts w:ascii="Arial" w:eastAsia="Arial" w:hAnsi="Arial" w:cs="Arial"/>
+          <w:b/>
+          <w:bCs/>
+          <w:sz w:val="28"/>
+          <w:szCs w:val="28"/>
+        </w:rPr>
+        <w:t>5</w:t>
+      </w:r>
+      <w:r>
+        <w:rPr>
+          <w:rFonts w:ascii="Arial" w:eastAsia="Arial" w:hAnsi="Arial" w:cs="Arial"/>
+          <w:b/>
+          <w:bCs/>
+          <w:sz w:val="28"/>
+          <w:szCs w:val="28"/>
+        </w:rPr>
+        <w:t>.</w:t>
+      </w:r>
+      <w:r>
+        <w:rPr>
+          <w:rFonts w:ascii="Arial" w:eastAsia="Arial" w:hAnsi="Arial" w:cs="Arial"/>
+          <w:b/>
+          <w:bCs/>
+          <w:sz w:val="28"/>
+          <w:szCs w:val="28"/>
+        </w:rPr>
+        <w:t>1</w:t>
+      </w:r>
+      <w:r>
+        <w:rPr>
+          <w:rFonts w:ascii="Arial" w:eastAsia="Arial" w:hAnsi="Arial" w:cs="Arial"/>
+          <w:b/>
+          <w:bCs/>
+          <w:sz w:val="28"/>
+          <w:szCs w:val="28"/>
+        </w:rPr>
+        <w:t xml:space="preserve"> React Native</w:t>
+      </w:r>
+    </w:p>
+    <w:p>
+      <w:pPr>
+        <w:spacing w:before="240" w:after="240"/>
+        <w:rPr>
+          <w:rFonts w:ascii="Arial" w:eastAsia="Arial" w:hAnsi="Arial" w:cs="Arial"/>
+          <w:lang w:val="en-US"/>
+        </w:rPr>
+      </w:pPr>
+      <w:r>
+        <w:rPr>
+          <w:rFonts w:ascii="Arial" w:eastAsia="Arial" w:hAnsi="Arial" w:cs="Arial"/>
+        </w:rPr>
+        <w:t>O React Native é uma tecnologia utilizada para desenvolver aplicativos móveis que funcionam tanto em Android quanto em iOS, utilizando uma única base de código. Ele foi criado pelo Meta e é baseado na biblioteca React, permitindo que desenvolvedores utilizem JavaScript e conceitos de componentes para construir interfaces modernas e interativas. Diferente de outras abordagens, o React Native não utiliza apenas elementos web, mas componentes nativos, o que garante melhor desempenho e aparência mais próxima de aplicativos tradicionais.</w:t>
+      </w:r>
+    </w:p>
+    <w:p>
+      <w:pPr>
+        <w:spacing w:before="240" w:after="240"/>
+        <w:rPr>
+          <w:rFonts w:ascii="Arial" w:eastAsia="Arial" w:hAnsi="Arial" w:cs="Arial"/>
+        </w:rPr>
+      </w:pPr>
+      <w:r>
+        <w:rPr>
+          <w:rFonts w:ascii="Arial" w:eastAsia="Arial" w:hAnsi="Arial" w:cs="Arial"/>
+        </w:rPr>
+        <w:t>No contexto de desenvolvimento, o React Native se destaca por agilizar a criação de aplicativos, já que grande parte do código pode ser reutilizada entre diferentes plataformas. Além disso, ele conta com uma comunidade ativa e diversas bibliotecas que facilitam a implementação de funcionalidades como navegação, integração com APIs e uso de recursos do dispositivo. Isso torna o processo mais produtivo e acessível, especialmente para quem já possui conhecimento em JavaScript e deseja expandir para o desenvolvimento mobile.</w:t>
+      </w:r>
+    </w:p>
+    <w:p>
+      <w:pPr>
+        <w:spacing w:after="0" w:line="360" w:lineRule="auto"/>
+        <w:contextualSpacing/>
+        <w:rPr>
+          <w:rFonts w:ascii="Arial" w:eastAsia="Arial" w:hAnsi="Arial" w:cs="Arial"/>
+          <w:b/>
+          <w:bCs/>
+          <w:sz w:val="28"/>
+          <w:szCs w:val="28"/>
+          <w:lang w:val="en-US"/>
+        </w:rPr>
+      </w:pPr>
+      <w:r>
+        <w:rPr>
+          <w:rFonts w:ascii="Arial" w:eastAsia="Arial" w:hAnsi="Arial" w:cs="Arial"/>
+          <w:b/>
+          <w:bCs/>
+          <w:sz w:val="28"/>
+          <w:szCs w:val="28"/>
+        </w:rPr>
+        <w:t>5</w:t>
+      </w:r>
+      <w:r>
+        <w:rPr>
+          <w:rFonts w:ascii="Arial" w:eastAsia="Arial" w:hAnsi="Arial" w:cs="Arial"/>
+          <w:b/>
+          <w:bCs/>
+          <w:sz w:val="28"/>
+          <w:szCs w:val="28"/>
+        </w:rPr>
+        <w:t>.2</w:t>
+      </w:r>
+      <w:r>
+        <w:rPr>
+          <w:rFonts w:ascii="Arial" w:eastAsia="Arial" w:hAnsi="Arial" w:cs="Arial"/>
+          <w:b/>
+          <w:bCs/>
+          <w:sz w:val="28"/>
+          <w:szCs w:val="28"/>
+        </w:rPr>
+        <w:t xml:space="preserve"> JavaScript</w:t>
+      </w:r>
+    </w:p>
+    <w:p>
+      <w:pPr>
+        <w:spacing w:before="240" w:after="240"/>
+      </w:pPr>
+      <w:r>
+        <w:rPr>
+          <w:rFonts w:ascii="Arial" w:eastAsia="Arial" w:hAnsi="Arial" w:cs="Arial"/>
+        </w:rPr>
+        <w:t>O JavaScript é uma linguagem de programação amplamente utilizada para adicionar interatividade e dinamismo às páginas e aplicações digitais. Com ele, é possível criar funcionalidades como animações, validação de formulários, atualizações de conteúdo em tempo real e respostas a ações do usuário, tornando a experiência mais envolvente. Ele pode ser executado diretamente no navegador, o que facilita sua aplicação no desenvolvimento web.</w:t>
+      </w:r>
+    </w:p>
+    <w:p>
+      <w:pPr>
+        <w:spacing w:before="240" w:after="240"/>
+      </w:pPr>
       <w:r>
         <w:rPr>
           <w:rFonts w:ascii="Arial" w:eastAsia="Arial" w:hAnsi="Arial" w:cs="Arial"/>
         </w:rPr>
         <w:lastRenderedPageBreak/>
-        <w:t>Ele serve como uma base organizada, onde o desenvolvedor pode construir seu projeto seguindo uma arquitetura já definida, evitando a necessidade de começar tudo do zero. Frameworks podem ser utilizados em diversas linguagens e áreas, como desenvolvimento web, mobile e sistemas em geral.</w:t>
+        <w:t>Além disso, o JavaScript também é usado fora dos navegadores, permitindo o desenvolvimento de servidores, aplicativos e até sistemas completos. Sua versatilidade e grande quantidade de bibliotecas e ferramentas disponíveis tornam a linguagem essencial no cenário atual da programação. Dessa forma, ele contribui para a criação de projetos mais completos, interativos e adaptados às necessidades dos usuários.</w:t>
+      </w:r>
+    </w:p>
+    <w:p>
+      <w:pPr>
+        <w:spacing w:after="0" w:line="360" w:lineRule="auto"/>
+        <w:contextualSpacing/>
+        <w:rPr>
+          <w:rFonts w:ascii="Arial" w:eastAsia="Arial" w:hAnsi="Arial" w:cs="Arial"/>
+          <w:b/>
+          <w:bCs/>
+          <w:sz w:val="28"/>
+          <w:szCs w:val="28"/>
+          <w:lang w:val="en-US"/>
+        </w:rPr>
+      </w:pPr>
+      <w:r>
+        <w:rPr>
+          <w:rFonts w:ascii="Arial" w:eastAsia="Arial" w:hAnsi="Arial" w:cs="Arial"/>
+          <w:b/>
+          <w:bCs/>
+          <w:sz w:val="28"/>
+          <w:szCs w:val="28"/>
+        </w:rPr>
+        <w:t>5</w:t>
+      </w:r>
+      <w:r>
+        <w:rPr>
+          <w:rFonts w:ascii="Arial" w:eastAsia="Arial" w:hAnsi="Arial" w:cs="Arial"/>
+          <w:b/>
+          <w:bCs/>
+          <w:sz w:val="28"/>
+          <w:szCs w:val="28"/>
+        </w:rPr>
+        <w:t>.3</w:t>
+      </w:r>
+      <w:r>
+        <w:rPr>
+          <w:rFonts w:ascii="Arial" w:eastAsia="Arial" w:hAnsi="Arial" w:cs="Arial"/>
+          <w:b/>
+          <w:bCs/>
+          <w:sz w:val="28"/>
+          <w:szCs w:val="28"/>
+        </w:rPr>
+        <w:t xml:space="preserve"> Node.JS</w:t>
+      </w:r>
+    </w:p>
+    <w:p>
+      <w:pPr>
+        <w:spacing w:after="0" w:line="360" w:lineRule="auto"/>
+        <w:ind w:firstLine="709"/>
+        <w:contextualSpacing/>
+        <w:mirrorIndents/>
+        <w:jc w:val="both"/>
+      </w:pPr>
+      <w:r>
+        <w:rPr>
+          <w:rFonts w:ascii="Arial" w:eastAsia="Arial" w:hAnsi="Arial" w:cs="Arial"/>
+        </w:rPr>
+        <w:t>O Node.js é um ambiente de execução que permite rodar código JavaScript fora do navegador, sendo amplamente utilizado no desenvolvimento de aplicações do lado do servidor. Ele é construído sobre o motor V8 e utiliza um modelo de execução assíncrono e orientado a eventos, o que possibilita lidar com várias requisições ao mesmo tempo de forma eficiente, sem comprometer o desempenho.</w:t>
       </w:r>
     </w:p>
     <w:p>
       <w:pPr>
         <w:spacing w:before="240" w:after="240"/>
-        <w:rPr>
-          <w:rFonts w:ascii="Arial" w:eastAsia="Arial" w:hAnsi="Arial" w:cs="Arial"/>
-          <w:lang w:val="en-US"/>
-        </w:rPr>
-      </w:pPr>
-      <w:r>
-        <w:rPr>
-          <w:rFonts w:ascii="Arial" w:eastAsia="Arial" w:hAnsi="Arial" w:cs="Arial"/>
-        </w:rPr>
-        <w:t>A utilização de frameworks em projetos traz mais agilidade e padronização ao desenvolvimento, pois muitas funcionalidades comuns já estão implementadas, como organização de pastas, rotas e conexão com banco de dados. Além disso, eles incentivam boas práticas de programação e facilitam a manutenção do código. Com isso, o desenvolvedor consegue focar mais nas funcionalidades específicas do projeto, tornando o processo mais eficiente e confiável.</w:t>
-      </w:r>
-    </w:p>
-    <w:p>
-      <w:pPr>
-        <w:spacing w:after="0" w:line="360" w:lineRule="auto"/>
-        <w:contextualSpacing/>
-        <w:rPr>
-          <w:rFonts w:ascii="Arial" w:eastAsia="Arial" w:hAnsi="Arial" w:cs="Arial"/>
-          <w:b/>
-          <w:bCs/>
-          <w:sz w:val="28"/>
-          <w:szCs w:val="28"/>
-          <w:lang w:val="en-US"/>
-        </w:rPr>
-      </w:pPr>
-      <w:r>
-        <w:rPr>
-          <w:rFonts w:ascii="Arial" w:eastAsia="Arial" w:hAnsi="Arial" w:cs="Arial"/>
-          <w:b/>
-          <w:bCs/>
-          <w:sz w:val="28"/>
-          <w:szCs w:val="28"/>
-        </w:rPr>
-        <w:t>6</w:t>
-      </w:r>
-      <w:r>
-        <w:rPr>
-          <w:rFonts w:ascii="Arial" w:eastAsia="Arial" w:hAnsi="Arial" w:cs="Arial"/>
-          <w:b/>
-          <w:bCs/>
-          <w:sz w:val="28"/>
-          <w:szCs w:val="28"/>
-        </w:rPr>
-        <w:t>.</w:t>
-      </w:r>
-      <w:r>
-        <w:rPr>
-          <w:rFonts w:ascii="Arial" w:eastAsia="Arial" w:hAnsi="Arial" w:cs="Arial"/>
-          <w:b/>
-          <w:bCs/>
-          <w:sz w:val="28"/>
-          <w:szCs w:val="28"/>
-        </w:rPr>
-        <w:t>1</w:t>
-      </w:r>
-      <w:r>
-        <w:rPr>
-          <w:rFonts w:ascii="Arial" w:eastAsia="Arial" w:hAnsi="Arial" w:cs="Arial"/>
-          <w:b/>
-          <w:bCs/>
-          <w:sz w:val="28"/>
-          <w:szCs w:val="28"/>
-        </w:rPr>
-        <w:t xml:space="preserve"> React Native</w:t>
-      </w:r>
-    </w:p>
-    <w:p>
-      <w:pPr>
-        <w:spacing w:before="240" w:after="240"/>
-        <w:rPr>
-          <w:rFonts w:ascii="Arial" w:eastAsia="Arial" w:hAnsi="Arial" w:cs="Arial"/>
-          <w:lang w:val="en-US"/>
-        </w:rPr>
-      </w:pPr>
-      <w:r>
-        <w:rPr>
-          <w:rFonts w:ascii="Arial" w:eastAsia="Arial" w:hAnsi="Arial" w:cs="Arial"/>
-        </w:rPr>
-        <w:t>O React Native é uma tecnologia utilizada para desenvolver aplicativos móveis que funcionam tanto em Android quanto em iOS, utilizando uma única base de código. Ele foi criado pelo Meta e é baseado na biblioteca React, permitindo que desenvolvedores utilizem JavaScript e conceitos de componentes para construir interfaces modernas e interativas. Diferente de outras abordagens, o React Native não utiliza apenas elementos web, mas componentes nativos, o que garante melhor desempenho e aparência mais próxima de aplicativos tradicionais.</w:t>
-      </w:r>
-    </w:p>
-    <w:p>
-      <w:pPr>
-        <w:spacing w:before="240" w:after="240"/>
-        <w:rPr>
-          <w:rFonts w:ascii="Arial" w:eastAsia="Arial" w:hAnsi="Arial" w:cs="Arial"/>
-        </w:rPr>
-      </w:pPr>
-      <w:r>
-        <w:rPr>
-          <w:rFonts w:ascii="Arial" w:eastAsia="Arial" w:hAnsi="Arial" w:cs="Arial"/>
-        </w:rPr>
-        <w:t>No contexto de desenvolvimento, o React Native se destaca por agilizar a criação de aplicativos, já que grande parte do código pode ser reutilizada entre diferentes plataformas. Além disso, ele conta com uma comunidade ativa e diversas bibliotecas que facilitam a implementação de funcionalidades como navegação, integração com APIs e uso de recursos do dispositivo. Isso torna o processo mais produtivo e acessível, especialmente para quem já possui conhecimento em JavaScript e deseja expandir para o desenvolvimento mobile.</w:t>
-      </w:r>
-    </w:p>
-    <w:p>
-      <w:pPr>
-        <w:spacing w:after="0" w:line="360" w:lineRule="auto"/>
-        <w:contextualSpacing/>
-        <w:rPr>
-          <w:rFonts w:ascii="Arial" w:eastAsia="Arial" w:hAnsi="Arial" w:cs="Arial"/>
-          <w:b/>
-          <w:bCs/>
-          <w:sz w:val="28"/>
-          <w:szCs w:val="28"/>
-          <w:lang w:val="en-US"/>
-        </w:rPr>
-      </w:pPr>
-      <w:r>
-        <w:rPr>
-          <w:rFonts w:ascii="Arial" w:eastAsia="Arial" w:hAnsi="Arial" w:cs="Arial"/>
-          <w:b/>
-          <w:bCs/>
-          <w:sz w:val="28"/>
-          <w:szCs w:val="28"/>
-        </w:rPr>
-        <w:t>6.2</w:t>
-      </w:r>
-      <w:r>
-        <w:rPr>
-          <w:rFonts w:ascii="Arial" w:eastAsia="Arial" w:hAnsi="Arial" w:cs="Arial"/>
-          <w:b/>
-          <w:bCs/>
-          <w:sz w:val="28"/>
-          <w:szCs w:val="28"/>
-        </w:rPr>
-        <w:t xml:space="preserve"> JavaScript</w:t>
-      </w:r>
-    </w:p>
-    <w:p>
-      <w:pPr>
-        <w:spacing w:before="240" w:after="240"/>
-      </w:pPr>
-      <w:r>
-        <w:rPr>
-          <w:rFonts w:ascii="Arial" w:eastAsia="Arial" w:hAnsi="Arial" w:cs="Arial"/>
-        </w:rPr>
-        <w:t>O JavaScript é uma linguagem de programação amplamente utilizada para adicionar interatividade e dinamismo às páginas e aplicações digitais. Com ele, é possível criar funcionalidades como animações, validação de formulários, atualizações de conteúdo em tempo real e respostas a ações do usuário, tornando a experiência mais envolvente. Ele pode ser executado diretamente no navegador, o que facilita sua aplicação no desenvolvimento web.</w:t>
-      </w:r>
-    </w:p>
-    <w:p>
-      <w:pPr>
-        <w:spacing w:before="240" w:after="240"/>
-      </w:pPr>
-      <w:r>
-        <w:rPr>
-          <w:rFonts w:ascii="Arial" w:eastAsia="Arial" w:hAnsi="Arial" w:cs="Arial"/>
-        </w:rPr>
-        <w:t xml:space="preserve">Além disso, o JavaScript também é usado fora dos navegadores, permitindo o desenvolvimento de servidores, aplicativos e até sistemas completos. Sua versatilidade e grande quantidade de bibliotecas e ferramentas disponíveis tornam a linguagem essencial no cenário atual da programação. Dessa forma, ele contribui </w:t>
-      </w:r>
-      <w:r>
-        <w:rPr>
-          <w:rFonts w:ascii="Arial" w:eastAsia="Arial" w:hAnsi="Arial" w:cs="Arial"/>
-        </w:rPr>
-        <w:lastRenderedPageBreak/>
-        <w:t>para a criação de projetos mais completos, interativos e adaptados às necessidades dos usuários.</w:t>
-      </w:r>
-    </w:p>
-    <w:p>
-      <w:pPr>
-        <w:spacing w:after="0" w:line="360" w:lineRule="auto"/>
-        <w:contextualSpacing/>
-        <w:rPr>
-          <w:rFonts w:ascii="Arial" w:eastAsia="Arial" w:hAnsi="Arial" w:cs="Arial"/>
-          <w:b/>
-          <w:bCs/>
-          <w:sz w:val="28"/>
-          <w:szCs w:val="28"/>
-          <w:lang w:val="en-US"/>
-        </w:rPr>
-      </w:pPr>
-      <w:r>
-        <w:rPr>
-          <w:rFonts w:ascii="Arial" w:eastAsia="Arial" w:hAnsi="Arial" w:cs="Arial"/>
-          <w:b/>
-          <w:bCs/>
-          <w:sz w:val="28"/>
-          <w:szCs w:val="28"/>
-        </w:rPr>
-        <w:t>6.3</w:t>
-      </w:r>
-      <w:r>
-        <w:rPr>
-          <w:rFonts w:ascii="Arial" w:eastAsia="Arial" w:hAnsi="Arial" w:cs="Arial"/>
-          <w:b/>
-          <w:bCs/>
-          <w:sz w:val="28"/>
-          <w:szCs w:val="28"/>
-        </w:rPr>
-        <w:t xml:space="preserve"> Node.JS</w:t>
-      </w:r>
-    </w:p>
-    <w:p>
-      <w:pPr>
-        <w:spacing w:before="240" w:after="240"/>
-      </w:pPr>
-      <w:r>
-        <w:rPr>
-          <w:rFonts w:ascii="Arial" w:eastAsia="Arial" w:hAnsi="Arial" w:cs="Arial"/>
-        </w:rPr>
-        <w:t>O Node.js é um ambiente de execução que permite rodar código JavaScript fora do navegador, sendo amplamente utilizado no desenvolvimento de aplicações do lado do servidor. Ele é construído sobre o motor V8 e utiliza um modelo de execução assíncrono e orientado a eventos, o que possibilita lidar com várias requisições ao mesmo tempo de forma eficiente, sem comprometer o desempenho.</w:t>
-      </w:r>
-    </w:p>
-    <w:p>
-      <w:pPr>
-        <w:spacing w:before="240" w:after="240"/>
       </w:pPr>
       <w:r>
         <w:rPr>
@@ -3919,7 +4045,17 @@
           <w:sz w:val="28"/>
           <w:szCs w:val="28"/>
         </w:rPr>
-        <w:t>6.4</w:t>
+        <w:t>5</w:t>
+      </w:r>
+      <w:r>
+        <w:rPr>
+          <w:rFonts w:ascii="Arial" w:eastAsia="Arial" w:hAnsi="Arial" w:cs="Arial"/>
+          <w:b/>
+          <w:bCs/>
+          <w:sz w:val="28"/>
+          <w:szCs w:val="28"/>
+        </w:rPr>
+        <w:t>.4</w:t>
       </w:r>
       <w:r>
         <w:rPr>
@@ -3989,7 +4125,17 @@
           <w:sz w:val="28"/>
           <w:szCs w:val="28"/>
         </w:rPr>
-        <w:t>6.5 Jest</w:t>
+        <w:t>5</w:t>
+      </w:r>
+      <w:r>
+        <w:rPr>
+          <w:rFonts w:ascii="Arial" w:eastAsia="Arial" w:hAnsi="Arial" w:cs="Arial"/>
+          <w:b/>
+          <w:bCs/>
+          <w:sz w:val="28"/>
+          <w:szCs w:val="28"/>
+        </w:rPr>
+        <w:t>.5 Jest</w:t>
       </w:r>
     </w:p>
     <w:p>
@@ -4000,7 +4146,14 @@
         <w:rPr>
           <w:rFonts w:ascii="Arial" w:eastAsia="Arial" w:hAnsi="Arial" w:cs="Arial"/>
         </w:rPr>
-        <w:t>O Jest é uma ferramenta de testes utilizada principalmente em projetos JavaScript, sendo bastante comum em aplicações que utilizam bibliotecas e frameworks modernos. Ele permite criar e executar testes automatizados para verificar se funções, componentes e outras partes do código estão funcionando corretamente, ajudando a evitar erros durante o desenvolvimento.</w:t>
+        <w:t xml:space="preserve">O Jest é uma ferramenta de testes utilizada principalmente em projetos JavaScript, sendo bastante comum em aplicações que utilizam bibliotecas e frameworks </w:t>
+      </w:r>
+      <w:r>
+        <w:rPr>
+          <w:rFonts w:ascii="Arial" w:eastAsia="Arial" w:hAnsi="Arial" w:cs="Arial"/>
+        </w:rPr>
+        <w:lastRenderedPageBreak/>
+        <w:t>modernos. Ele permite criar e executar testes automatizados para verificar se funções, componentes e outras partes do código estão funcionando corretamente, ajudando a evitar erros durante o desenvolvimento.</w:t>
       </w:r>
     </w:p>
     <w:p>
@@ -4025,38 +4178,31 @@
         <w:rPr>
           <w:rFonts w:ascii="Arial" w:eastAsia="Arial" w:hAnsi="Arial" w:cs="Arial"/>
         </w:rPr>
-        <w:t xml:space="preserve">), </w:t>
-      </w:r>
-      <w:r>
-        <w:rPr>
-          <w:rFonts w:ascii="Arial" w:eastAsia="Arial" w:hAnsi="Arial" w:cs="Arial"/>
-        </w:rPr>
-        <w:lastRenderedPageBreak/>
-        <w:t>testes assíncronos e relatórios detalhados. Além disso, ele contribui para a qualidade do software, garantindo que novas alterações no código não quebrem funcionalidades já existentes. Com isso, o uso do Jest torna o desenvolvimento mais seguro, organizado e confiável.</w:t>
-      </w:r>
-    </w:p>
-    <w:p>
-      <w:pPr>
-        <w:spacing w:after="0" w:line="360" w:lineRule="auto"/>
-        <w:contextualSpacing/>
-        <w:rPr>
-          <w:rFonts w:ascii="Arial" w:eastAsia="Arial" w:hAnsi="Arial" w:cs="Arial"/>
-          <w:b/>
-          <w:bCs/>
-          <w:sz w:val="28"/>
-          <w:szCs w:val="28"/>
-          <w:lang w:val="en-US"/>
-        </w:rPr>
-      </w:pPr>
-      <w:r>
-        <w:rPr>
-          <w:rFonts w:ascii="Arial" w:eastAsia="Arial" w:hAnsi="Arial" w:cs="Arial"/>
-          <w:b/>
-          <w:bCs/>
-          <w:sz w:val="28"/>
-          <w:szCs w:val="28"/>
-        </w:rPr>
-        <w:t>7</w:t>
+        <w:t>), testes assíncronos e relatórios detalhados. Além disso, ele contribui para a qualidade do software, garantindo que novas alterações no código não quebrem funcionalidades já existentes. Com isso, o uso do Jest torna o desenvolvimento mais seguro, organizado e confiável.</w:t>
+      </w:r>
+    </w:p>
+    <w:p>
+      <w:pPr>
+        <w:spacing w:after="0" w:line="360" w:lineRule="auto"/>
+        <w:contextualSpacing/>
+        <w:rPr>
+          <w:rFonts w:ascii="Arial" w:eastAsia="Arial" w:hAnsi="Arial" w:cs="Arial"/>
+          <w:b/>
+          <w:bCs/>
+          <w:sz w:val="28"/>
+          <w:szCs w:val="28"/>
+          <w:lang w:val="en-US"/>
+        </w:rPr>
+      </w:pPr>
+      <w:r>
+        <w:rPr>
+          <w:rFonts w:ascii="Arial" w:eastAsia="Arial" w:hAnsi="Arial" w:cs="Arial"/>
+          <w:b/>
+          <w:bCs/>
+          <w:sz w:val="28"/>
+          <w:szCs w:val="28"/>
+        </w:rPr>
+        <w:t>6</w:t>
       </w:r>
       <w:r>
         <w:rPr>
@@ -4136,30 +4282,30 @@
     <w:p>
       <w:pPr>
         <w:spacing w:after="0" w:line="360" w:lineRule="auto"/>
-        <w:ind w:firstLine="283"/>
-        <w:contextualSpacing/>
-        <w:rPr>
-          <w:rFonts w:ascii="Arial" w:eastAsia="Arial" w:hAnsi="Arial" w:cs="Arial"/>
-          <w:b/>
-          <w:bCs/>
-          <w:sz w:val="28"/>
-          <w:szCs w:val="28"/>
-          <w:lang w:val="en-US"/>
-        </w:rPr>
-      </w:pPr>
-      <w:r>
-        <w:rPr>
-          <w:rFonts w:ascii="Arial" w:eastAsia="Arial" w:hAnsi="Arial" w:cs="Arial"/>
-          <w:b/>
-          <w:bCs/>
+        <w:contextualSpacing/>
+        <w:rPr>
+          <w:rFonts w:ascii="Arial" w:eastAsia="Arial" w:hAnsi="Arial" w:cs="Arial"/>
+          <w:b/>
+          <w:bCs/>
+          <w:sz w:val="28"/>
+          <w:szCs w:val="28"/>
+          <w:lang w:val="en-US"/>
+        </w:rPr>
+      </w:pPr>
+      <w:r>
+        <w:rPr>
+          <w:rFonts w:ascii="Arial" w:eastAsia="Arial" w:hAnsi="Arial" w:cs="Arial"/>
+          <w:b/>
+          <w:bCs/>
+          <w:noProof/>
           <w:sz w:val="28"/>
           <w:szCs w:val="28"/>
           <w:lang w:val="en-US"/>
         </w:rPr>
         <w:drawing>
-          <wp:inline distT="0" distB="0" distL="0" distR="0" wp14:anchorId="56D05F89" wp14:editId="0634AC3F">
-            <wp:extent cx="5715000" cy="4212590"/>
-            <wp:effectExtent l="76200" t="76200" r="133350" b="130810"/>
+          <wp:inline distT="0" distB="0" distL="0" distR="0" wp14:anchorId="56D05F89" wp14:editId="16947682">
+            <wp:extent cx="5715000" cy="3126105"/>
+            <wp:effectExtent l="38100" t="38100" r="38100" b="36195"/>
             <wp:docPr id="2" name="Imagem 2"/>
             <wp:cNvGraphicFramePr>
               <a:graphicFrameLocks xmlns:a="http://schemas.openxmlformats.org/drawingml/2006/main" noChangeAspect="1"/>
@@ -4172,31 +4318,31 @@
                     <pic:cNvPicPr/>
                   </pic:nvPicPr>
                   <pic:blipFill rotWithShape="1">
-                    <a:blip r:embed="rId10"/>
-                    <a:srcRect t="-181" r="287" b="-1"/>
+                    <a:blip r:embed="rId10">
+                      <a:extLst>
+                        <a:ext uri="{28A0092B-C50C-407E-A947-70E740481C1C}">
+                          <a14:useLocalDpi xmlns:a14="http://schemas.microsoft.com/office/drawing/2010/main" val="0"/>
+                        </a:ext>
+                      </a:extLst>
+                    </a:blip>
+                    <a:srcRect l="1462" t="2699" r="2016" b="2494"/>
                     <a:stretch/>
                   </pic:blipFill>
                   <pic:spPr bwMode="auto">
                     <a:xfrm>
                       <a:off x="0" y="0"/>
-                      <a:ext cx="5715000" cy="4212590"/>
+                      <a:ext cx="5764733" cy="3153309"/>
                     </a:xfrm>
                     <a:prstGeom prst="rect">
                       <a:avLst/>
                     </a:prstGeom>
-                    <a:ln w="38100" cap="sq" cmpd="sng" algn="ctr">
-                      <a:solidFill>
-                        <a:srgbClr val="000000"/>
-                      </a:solidFill>
-                      <a:prstDash val="solid"/>
-                      <a:miter lim="800000"/>
-                      <a:headEnd type="none" w="med" len="med"/>
-                      <a:tailEnd type="none" w="med" len="med"/>
+                    <a:ln>
+                      <a:noFill/>
                     </a:ln>
                     <a:effectLst>
-                      <a:outerShdw blurRad="50800" dist="38100" dir="2700000" algn="tl" rotWithShape="0">
-                        <a:srgbClr val="000000">
-                          <a:alpha val="43000"/>
+                      <a:outerShdw blurRad="292100" dist="139700" dir="2700000" algn="tl" rotWithShape="0">
+                        <a:srgbClr val="333333">
+                          <a:alpha val="0"/>
                         </a:srgbClr>
                       </a:outerShdw>
                     </a:effectLst>
@@ -4293,7 +4439,7 @@
           <w:sz w:val="28"/>
           <w:szCs w:val="28"/>
         </w:rPr>
-        <w:t>8</w:t>
+        <w:t>7</w:t>
       </w:r>
       <w:r>
         <w:rPr>
@@ -4389,14 +4535,15 @@
           <w:rFonts w:ascii="Arial" w:eastAsia="Arial" w:hAnsi="Arial" w:cs="Arial"/>
           <w:b/>
           <w:bCs/>
+          <w:noProof/>
           <w:sz w:val="28"/>
           <w:szCs w:val="28"/>
           <w:lang w:val="en-US"/>
         </w:rPr>
         <w:drawing>
-          <wp:inline distT="0" distB="0" distL="0" distR="0" wp14:anchorId="3ABC0456" wp14:editId="5B8BF127">
+          <wp:inline distT="0" distB="0" distL="0" distR="0" wp14:anchorId="3ABC0456" wp14:editId="14B761C8">
             <wp:extent cx="5731510" cy="2716530"/>
-            <wp:effectExtent l="76200" t="76200" r="135890" b="140970"/>
+            <wp:effectExtent l="38100" t="38100" r="40640" b="45720"/>
             <wp:docPr id="3" name="Imagem 3"/>
             <wp:cNvGraphicFramePr>
               <a:graphicFrameLocks xmlns:a="http://schemas.openxmlformats.org/drawingml/2006/main" noChangeAspect="1"/>
@@ -4422,17 +4569,13 @@
                     <a:prstGeom prst="rect">
                       <a:avLst/>
                     </a:prstGeom>
-                    <a:ln w="38100" cap="sq">
-                      <a:solidFill>
-                        <a:srgbClr val="000000"/>
-                      </a:solidFill>
-                      <a:prstDash val="solid"/>
-                      <a:miter lim="800000"/>
+                    <a:ln>
+                      <a:noFill/>
                     </a:ln>
                     <a:effectLst>
-                      <a:outerShdw blurRad="50800" dist="38100" dir="2700000" algn="tl" rotWithShape="0">
-                        <a:srgbClr val="000000">
-                          <a:alpha val="43000"/>
+                      <a:outerShdw blurRad="292100" dist="139700" dir="2700000" algn="tl" rotWithShape="0">
+                        <a:srgbClr val="333333">
+                          <a:alpha val="0"/>
                         </a:srgbClr>
                       </a:outerShdw>
                     </a:effectLst>
@@ -4495,7 +4638,7 @@
           <w:sz w:val="28"/>
           <w:szCs w:val="28"/>
         </w:rPr>
-        <w:t>9</w:t>
+        <w:t>8</w:t>
       </w:r>
       <w:r>
         <w:rPr>
@@ -4598,14 +4741,15 @@
           <w:rFonts w:ascii="Arial" w:eastAsia="Arial" w:hAnsi="Arial" w:cs="Arial"/>
           <w:b/>
           <w:bCs/>
+          <w:noProof/>
           <w:sz w:val="28"/>
           <w:szCs w:val="28"/>
           <w:lang w:val="en-US"/>
         </w:rPr>
         <w:drawing>
-          <wp:inline distT="0" distB="0" distL="0" distR="0" wp14:anchorId="6FCEBA6B" wp14:editId="6EEE8C50">
+          <wp:inline distT="0" distB="0" distL="0" distR="0" wp14:anchorId="6FCEBA6B" wp14:editId="12EE9BE3">
             <wp:extent cx="5661660" cy="2719070"/>
-            <wp:effectExtent l="76200" t="76200" r="129540" b="138430"/>
+            <wp:effectExtent l="38100" t="38100" r="34290" b="43180"/>
             <wp:docPr id="4" name="Imagem 4"/>
             <wp:cNvGraphicFramePr>
               <a:graphicFrameLocks xmlns:a="http://schemas.openxmlformats.org/drawingml/2006/main" noChangeAspect="1"/>
@@ -4630,19 +4774,13 @@
                     <a:prstGeom prst="rect">
                       <a:avLst/>
                     </a:prstGeom>
-                    <a:ln w="38100" cap="sq" cmpd="sng" algn="ctr">
-                      <a:solidFill>
-                        <a:srgbClr val="000000"/>
-                      </a:solidFill>
-                      <a:prstDash val="solid"/>
-                      <a:miter lim="800000"/>
-                      <a:headEnd type="none" w="med" len="med"/>
-                      <a:tailEnd type="none" w="med" len="med"/>
+                    <a:ln>
+                      <a:noFill/>
                     </a:ln>
                     <a:effectLst>
-                      <a:outerShdw blurRad="50800" dist="38100" dir="2700000" algn="tl" rotWithShape="0">
-                        <a:srgbClr val="000000">
-                          <a:alpha val="43000"/>
+                      <a:outerShdw blurRad="292100" dist="139700" dir="2700000" algn="tl" rotWithShape="0">
+                        <a:srgbClr val="333333">
+                          <a:alpha val="0"/>
                         </a:srgbClr>
                       </a:outerShdw>
                     </a:effectLst>
@@ -4702,75 +4840,77 @@
           <w:lang w:val="en-US"/>
         </w:rPr>
       </w:pPr>
+      <w:r>
+        <w:rPr>
+          <w:rFonts w:ascii="Arial" w:eastAsia="Arial" w:hAnsi="Arial" w:cs="Arial"/>
+          <w:b/>
+          <w:bCs/>
+          <w:sz w:val="28"/>
+          <w:szCs w:val="28"/>
+        </w:rPr>
+        <w:t>9</w:t>
+      </w:r>
+      <w:r>
+        <w:rPr>
+          <w:rFonts w:ascii="Arial" w:eastAsia="Arial" w:hAnsi="Arial" w:cs="Arial"/>
+          <w:b/>
+          <w:bCs/>
+          <w:sz w:val="28"/>
+          <w:szCs w:val="28"/>
+        </w:rPr>
+        <w:t>.</w:t>
+      </w:r>
+      <w:r>
+        <w:rPr>
+          <w:rFonts w:ascii="Arial" w:eastAsia="Arial" w:hAnsi="Arial" w:cs="Arial"/>
+          <w:b/>
+          <w:bCs/>
+          <w:sz w:val="28"/>
+          <w:szCs w:val="28"/>
+        </w:rPr>
+        <w:t>Package.Json</w:t>
+      </w:r>
     </w:p>
     <w:p>
       <w:pPr>
         <w:spacing w:before="240" w:after="240"/>
         <w:rPr>
           <w:rFonts w:ascii="Arial" w:eastAsia="Arial" w:hAnsi="Arial" w:cs="Arial"/>
-          <w:b/>
-          <w:bCs/>
-          <w:sz w:val="28"/>
-          <w:szCs w:val="28"/>
-          <w:lang w:val="en-US"/>
-        </w:rPr>
-      </w:pPr>
+        </w:rPr>
+      </w:pPr>
+      <w:r>
+        <w:rPr>
+          <w:rFonts w:ascii="Arial" w:eastAsia="Arial" w:hAnsi="Arial" w:cs="Arial"/>
+        </w:rPr>
+        <w:t xml:space="preserve">O </w:t>
+      </w:r>
+      <w:r>
+        <w:rPr>
+          <w:rFonts w:ascii="Arial" w:eastAsia="Arial" w:hAnsi="Arial" w:cs="Arial"/>
+          <w:iCs/>
+        </w:rPr>
+        <w:t>package.json</w:t>
+      </w:r>
+      <w:r>
+        <w:rPr>
+          <w:rFonts w:ascii="Arial" w:eastAsia="Arial" w:hAnsi="Arial" w:cs="Arial"/>
+        </w:rPr>
+        <w:t xml:space="preserve"> é um arquivo fundamental em projetos que utilizam Node.js, responsável por armazenar informações e configurações do projeto. Nele ficam dados como o nome da aplicação, versão, descrição, além das dependências necessárias para o funcionamento do sistema. Esse arquivo funciona como um ponto central de organização, permitindo que o ambiente do projeto seja facilmente reproduzido em outras máquinas.</w:t>
+      </w:r>
     </w:p>
     <w:p>
       <w:pPr>
         <w:spacing w:before="240" w:after="240"/>
         <w:rPr>
           <w:rFonts w:ascii="Arial" w:eastAsia="Arial" w:hAnsi="Arial" w:cs="Arial"/>
-          <w:b/>
-          <w:bCs/>
-          <w:sz w:val="28"/>
-          <w:szCs w:val="28"/>
-          <w:lang w:val="en-US"/>
-        </w:rPr>
-      </w:pPr>
-      <w:r>
-        <w:rPr>
-          <w:rFonts w:ascii="Arial" w:eastAsia="Arial" w:hAnsi="Arial" w:cs="Arial"/>
-          <w:b/>
-          <w:bCs/>
-          <w:sz w:val="28"/>
-          <w:szCs w:val="28"/>
-        </w:rPr>
-        <w:t>10</w:t>
-      </w:r>
-      <w:r>
-        <w:rPr>
-          <w:rFonts w:ascii="Arial" w:eastAsia="Arial" w:hAnsi="Arial" w:cs="Arial"/>
-          <w:b/>
-          <w:bCs/>
-          <w:sz w:val="28"/>
-          <w:szCs w:val="28"/>
-        </w:rPr>
-        <w:t>.</w:t>
-      </w:r>
-      <w:r>
-        <w:rPr>
-          <w:rFonts w:ascii="Arial" w:eastAsia="Arial" w:hAnsi="Arial" w:cs="Arial"/>
-          <w:b/>
-          <w:bCs/>
-          <w:sz w:val="28"/>
-          <w:szCs w:val="28"/>
-        </w:rPr>
-        <w:t>Package.Json</w:t>
-      </w:r>
-    </w:p>
-    <w:p>
-      <w:pPr>
-        <w:spacing w:before="240" w:after="240"/>
-        <w:rPr>
-          <w:rFonts w:ascii="Arial" w:eastAsia="Arial" w:hAnsi="Arial" w:cs="Arial"/>
-        </w:rPr>
-      </w:pPr>
-      <w:r>
-        <w:rPr>
-          <w:rFonts w:ascii="Arial" w:eastAsia="Arial" w:hAnsi="Arial" w:cs="Arial"/>
-        </w:rPr>
-        <w:t xml:space="preserve">O </w:t>
+          <w:lang w:val="en-US"/>
+        </w:rPr>
+      </w:pPr>
+      <w:r>
+        <w:rPr>
+          <w:rFonts w:ascii="Arial" w:eastAsia="Arial" w:hAnsi="Arial" w:cs="Arial"/>
+        </w:rPr>
+        <w:t xml:space="preserve">Além disso, o </w:t>
       </w:r>
       <w:r>
         <w:rPr>
@@ -4783,42 +4923,7 @@
         <w:rPr>
           <w:rFonts w:ascii="Arial" w:eastAsia="Arial" w:hAnsi="Arial" w:cs="Arial"/>
         </w:rPr>
-        <w:t xml:space="preserve"> é um arquivo fundamental em projetos que utilizam Node.js, responsável por armazenar informações e configurações do projeto. Nele ficam dados como o nome da aplicação, versão, descrição, além das dependências necessárias para o funcionamento do sistema. Esse arquivo funciona como um ponto central de organização, permitindo que o ambiente do projeto seja facilmente reproduzido em outras máquinas.</w:t>
-      </w:r>
-    </w:p>
-    <w:p>
-      <w:pPr>
-        <w:spacing w:before="240" w:after="240"/>
-        <w:rPr>
-          <w:rFonts w:ascii="Arial" w:eastAsia="Arial" w:hAnsi="Arial" w:cs="Arial"/>
-          <w:lang w:val="en-US"/>
-        </w:rPr>
-      </w:pPr>
-      <w:r>
-        <w:rPr>
-          <w:rFonts w:ascii="Arial" w:eastAsia="Arial" w:hAnsi="Arial" w:cs="Arial"/>
-        </w:rPr>
-        <w:t xml:space="preserve">Além disso, o </w:t>
-      </w:r>
-      <w:r>
-        <w:rPr>
-          <w:rFonts w:ascii="Arial" w:eastAsia="Arial" w:hAnsi="Arial" w:cs="Arial"/>
-          <w:iCs/>
-        </w:rPr>
-        <w:t>package.json</w:t>
-      </w:r>
-      <w:r>
-        <w:rPr>
-          <w:rFonts w:ascii="Arial" w:eastAsia="Arial" w:hAnsi="Arial" w:cs="Arial"/>
-        </w:rPr>
-        <w:t xml:space="preserve"> também pode conter scripts que automatizam tarefas comuns, como iniciar o servidor, rodar testes ou realizar builds. Isso facilita o dia a </w:t>
-      </w:r>
-      <w:r>
-        <w:rPr>
-          <w:rFonts w:ascii="Arial" w:eastAsia="Arial" w:hAnsi="Arial" w:cs="Arial"/>
-        </w:rPr>
-        <w:lastRenderedPageBreak/>
-        <w:t>dia do desenvolvimento, tornando os processos mais rápidos e padronizados. Dessa forma, ele contribui para uma melhor organização do projeto, garantindo consistência e praticidade na gestão das dependências e execuções.</w:t>
+        <w:t xml:space="preserve"> também pode conter scripts que automatizam tarefas comuns, como iniciar o servidor, rodar testes ou realizar builds. Isso facilita o dia a dia do desenvolvimento, tornando os processos mais rápidos e padronizados. Dessa forma, ele contribui para uma melhor organização do projeto, garantindo consistência e praticidade na gestão das dependências e execuções.</w:t>
       </w:r>
     </w:p>
     <w:p>
@@ -4864,14 +4969,16 @@
           <w:rFonts w:ascii="Arial" w:eastAsia="Arial" w:hAnsi="Arial" w:cs="Arial"/>
           <w:b/>
           <w:bCs/>
-          <w:sz w:val="28"/>
-          <w:szCs w:val="28"/>
-          <w:lang w:val="en-US"/>
-        </w:rPr>
+          <w:noProof/>
+          <w:sz w:val="28"/>
+          <w:szCs w:val="28"/>
+          <w:lang w:val="en-US"/>
+        </w:rPr>
+        <w:lastRenderedPageBreak/>
         <w:drawing>
-          <wp:inline distT="0" distB="0" distL="0" distR="0" wp14:anchorId="6ED7D366" wp14:editId="7CE9279C">
+          <wp:inline distT="0" distB="0" distL="0" distR="0" wp14:anchorId="6ED7D366" wp14:editId="0556B4E0">
             <wp:extent cx="5646420" cy="2931795"/>
-            <wp:effectExtent l="76200" t="76200" r="125730" b="135255"/>
+            <wp:effectExtent l="38100" t="38100" r="30480" b="40005"/>
             <wp:docPr id="5" name="Imagem 5"/>
             <wp:cNvGraphicFramePr>
               <a:graphicFrameLocks xmlns:a="http://schemas.openxmlformats.org/drawingml/2006/main" noChangeAspect="1"/>
@@ -4896,19 +5003,13 @@
                     <a:prstGeom prst="rect">
                       <a:avLst/>
                     </a:prstGeom>
-                    <a:ln w="38100" cap="sq" cmpd="sng" algn="ctr">
-                      <a:solidFill>
-                        <a:srgbClr val="000000"/>
-                      </a:solidFill>
-                      <a:prstDash val="solid"/>
-                      <a:miter lim="800000"/>
-                      <a:headEnd type="none" w="med" len="med"/>
-                      <a:tailEnd type="none" w="med" len="med"/>
+                    <a:ln>
+                      <a:noFill/>
                     </a:ln>
                     <a:effectLst>
-                      <a:outerShdw blurRad="50800" dist="38100" dir="2700000" algn="tl" rotWithShape="0">
-                        <a:srgbClr val="000000">
-                          <a:alpha val="43000"/>
+                      <a:outerShdw blurRad="292100" dist="139700" dir="2700000" algn="tl" rotWithShape="0">
+                        <a:srgbClr val="333333">
+                          <a:alpha val="0"/>
                         </a:srgbClr>
                       </a:outerShdw>
                     </a:effectLst>
@@ -4976,7 +5077,17 @@
           <w:sz w:val="28"/>
           <w:szCs w:val="28"/>
         </w:rPr>
-        <w:t>11</w:t>
+        <w:t>1</w:t>
+      </w:r>
+      <w:r>
+        <w:rPr>
+          <w:rFonts w:ascii="Arial" w:eastAsia="Arial" w:hAnsi="Arial" w:cs="Arial"/>
+          <w:b/>
+          <w:bCs/>
+          <w:sz w:val="28"/>
+          <w:szCs w:val="28"/>
+        </w:rPr>
+        <w:t>0</w:t>
       </w:r>
       <w:r>
         <w:rPr>
@@ -5081,22 +5192,15 @@
           <w:rFonts w:ascii="Arial" w:eastAsia="Arial" w:hAnsi="Arial" w:cs="Arial"/>
           <w:b/>
           <w:bCs/>
+          <w:noProof/>
           <w:sz w:val="28"/>
           <w:szCs w:val="28"/>
           <w:lang w:val="en-US"/>
         </w:rPr>
         <w:drawing>
-          <wp:anchor distT="0" distB="0" distL="114300" distR="114300" simplePos="0" relativeHeight="251659264" behindDoc="1" locked="0" layoutInCell="1" allowOverlap="1" wp14:anchorId="1A715F11" wp14:editId="673A76AB">
-            <wp:simplePos x="0" y="0"/>
-            <wp:positionH relativeFrom="column">
-              <wp:posOffset>182880</wp:posOffset>
-            </wp:positionH>
-            <wp:positionV relativeFrom="paragraph">
-              <wp:posOffset>-3175</wp:posOffset>
-            </wp:positionV>
-            <wp:extent cx="5731510" cy="1793875"/>
-            <wp:effectExtent l="76200" t="76200" r="135890" b="130175"/>
-            <wp:wrapNone/>
+          <wp:inline distT="0" distB="0" distL="0" distR="0" wp14:anchorId="2D4A15C3" wp14:editId="1115F240">
+            <wp:extent cx="5756827" cy="1844040"/>
+            <wp:effectExtent l="38100" t="38100" r="34925" b="41910"/>
             <wp:docPr id="8" name="Imagem 8"/>
             <wp:cNvGraphicFramePr>
               <a:graphicFrameLocks xmlns:a="http://schemas.openxmlformats.org/drawingml/2006/main" noChangeAspect="1"/>
@@ -5123,22 +5227,18 @@
                   <pic:spPr>
                     <a:xfrm>
                       <a:off x="0" y="0"/>
-                      <a:ext cx="5731510" cy="1793875"/>
+                      <a:ext cx="6055714" cy="1939780"/>
                     </a:xfrm>
                     <a:prstGeom prst="rect">
                       <a:avLst/>
                     </a:prstGeom>
-                    <a:ln w="38100" cap="sq">
-                      <a:solidFill>
-                        <a:srgbClr val="000000"/>
-                      </a:solidFill>
-                      <a:prstDash val="solid"/>
-                      <a:miter lim="800000"/>
+                    <a:ln>
+                      <a:noFill/>
                     </a:ln>
                     <a:effectLst>
-                      <a:outerShdw blurRad="50800" dist="38100" dir="2700000" algn="tl" rotWithShape="0">
-                        <a:srgbClr val="000000">
-                          <a:alpha val="43000"/>
+                      <a:outerShdw blurRad="292100" dist="139700" dir="2700000" algn="tl" rotWithShape="0">
+                        <a:srgbClr val="333333">
+                          <a:alpha val="0"/>
                         </a:srgbClr>
                       </a:outerShdw>
                     </a:effectLst>
@@ -5146,13 +5246,7 @@
                 </pic:pic>
               </a:graphicData>
             </a:graphic>
-            <wp14:sizeRelH relativeFrom="page">
-              <wp14:pctWidth>0</wp14:pctWidth>
-            </wp14:sizeRelH>
-            <wp14:sizeRelV relativeFrom="page">
-              <wp14:pctHeight>0</wp14:pctHeight>
-            </wp14:sizeRelV>
-          </wp:anchor>
+          </wp:inline>
         </w:drawing>
       </w:r>
     </w:p>
@@ -5163,18 +5257,12 @@
         <w:contextualSpacing/>
         <w:rPr>
           <w:rFonts w:ascii="Arial" w:eastAsia="Arial" w:hAnsi="Arial" w:cs="Arial"/>
-          <w:b/>
-          <w:bCs/>
           <w:sz w:val="20"/>
           <w:szCs w:val="20"/>
-        </w:rPr>
-      </w:pPr>
-    </w:p>
-    <w:p>
-      <w:pPr>
-        <w:spacing w:after="0" w:line="360" w:lineRule="auto"/>
-        <w:ind w:firstLine="283"/>
-        <w:contextualSpacing/>
+          <w:lang w:val="en-US"/>
+        </w:rPr>
+      </w:pPr>
+      <w:r>
         <w:rPr>
           <w:rFonts w:ascii="Arial" w:eastAsia="Arial" w:hAnsi="Arial" w:cs="Arial"/>
           <w:b/>
@@ -5182,106 +5270,14 @@
           <w:sz w:val="20"/>
           <w:szCs w:val="20"/>
         </w:rPr>
-      </w:pPr>
-    </w:p>
-    <w:p>
-      <w:pPr>
-        <w:spacing w:after="0" w:line="360" w:lineRule="auto"/>
-        <w:ind w:firstLine="283"/>
-        <w:contextualSpacing/>
-        <w:rPr>
-          <w:rFonts w:ascii="Arial" w:eastAsia="Arial" w:hAnsi="Arial" w:cs="Arial"/>
-          <w:b/>
-          <w:bCs/>
+        <w:t xml:space="preserve">Fonte: </w:t>
+      </w:r>
+      <w:r>
+        <w:rPr>
+          <w:rFonts w:ascii="Arial" w:eastAsia="Arial" w:hAnsi="Arial" w:cs="Arial"/>
           <w:sz w:val="20"/>
           <w:szCs w:val="20"/>
         </w:rPr>
-      </w:pPr>
-    </w:p>
-    <w:p>
-      <w:pPr>
-        <w:spacing w:after="0" w:line="360" w:lineRule="auto"/>
-        <w:ind w:firstLine="283"/>
-        <w:contextualSpacing/>
-        <w:rPr>
-          <w:rFonts w:ascii="Arial" w:eastAsia="Arial" w:hAnsi="Arial" w:cs="Arial"/>
-          <w:b/>
-          <w:bCs/>
-          <w:sz w:val="20"/>
-          <w:szCs w:val="20"/>
-        </w:rPr>
-      </w:pPr>
-    </w:p>
-    <w:p>
-      <w:pPr>
-        <w:spacing w:after="0" w:line="360" w:lineRule="auto"/>
-        <w:ind w:firstLine="283"/>
-        <w:contextualSpacing/>
-        <w:rPr>
-          <w:rFonts w:ascii="Arial" w:eastAsia="Arial" w:hAnsi="Arial" w:cs="Arial"/>
-          <w:b/>
-          <w:bCs/>
-          <w:sz w:val="20"/>
-          <w:szCs w:val="20"/>
-        </w:rPr>
-      </w:pPr>
-    </w:p>
-    <w:p>
-      <w:pPr>
-        <w:spacing w:after="0" w:line="360" w:lineRule="auto"/>
-        <w:ind w:firstLine="283"/>
-        <w:contextualSpacing/>
-        <w:rPr>
-          <w:rFonts w:ascii="Arial" w:eastAsia="Arial" w:hAnsi="Arial" w:cs="Arial"/>
-          <w:b/>
-          <w:bCs/>
-          <w:sz w:val="20"/>
-          <w:szCs w:val="20"/>
-        </w:rPr>
-      </w:pPr>
-    </w:p>
-    <w:p>
-      <w:pPr>
-        <w:spacing w:after="0" w:line="360" w:lineRule="auto"/>
-        <w:ind w:firstLine="283"/>
-        <w:contextualSpacing/>
-        <w:rPr>
-          <w:rFonts w:ascii="Arial" w:eastAsia="Arial" w:hAnsi="Arial" w:cs="Arial"/>
-          <w:b/>
-          <w:bCs/>
-          <w:sz w:val="20"/>
-          <w:szCs w:val="20"/>
-        </w:rPr>
-      </w:pPr>
-    </w:p>
-    <w:p>
-      <w:pPr>
-        <w:spacing w:after="0" w:line="360" w:lineRule="auto"/>
-        <w:ind w:firstLine="283"/>
-        <w:contextualSpacing/>
-        <w:rPr>
-          <w:rFonts w:ascii="Arial" w:eastAsia="Arial" w:hAnsi="Arial" w:cs="Arial"/>
-          <w:sz w:val="20"/>
-          <w:szCs w:val="20"/>
-          <w:lang w:val="en-US"/>
-        </w:rPr>
-      </w:pPr>
-      <w:r>
-        <w:rPr>
-          <w:rFonts w:ascii="Arial" w:eastAsia="Arial" w:hAnsi="Arial" w:cs="Arial"/>
-          <w:b/>
-          <w:bCs/>
-          <w:sz w:val="20"/>
-          <w:szCs w:val="20"/>
-        </w:rPr>
-        <w:t xml:space="preserve">Fonte: </w:t>
-      </w:r>
-      <w:r>
-        <w:rPr>
-          <w:rFonts w:ascii="Arial" w:eastAsia="Arial" w:hAnsi="Arial" w:cs="Arial"/>
-          <w:sz w:val="20"/>
-          <w:szCs w:val="20"/>
-        </w:rPr>
         <w:t>Os Autores</w:t>
       </w:r>
     </w:p>
@@ -5305,7 +5301,28 @@
           <w:sz w:val="28"/>
           <w:szCs w:val="28"/>
         </w:rPr>
-        <w:t>12.RESULTADOS</w:t>
+        <w:lastRenderedPageBreak/>
+        <w:t>1</w:t>
+      </w:r>
+      <w:r>
+        <w:rPr>
+          <w:rFonts w:ascii="Arial" w:eastAsia="Arial" w:hAnsi="Arial" w:cs="Arial"/>
+          <w:b/>
+          <w:bCs/>
+          <w:sz w:val="28"/>
+          <w:szCs w:val="28"/>
+        </w:rPr>
+        <w:t>1</w:t>
+      </w:r>
+      <w:r>
+        <w:rPr>
+          <w:rFonts w:ascii="Arial" w:eastAsia="Arial" w:hAnsi="Arial" w:cs="Arial"/>
+          <w:b/>
+          <w:bCs/>
+          <w:sz w:val="28"/>
+          <w:szCs w:val="28"/>
+        </w:rPr>
+        <w:t>.RESULTADOS</w:t>
       </w:r>
     </w:p>
     <w:p>
@@ -5613,474 +5630,512 @@
           <w:bCs/>
           <w:sz w:val="28"/>
           <w:szCs w:val="28"/>
-          <w:lang w:val="en-US"/>
-        </w:rPr>
-      </w:pPr>
-    </w:p>
-    <w:p>
-      <w:pPr>
-        <w:spacing w:after="0" w:line="360" w:lineRule="auto"/>
-        <w:contextualSpacing/>
-        <w:rPr>
-          <w:rFonts w:ascii="Arial" w:eastAsia="Arial" w:hAnsi="Arial" w:cs="Arial"/>
-          <w:b/>
-          <w:bCs/>
-          <w:sz w:val="28"/>
-          <w:szCs w:val="28"/>
-          <w:lang w:val="en-US"/>
-        </w:rPr>
-      </w:pPr>
-    </w:p>
-    <w:p>
-      <w:pPr>
-        <w:spacing w:after="0" w:line="360" w:lineRule="auto"/>
-        <w:contextualSpacing/>
-        <w:rPr>
-          <w:rFonts w:ascii="Arial" w:eastAsia="Arial" w:hAnsi="Arial" w:cs="Arial"/>
-          <w:b/>
-          <w:bCs/>
-          <w:sz w:val="28"/>
-          <w:szCs w:val="28"/>
-        </w:rPr>
-      </w:pPr>
-    </w:p>
-    <w:p>
-      <w:pPr>
-        <w:spacing w:after="0" w:line="360" w:lineRule="auto"/>
-        <w:contextualSpacing/>
-        <w:rPr>
-          <w:rFonts w:ascii="Arial" w:eastAsia="Arial" w:hAnsi="Arial" w:cs="Arial"/>
-          <w:b/>
-          <w:bCs/>
-          <w:sz w:val="28"/>
-          <w:szCs w:val="28"/>
-          <w:lang w:val="en-US"/>
-        </w:rPr>
-      </w:pPr>
-      <w:r>
-        <w:rPr>
-          <w:rFonts w:ascii="Arial" w:eastAsia="Arial" w:hAnsi="Arial" w:cs="Arial"/>
-          <w:b/>
-          <w:bCs/>
-          <w:sz w:val="28"/>
-          <w:szCs w:val="28"/>
-        </w:rPr>
-        <w:t>13.CONSIDERAÇÕES FINAIS</w:t>
-      </w:r>
-    </w:p>
-    <w:p>
-      <w:pPr>
-        <w:spacing w:after="0" w:line="360" w:lineRule="auto"/>
-        <w:contextualSpacing/>
-        <w:rPr>
-          <w:rFonts w:ascii="Arial" w:eastAsia="Arial" w:hAnsi="Arial" w:cs="Arial"/>
-          <w:b/>
-          <w:bCs/>
-          <w:sz w:val="28"/>
-          <w:szCs w:val="28"/>
-          <w:lang w:val="en-US"/>
-        </w:rPr>
-      </w:pPr>
-    </w:p>
-    <w:p>
-      <w:pPr>
-        <w:spacing w:after="0" w:line="360" w:lineRule="auto"/>
-        <w:contextualSpacing/>
-        <w:rPr>
-          <w:rFonts w:ascii="Arial" w:eastAsia="Arial" w:hAnsi="Arial" w:cs="Arial"/>
-          <w:b/>
-          <w:bCs/>
-          <w:sz w:val="28"/>
-          <w:szCs w:val="28"/>
-          <w:lang w:val="en-US"/>
-        </w:rPr>
-      </w:pPr>
-    </w:p>
-    <w:p>
-      <w:pPr>
-        <w:spacing w:after="0" w:line="360" w:lineRule="auto"/>
-        <w:contextualSpacing/>
-        <w:rPr>
-          <w:rFonts w:ascii="Arial" w:eastAsia="Arial" w:hAnsi="Arial" w:cs="Arial"/>
-          <w:b/>
-          <w:bCs/>
-          <w:sz w:val="28"/>
-          <w:szCs w:val="28"/>
-          <w:lang w:val="en-US"/>
-        </w:rPr>
-      </w:pPr>
-    </w:p>
-    <w:p>
-      <w:pPr>
-        <w:spacing w:after="0" w:line="360" w:lineRule="auto"/>
-        <w:contextualSpacing/>
-        <w:rPr>
-          <w:rFonts w:ascii="Arial" w:eastAsia="Arial" w:hAnsi="Arial" w:cs="Arial"/>
-          <w:b/>
-          <w:bCs/>
-          <w:sz w:val="28"/>
-          <w:szCs w:val="28"/>
-          <w:lang w:val="en-US"/>
-        </w:rPr>
-      </w:pPr>
-    </w:p>
-    <w:p>
-      <w:pPr>
-        <w:spacing w:after="0" w:line="360" w:lineRule="auto"/>
-        <w:contextualSpacing/>
-        <w:rPr>
-          <w:rFonts w:ascii="Arial" w:eastAsia="Arial" w:hAnsi="Arial" w:cs="Arial"/>
-          <w:b/>
-          <w:bCs/>
-          <w:sz w:val="28"/>
-          <w:szCs w:val="28"/>
-          <w:lang w:val="en-US"/>
-        </w:rPr>
-      </w:pPr>
-    </w:p>
-    <w:p>
-      <w:pPr>
-        <w:spacing w:after="0" w:line="360" w:lineRule="auto"/>
-        <w:contextualSpacing/>
-        <w:rPr>
-          <w:rFonts w:ascii="Arial" w:eastAsia="Arial" w:hAnsi="Arial" w:cs="Arial"/>
-          <w:b/>
-          <w:bCs/>
-          <w:sz w:val="28"/>
-          <w:szCs w:val="28"/>
-          <w:lang w:val="en-US"/>
-        </w:rPr>
-      </w:pPr>
-    </w:p>
-    <w:p>
-      <w:pPr>
-        <w:spacing w:after="0" w:line="360" w:lineRule="auto"/>
-        <w:contextualSpacing/>
-        <w:rPr>
-          <w:rFonts w:ascii="Arial" w:eastAsia="Arial" w:hAnsi="Arial" w:cs="Arial"/>
-          <w:b/>
-          <w:bCs/>
-          <w:sz w:val="28"/>
-          <w:szCs w:val="28"/>
-          <w:lang w:val="en-US"/>
-        </w:rPr>
-      </w:pPr>
-    </w:p>
-    <w:p>
-      <w:pPr>
-        <w:spacing w:after="0" w:line="360" w:lineRule="auto"/>
-        <w:contextualSpacing/>
-        <w:rPr>
-          <w:rFonts w:ascii="Arial" w:eastAsia="Arial" w:hAnsi="Arial" w:cs="Arial"/>
-          <w:b/>
-          <w:bCs/>
-          <w:sz w:val="28"/>
-          <w:szCs w:val="28"/>
-          <w:lang w:val="en-US"/>
-        </w:rPr>
-      </w:pPr>
-    </w:p>
-    <w:p>
-      <w:pPr>
-        <w:spacing w:after="0" w:line="360" w:lineRule="auto"/>
-        <w:contextualSpacing/>
-        <w:rPr>
-          <w:rFonts w:ascii="Arial" w:eastAsia="Arial" w:hAnsi="Arial" w:cs="Arial"/>
-          <w:b/>
-          <w:bCs/>
-          <w:sz w:val="28"/>
-          <w:szCs w:val="28"/>
-          <w:lang w:val="en-US"/>
-        </w:rPr>
-      </w:pPr>
-    </w:p>
-    <w:p>
-      <w:pPr>
-        <w:spacing w:after="0" w:line="360" w:lineRule="auto"/>
-        <w:contextualSpacing/>
-        <w:rPr>
-          <w:rFonts w:ascii="Arial" w:eastAsia="Arial" w:hAnsi="Arial" w:cs="Arial"/>
-          <w:b/>
-          <w:bCs/>
-          <w:sz w:val="28"/>
-          <w:szCs w:val="28"/>
-          <w:lang w:val="en-US"/>
-        </w:rPr>
-      </w:pPr>
-    </w:p>
-    <w:p>
-      <w:pPr>
-        <w:spacing w:after="0" w:line="360" w:lineRule="auto"/>
-        <w:contextualSpacing/>
-        <w:rPr>
-          <w:rFonts w:ascii="Arial" w:eastAsia="Arial" w:hAnsi="Arial" w:cs="Arial"/>
-          <w:b/>
-          <w:bCs/>
-          <w:sz w:val="28"/>
-          <w:szCs w:val="28"/>
-          <w:lang w:val="en-US"/>
-        </w:rPr>
-      </w:pPr>
-    </w:p>
-    <w:p>
-      <w:pPr>
-        <w:spacing w:after="0" w:line="360" w:lineRule="auto"/>
-        <w:contextualSpacing/>
-        <w:rPr>
-          <w:rFonts w:ascii="Arial" w:eastAsia="Arial" w:hAnsi="Arial" w:cs="Arial"/>
-          <w:b/>
-          <w:bCs/>
-          <w:sz w:val="28"/>
-          <w:szCs w:val="28"/>
-          <w:lang w:val="en-US"/>
-        </w:rPr>
-      </w:pPr>
-    </w:p>
-    <w:p>
-      <w:pPr>
-        <w:spacing w:after="0" w:line="360" w:lineRule="auto"/>
-        <w:contextualSpacing/>
-        <w:rPr>
-          <w:rFonts w:ascii="Arial" w:eastAsia="Arial" w:hAnsi="Arial" w:cs="Arial"/>
-          <w:b/>
-          <w:bCs/>
-          <w:sz w:val="28"/>
-          <w:szCs w:val="28"/>
-          <w:lang w:val="en-US"/>
-        </w:rPr>
-      </w:pPr>
-    </w:p>
-    <w:p>
-      <w:pPr>
-        <w:spacing w:after="0" w:line="360" w:lineRule="auto"/>
-        <w:contextualSpacing/>
-        <w:rPr>
-          <w:rFonts w:ascii="Arial" w:eastAsia="Arial" w:hAnsi="Arial" w:cs="Arial"/>
-          <w:b/>
-          <w:bCs/>
-          <w:sz w:val="28"/>
-          <w:szCs w:val="28"/>
-          <w:lang w:val="en-US"/>
-        </w:rPr>
-      </w:pPr>
-    </w:p>
-    <w:p>
-      <w:pPr>
-        <w:spacing w:after="0" w:line="360" w:lineRule="auto"/>
-        <w:contextualSpacing/>
-        <w:rPr>
-          <w:rFonts w:ascii="Arial" w:eastAsia="Arial" w:hAnsi="Arial" w:cs="Arial"/>
-          <w:b/>
-          <w:bCs/>
-          <w:sz w:val="28"/>
-          <w:szCs w:val="28"/>
-          <w:lang w:val="en-US"/>
-        </w:rPr>
-      </w:pPr>
-    </w:p>
-    <w:p>
-      <w:pPr>
-        <w:spacing w:after="0" w:line="360" w:lineRule="auto"/>
-        <w:contextualSpacing/>
-        <w:rPr>
-          <w:rFonts w:ascii="Arial" w:eastAsia="Arial" w:hAnsi="Arial" w:cs="Arial"/>
-          <w:b/>
-          <w:bCs/>
-          <w:sz w:val="28"/>
-          <w:szCs w:val="28"/>
-          <w:lang w:val="en-US"/>
-        </w:rPr>
-      </w:pPr>
-    </w:p>
-    <w:p>
-      <w:pPr>
-        <w:spacing w:after="0" w:line="360" w:lineRule="auto"/>
-        <w:contextualSpacing/>
-        <w:rPr>
-          <w:rFonts w:ascii="Arial" w:eastAsia="Arial" w:hAnsi="Arial" w:cs="Arial"/>
-          <w:b/>
-          <w:bCs/>
-          <w:sz w:val="28"/>
-          <w:szCs w:val="28"/>
-          <w:lang w:val="en-US"/>
-        </w:rPr>
-      </w:pPr>
-    </w:p>
-    <w:p>
-      <w:pPr>
-        <w:spacing w:after="0" w:line="360" w:lineRule="auto"/>
-        <w:contextualSpacing/>
-        <w:rPr>
-          <w:rFonts w:ascii="Arial" w:eastAsia="Arial" w:hAnsi="Arial" w:cs="Arial"/>
-          <w:b/>
-          <w:bCs/>
-          <w:sz w:val="28"/>
-          <w:szCs w:val="28"/>
-          <w:lang w:val="en-US"/>
-        </w:rPr>
-      </w:pPr>
-    </w:p>
-    <w:p>
-      <w:pPr>
-        <w:spacing w:after="0" w:line="360" w:lineRule="auto"/>
-        <w:contextualSpacing/>
-        <w:rPr>
-          <w:rFonts w:ascii="Arial" w:eastAsia="Arial" w:hAnsi="Arial" w:cs="Arial"/>
-          <w:b/>
-          <w:bCs/>
-          <w:sz w:val="28"/>
-          <w:szCs w:val="28"/>
-          <w:lang w:val="en-US"/>
-        </w:rPr>
-      </w:pPr>
-    </w:p>
-    <w:p>
-      <w:pPr>
-        <w:spacing w:after="0" w:line="360" w:lineRule="auto"/>
-        <w:contextualSpacing/>
-        <w:rPr>
-          <w:rFonts w:ascii="Arial" w:eastAsia="Arial" w:hAnsi="Arial" w:cs="Arial"/>
-          <w:b/>
-          <w:bCs/>
-          <w:sz w:val="28"/>
-          <w:szCs w:val="28"/>
-          <w:lang w:val="en-US"/>
-        </w:rPr>
-      </w:pPr>
-    </w:p>
-    <w:p>
-      <w:pPr>
-        <w:spacing w:after="0" w:line="360" w:lineRule="auto"/>
-        <w:contextualSpacing/>
-        <w:rPr>
-          <w:rFonts w:ascii="Arial" w:eastAsia="Arial" w:hAnsi="Arial" w:cs="Arial"/>
-          <w:b/>
-          <w:bCs/>
-          <w:sz w:val="28"/>
-          <w:szCs w:val="28"/>
-          <w:lang w:val="en-US"/>
-        </w:rPr>
-      </w:pPr>
-    </w:p>
-    <w:p>
-      <w:pPr>
-        <w:spacing w:after="0" w:line="360" w:lineRule="auto"/>
-        <w:contextualSpacing/>
-        <w:rPr>
-          <w:rFonts w:ascii="Arial" w:eastAsia="Arial" w:hAnsi="Arial" w:cs="Arial"/>
-          <w:b/>
-          <w:bCs/>
-          <w:sz w:val="28"/>
-          <w:szCs w:val="28"/>
-          <w:lang w:val="en-US"/>
-        </w:rPr>
-      </w:pPr>
-    </w:p>
-    <w:p>
-      <w:pPr>
-        <w:spacing w:after="0" w:line="360" w:lineRule="auto"/>
-        <w:contextualSpacing/>
-        <w:rPr>
-          <w:rFonts w:ascii="Arial" w:eastAsia="Arial" w:hAnsi="Arial" w:cs="Arial"/>
-          <w:b/>
-          <w:bCs/>
-          <w:sz w:val="28"/>
-          <w:szCs w:val="28"/>
-          <w:lang w:val="en-US"/>
-        </w:rPr>
-      </w:pPr>
-    </w:p>
-    <w:p>
-      <w:pPr>
-        <w:spacing w:after="0" w:line="360" w:lineRule="auto"/>
-        <w:contextualSpacing/>
-        <w:rPr>
-          <w:rFonts w:ascii="Arial" w:eastAsia="Arial" w:hAnsi="Arial" w:cs="Arial"/>
-          <w:b/>
-          <w:bCs/>
-          <w:sz w:val="28"/>
-          <w:szCs w:val="28"/>
-          <w:lang w:val="en-US"/>
-        </w:rPr>
-      </w:pPr>
-    </w:p>
-    <w:p>
-      <w:pPr>
-        <w:spacing w:after="0" w:line="360" w:lineRule="auto"/>
-        <w:contextualSpacing/>
-        <w:rPr>
-          <w:rFonts w:ascii="Arial" w:eastAsia="Arial" w:hAnsi="Arial" w:cs="Arial"/>
-          <w:b/>
-          <w:bCs/>
-          <w:sz w:val="28"/>
-          <w:szCs w:val="28"/>
-          <w:lang w:val="en-US"/>
-        </w:rPr>
-      </w:pPr>
-    </w:p>
-    <w:p>
-      <w:pPr>
-        <w:spacing w:after="0" w:line="360" w:lineRule="auto"/>
-        <w:contextualSpacing/>
-        <w:rPr>
-          <w:rFonts w:ascii="Arial" w:eastAsia="Arial" w:hAnsi="Arial" w:cs="Arial"/>
-          <w:b/>
-          <w:bCs/>
-          <w:sz w:val="28"/>
-          <w:szCs w:val="28"/>
-          <w:lang w:val="en-US"/>
-        </w:rPr>
-      </w:pPr>
-    </w:p>
-    <w:p>
-      <w:pPr>
-        <w:spacing w:after="0" w:line="360" w:lineRule="auto"/>
-        <w:contextualSpacing/>
-        <w:rPr>
-          <w:rFonts w:ascii="Arial" w:eastAsia="Arial" w:hAnsi="Arial" w:cs="Arial"/>
-          <w:b/>
-          <w:bCs/>
-          <w:sz w:val="28"/>
-          <w:szCs w:val="28"/>
-          <w:lang w:val="en-US"/>
-        </w:rPr>
-      </w:pPr>
-    </w:p>
-    <w:p>
-      <w:pPr>
-        <w:spacing w:after="0" w:line="360" w:lineRule="auto"/>
-        <w:contextualSpacing/>
-        <w:rPr>
-          <w:rFonts w:ascii="Arial" w:eastAsia="Arial" w:hAnsi="Arial" w:cs="Arial"/>
-          <w:b/>
-          <w:bCs/>
-          <w:sz w:val="28"/>
-          <w:szCs w:val="28"/>
-        </w:rPr>
-      </w:pPr>
-    </w:p>
-    <w:p>
-      <w:pPr>
-        <w:spacing w:after="0" w:line="360" w:lineRule="auto"/>
-        <w:contextualSpacing/>
-        <w:rPr>
-          <w:rFonts w:ascii="Arial" w:eastAsia="Arial" w:hAnsi="Arial" w:cs="Arial"/>
-          <w:b/>
-          <w:bCs/>
-          <w:sz w:val="28"/>
-          <w:szCs w:val="28"/>
-          <w:lang w:val="en-US"/>
-        </w:rPr>
-      </w:pPr>
-      <w:r>
-        <w:rPr>
-          <w:rFonts w:ascii="Arial" w:eastAsia="Arial" w:hAnsi="Arial" w:cs="Arial"/>
-          <w:b/>
-          <w:bCs/>
-          <w:sz w:val="28"/>
-          <w:szCs w:val="28"/>
-        </w:rPr>
-        <w:t>14.REFERÊNCIAS</w:t>
+        </w:rPr>
+      </w:pPr>
+    </w:p>
+    <w:p>
+      <w:pPr>
+        <w:spacing w:after="0" w:line="360" w:lineRule="auto"/>
+        <w:contextualSpacing/>
+        <w:rPr>
+          <w:rFonts w:ascii="Arial" w:eastAsia="Arial" w:hAnsi="Arial" w:cs="Arial"/>
+          <w:b/>
+          <w:bCs/>
+          <w:sz w:val="28"/>
+          <w:szCs w:val="28"/>
+        </w:rPr>
+      </w:pPr>
+    </w:p>
+    <w:p>
+      <w:pPr>
+        <w:spacing w:after="0" w:line="360" w:lineRule="auto"/>
+        <w:contextualSpacing/>
+        <w:rPr>
+          <w:rFonts w:ascii="Arial" w:eastAsia="Arial" w:hAnsi="Arial" w:cs="Arial"/>
+          <w:b/>
+          <w:bCs/>
+          <w:sz w:val="28"/>
+          <w:szCs w:val="28"/>
+        </w:rPr>
+      </w:pPr>
+    </w:p>
+    <w:p>
+      <w:pPr>
+        <w:spacing w:after="0" w:line="360" w:lineRule="auto"/>
+        <w:contextualSpacing/>
+        <w:rPr>
+          <w:rFonts w:ascii="Arial" w:eastAsia="Arial" w:hAnsi="Arial" w:cs="Arial"/>
+          <w:b/>
+          <w:bCs/>
+          <w:sz w:val="28"/>
+          <w:szCs w:val="28"/>
+          <w:lang w:val="en-US"/>
+        </w:rPr>
+      </w:pPr>
+      <w:r>
+        <w:rPr>
+          <w:rFonts w:ascii="Arial" w:eastAsia="Arial" w:hAnsi="Arial" w:cs="Arial"/>
+          <w:b/>
+          <w:bCs/>
+          <w:sz w:val="28"/>
+          <w:szCs w:val="28"/>
+        </w:rPr>
+        <w:lastRenderedPageBreak/>
+        <w:t>1</w:t>
+      </w:r>
+      <w:r>
+        <w:rPr>
+          <w:rFonts w:ascii="Arial" w:eastAsia="Arial" w:hAnsi="Arial" w:cs="Arial"/>
+          <w:b/>
+          <w:bCs/>
+          <w:sz w:val="28"/>
+          <w:szCs w:val="28"/>
+        </w:rPr>
+        <w:t>2</w:t>
+      </w:r>
+      <w:r>
+        <w:rPr>
+          <w:rFonts w:ascii="Arial" w:eastAsia="Arial" w:hAnsi="Arial" w:cs="Arial"/>
+          <w:b/>
+          <w:bCs/>
+          <w:sz w:val="28"/>
+          <w:szCs w:val="28"/>
+        </w:rPr>
+        <w:t>.CONSIDERAÇÕES FINAIS</w:t>
+      </w:r>
+    </w:p>
+    <w:p>
+      <w:pPr>
+        <w:spacing w:after="0" w:line="360" w:lineRule="auto"/>
+        <w:contextualSpacing/>
+        <w:rPr>
+          <w:rFonts w:ascii="Arial" w:eastAsia="Arial" w:hAnsi="Arial" w:cs="Arial"/>
+          <w:b/>
+          <w:bCs/>
+          <w:sz w:val="28"/>
+          <w:szCs w:val="28"/>
+          <w:lang w:val="en-US"/>
+        </w:rPr>
+      </w:pPr>
+    </w:p>
+    <w:p>
+      <w:pPr>
+        <w:spacing w:after="0" w:line="360" w:lineRule="auto"/>
+        <w:contextualSpacing/>
+        <w:rPr>
+          <w:rFonts w:ascii="Arial" w:eastAsia="Arial" w:hAnsi="Arial" w:cs="Arial"/>
+          <w:b/>
+          <w:bCs/>
+          <w:sz w:val="28"/>
+          <w:szCs w:val="28"/>
+          <w:lang w:val="en-US"/>
+        </w:rPr>
+      </w:pPr>
+    </w:p>
+    <w:p>
+      <w:pPr>
+        <w:spacing w:after="0" w:line="360" w:lineRule="auto"/>
+        <w:contextualSpacing/>
+        <w:rPr>
+          <w:rFonts w:ascii="Arial" w:eastAsia="Arial" w:hAnsi="Arial" w:cs="Arial"/>
+          <w:b/>
+          <w:bCs/>
+          <w:sz w:val="28"/>
+          <w:szCs w:val="28"/>
+          <w:lang w:val="en-US"/>
+        </w:rPr>
+      </w:pPr>
+    </w:p>
+    <w:p>
+      <w:pPr>
+        <w:spacing w:after="0" w:line="360" w:lineRule="auto"/>
+        <w:contextualSpacing/>
+        <w:rPr>
+          <w:rFonts w:ascii="Arial" w:eastAsia="Arial" w:hAnsi="Arial" w:cs="Arial"/>
+          <w:b/>
+          <w:bCs/>
+          <w:sz w:val="28"/>
+          <w:szCs w:val="28"/>
+          <w:lang w:val="en-US"/>
+        </w:rPr>
+      </w:pPr>
+    </w:p>
+    <w:p>
+      <w:pPr>
+        <w:spacing w:after="0" w:line="360" w:lineRule="auto"/>
+        <w:contextualSpacing/>
+        <w:rPr>
+          <w:rFonts w:ascii="Arial" w:eastAsia="Arial" w:hAnsi="Arial" w:cs="Arial"/>
+          <w:b/>
+          <w:bCs/>
+          <w:sz w:val="28"/>
+          <w:szCs w:val="28"/>
+          <w:lang w:val="en-US"/>
+        </w:rPr>
+      </w:pPr>
+    </w:p>
+    <w:p>
+      <w:pPr>
+        <w:spacing w:after="0" w:line="360" w:lineRule="auto"/>
+        <w:contextualSpacing/>
+        <w:rPr>
+          <w:rFonts w:ascii="Arial" w:eastAsia="Arial" w:hAnsi="Arial" w:cs="Arial"/>
+          <w:b/>
+          <w:bCs/>
+          <w:sz w:val="28"/>
+          <w:szCs w:val="28"/>
+          <w:lang w:val="en-US"/>
+        </w:rPr>
+      </w:pPr>
+    </w:p>
+    <w:p>
+      <w:pPr>
+        <w:spacing w:after="0" w:line="360" w:lineRule="auto"/>
+        <w:contextualSpacing/>
+        <w:rPr>
+          <w:rFonts w:ascii="Arial" w:eastAsia="Arial" w:hAnsi="Arial" w:cs="Arial"/>
+          <w:b/>
+          <w:bCs/>
+          <w:sz w:val="28"/>
+          <w:szCs w:val="28"/>
+          <w:lang w:val="en-US"/>
+        </w:rPr>
+      </w:pPr>
+    </w:p>
+    <w:p>
+      <w:pPr>
+        <w:spacing w:after="0" w:line="360" w:lineRule="auto"/>
+        <w:contextualSpacing/>
+        <w:rPr>
+          <w:rFonts w:ascii="Arial" w:eastAsia="Arial" w:hAnsi="Arial" w:cs="Arial"/>
+          <w:b/>
+          <w:bCs/>
+          <w:sz w:val="28"/>
+          <w:szCs w:val="28"/>
+          <w:lang w:val="en-US"/>
+        </w:rPr>
+      </w:pPr>
+    </w:p>
+    <w:p>
+      <w:pPr>
+        <w:spacing w:after="0" w:line="360" w:lineRule="auto"/>
+        <w:contextualSpacing/>
+        <w:rPr>
+          <w:rFonts w:ascii="Arial" w:eastAsia="Arial" w:hAnsi="Arial" w:cs="Arial"/>
+          <w:b/>
+          <w:bCs/>
+          <w:sz w:val="28"/>
+          <w:szCs w:val="28"/>
+          <w:lang w:val="en-US"/>
+        </w:rPr>
+      </w:pPr>
+    </w:p>
+    <w:p>
+      <w:pPr>
+        <w:spacing w:after="0" w:line="360" w:lineRule="auto"/>
+        <w:contextualSpacing/>
+        <w:rPr>
+          <w:rFonts w:ascii="Arial" w:eastAsia="Arial" w:hAnsi="Arial" w:cs="Arial"/>
+          <w:b/>
+          <w:bCs/>
+          <w:sz w:val="28"/>
+          <w:szCs w:val="28"/>
+          <w:lang w:val="en-US"/>
+        </w:rPr>
+      </w:pPr>
+    </w:p>
+    <w:p>
+      <w:pPr>
+        <w:spacing w:after="0" w:line="360" w:lineRule="auto"/>
+        <w:contextualSpacing/>
+        <w:rPr>
+          <w:rFonts w:ascii="Arial" w:eastAsia="Arial" w:hAnsi="Arial" w:cs="Arial"/>
+          <w:b/>
+          <w:bCs/>
+          <w:sz w:val="28"/>
+          <w:szCs w:val="28"/>
+          <w:lang w:val="en-US"/>
+        </w:rPr>
+      </w:pPr>
+    </w:p>
+    <w:p>
+      <w:pPr>
+        <w:spacing w:after="0" w:line="360" w:lineRule="auto"/>
+        <w:contextualSpacing/>
+        <w:rPr>
+          <w:rFonts w:ascii="Arial" w:eastAsia="Arial" w:hAnsi="Arial" w:cs="Arial"/>
+          <w:b/>
+          <w:bCs/>
+          <w:sz w:val="28"/>
+          <w:szCs w:val="28"/>
+          <w:lang w:val="en-US"/>
+        </w:rPr>
+      </w:pPr>
+    </w:p>
+    <w:p>
+      <w:pPr>
+        <w:spacing w:after="0" w:line="360" w:lineRule="auto"/>
+        <w:contextualSpacing/>
+        <w:rPr>
+          <w:rFonts w:ascii="Arial" w:eastAsia="Arial" w:hAnsi="Arial" w:cs="Arial"/>
+          <w:b/>
+          <w:bCs/>
+          <w:sz w:val="28"/>
+          <w:szCs w:val="28"/>
+          <w:lang w:val="en-US"/>
+        </w:rPr>
+      </w:pPr>
+    </w:p>
+    <w:p>
+      <w:pPr>
+        <w:spacing w:after="0" w:line="360" w:lineRule="auto"/>
+        <w:contextualSpacing/>
+        <w:rPr>
+          <w:rFonts w:ascii="Arial" w:eastAsia="Arial" w:hAnsi="Arial" w:cs="Arial"/>
+          <w:b/>
+          <w:bCs/>
+          <w:sz w:val="28"/>
+          <w:szCs w:val="28"/>
+          <w:lang w:val="en-US"/>
+        </w:rPr>
+      </w:pPr>
+    </w:p>
+    <w:p>
+      <w:pPr>
+        <w:spacing w:after="0" w:line="360" w:lineRule="auto"/>
+        <w:contextualSpacing/>
+        <w:rPr>
+          <w:rFonts w:ascii="Arial" w:eastAsia="Arial" w:hAnsi="Arial" w:cs="Arial"/>
+          <w:b/>
+          <w:bCs/>
+          <w:sz w:val="28"/>
+          <w:szCs w:val="28"/>
+          <w:lang w:val="en-US"/>
+        </w:rPr>
+      </w:pPr>
+    </w:p>
+    <w:p>
+      <w:pPr>
+        <w:spacing w:after="0" w:line="360" w:lineRule="auto"/>
+        <w:contextualSpacing/>
+        <w:rPr>
+          <w:rFonts w:ascii="Arial" w:eastAsia="Arial" w:hAnsi="Arial" w:cs="Arial"/>
+          <w:b/>
+          <w:bCs/>
+          <w:sz w:val="28"/>
+          <w:szCs w:val="28"/>
+          <w:lang w:val="en-US"/>
+        </w:rPr>
+      </w:pPr>
+    </w:p>
+    <w:p>
+      <w:pPr>
+        <w:spacing w:after="0" w:line="360" w:lineRule="auto"/>
+        <w:contextualSpacing/>
+        <w:rPr>
+          <w:rFonts w:ascii="Arial" w:eastAsia="Arial" w:hAnsi="Arial" w:cs="Arial"/>
+          <w:b/>
+          <w:bCs/>
+          <w:sz w:val="28"/>
+          <w:szCs w:val="28"/>
+          <w:lang w:val="en-US"/>
+        </w:rPr>
+      </w:pPr>
+    </w:p>
+    <w:p>
+      <w:pPr>
+        <w:spacing w:after="0" w:line="360" w:lineRule="auto"/>
+        <w:contextualSpacing/>
+        <w:rPr>
+          <w:rFonts w:ascii="Arial" w:eastAsia="Arial" w:hAnsi="Arial" w:cs="Arial"/>
+          <w:b/>
+          <w:bCs/>
+          <w:sz w:val="28"/>
+          <w:szCs w:val="28"/>
+          <w:lang w:val="en-US"/>
+        </w:rPr>
+      </w:pPr>
+    </w:p>
+    <w:p>
+      <w:pPr>
+        <w:spacing w:after="0" w:line="360" w:lineRule="auto"/>
+        <w:contextualSpacing/>
+        <w:rPr>
+          <w:rFonts w:ascii="Arial" w:eastAsia="Arial" w:hAnsi="Arial" w:cs="Arial"/>
+          <w:b/>
+          <w:bCs/>
+          <w:sz w:val="28"/>
+          <w:szCs w:val="28"/>
+          <w:lang w:val="en-US"/>
+        </w:rPr>
+      </w:pPr>
+    </w:p>
+    <w:p>
+      <w:pPr>
+        <w:spacing w:after="0" w:line="360" w:lineRule="auto"/>
+        <w:contextualSpacing/>
+        <w:rPr>
+          <w:rFonts w:ascii="Arial" w:eastAsia="Arial" w:hAnsi="Arial" w:cs="Arial"/>
+          <w:b/>
+          <w:bCs/>
+          <w:sz w:val="28"/>
+          <w:szCs w:val="28"/>
+          <w:lang w:val="en-US"/>
+        </w:rPr>
+      </w:pPr>
+    </w:p>
+    <w:p>
+      <w:pPr>
+        <w:spacing w:after="0" w:line="360" w:lineRule="auto"/>
+        <w:contextualSpacing/>
+        <w:rPr>
+          <w:rFonts w:ascii="Arial" w:eastAsia="Arial" w:hAnsi="Arial" w:cs="Arial"/>
+          <w:b/>
+          <w:bCs/>
+          <w:sz w:val="28"/>
+          <w:szCs w:val="28"/>
+          <w:lang w:val="en-US"/>
+        </w:rPr>
+      </w:pPr>
+    </w:p>
+    <w:p>
+      <w:pPr>
+        <w:spacing w:after="0" w:line="360" w:lineRule="auto"/>
+        <w:contextualSpacing/>
+        <w:rPr>
+          <w:rFonts w:ascii="Arial" w:eastAsia="Arial" w:hAnsi="Arial" w:cs="Arial"/>
+          <w:b/>
+          <w:bCs/>
+          <w:sz w:val="28"/>
+          <w:szCs w:val="28"/>
+          <w:lang w:val="en-US"/>
+        </w:rPr>
+      </w:pPr>
+    </w:p>
+    <w:p>
+      <w:pPr>
+        <w:spacing w:after="0" w:line="360" w:lineRule="auto"/>
+        <w:contextualSpacing/>
+        <w:rPr>
+          <w:rFonts w:ascii="Arial" w:eastAsia="Arial" w:hAnsi="Arial" w:cs="Arial"/>
+          <w:b/>
+          <w:bCs/>
+          <w:sz w:val="28"/>
+          <w:szCs w:val="28"/>
+          <w:lang w:val="en-US"/>
+        </w:rPr>
+      </w:pPr>
+    </w:p>
+    <w:p>
+      <w:pPr>
+        <w:spacing w:after="0" w:line="360" w:lineRule="auto"/>
+        <w:contextualSpacing/>
+        <w:rPr>
+          <w:rFonts w:ascii="Arial" w:eastAsia="Arial" w:hAnsi="Arial" w:cs="Arial"/>
+          <w:b/>
+          <w:bCs/>
+          <w:sz w:val="28"/>
+          <w:szCs w:val="28"/>
+          <w:lang w:val="en-US"/>
+        </w:rPr>
+      </w:pPr>
+    </w:p>
+    <w:p>
+      <w:pPr>
+        <w:spacing w:after="0" w:line="360" w:lineRule="auto"/>
+        <w:contextualSpacing/>
+        <w:rPr>
+          <w:rFonts w:ascii="Arial" w:eastAsia="Arial" w:hAnsi="Arial" w:cs="Arial"/>
+          <w:b/>
+          <w:bCs/>
+          <w:sz w:val="28"/>
+          <w:szCs w:val="28"/>
+          <w:lang w:val="en-US"/>
+        </w:rPr>
+      </w:pPr>
+    </w:p>
+    <w:p>
+      <w:pPr>
+        <w:spacing w:after="0" w:line="360" w:lineRule="auto"/>
+        <w:contextualSpacing/>
+        <w:rPr>
+          <w:rFonts w:ascii="Arial" w:eastAsia="Arial" w:hAnsi="Arial" w:cs="Arial"/>
+          <w:b/>
+          <w:bCs/>
+          <w:sz w:val="28"/>
+          <w:szCs w:val="28"/>
+        </w:rPr>
+      </w:pPr>
+    </w:p>
+    <w:p>
+      <w:pPr>
+        <w:spacing w:after="0" w:line="360" w:lineRule="auto"/>
+        <w:contextualSpacing/>
+        <w:rPr>
+          <w:rFonts w:ascii="Arial" w:eastAsia="Arial" w:hAnsi="Arial" w:cs="Arial"/>
+          <w:b/>
+          <w:bCs/>
+          <w:sz w:val="28"/>
+          <w:szCs w:val="28"/>
+        </w:rPr>
+      </w:pPr>
+    </w:p>
+    <w:p>
+      <w:pPr>
+        <w:spacing w:after="0" w:line="360" w:lineRule="auto"/>
+        <w:contextualSpacing/>
+        <w:rPr>
+          <w:rFonts w:ascii="Arial" w:eastAsia="Arial" w:hAnsi="Arial" w:cs="Arial"/>
+          <w:b/>
+          <w:bCs/>
+          <w:sz w:val="28"/>
+          <w:szCs w:val="28"/>
+        </w:rPr>
+      </w:pPr>
+    </w:p>
+    <w:p>
+      <w:pPr>
+        <w:spacing w:after="0" w:line="360" w:lineRule="auto"/>
+        <w:contextualSpacing/>
+        <w:rPr>
+          <w:rFonts w:ascii="Arial" w:eastAsia="Arial" w:hAnsi="Arial" w:cs="Arial"/>
+          <w:b/>
+          <w:bCs/>
+          <w:sz w:val="28"/>
+          <w:szCs w:val="28"/>
+          <w:lang w:val="en-US"/>
+        </w:rPr>
+      </w:pPr>
+      <w:r>
+        <w:rPr>
+          <w:rFonts w:ascii="Arial" w:eastAsia="Arial" w:hAnsi="Arial" w:cs="Arial"/>
+          <w:b/>
+          <w:bCs/>
+          <w:sz w:val="28"/>
+          <w:szCs w:val="28"/>
+        </w:rPr>
+        <w:lastRenderedPageBreak/>
+        <w:t>1</w:t>
+      </w:r>
+      <w:r>
+        <w:rPr>
+          <w:rFonts w:ascii="Arial" w:eastAsia="Arial" w:hAnsi="Arial" w:cs="Arial"/>
+          <w:b/>
+          <w:bCs/>
+          <w:sz w:val="28"/>
+          <w:szCs w:val="28"/>
+        </w:rPr>
+        <w:t>3</w:t>
+      </w:r>
+      <w:r>
+        <w:rPr>
+          <w:rFonts w:ascii="Arial" w:eastAsia="Arial" w:hAnsi="Arial" w:cs="Arial"/>
+          <w:b/>
+          <w:bCs/>
+          <w:sz w:val="28"/>
+          <w:szCs w:val="28"/>
+        </w:rPr>
+        <w:t>.REFERÊNCIAS</w:t>
       </w:r>
     </w:p>
     <w:p>
@@ -6111,15 +6166,12 @@
         </w:rPr>
         <w:t xml:space="preserve">. Disponível em: </w:t>
       </w:r>
-      <w:hyperlink r:id="rId15">
-        <w:r>
-          <w:rPr>
-            <w:rStyle w:val="Hyperlink"/>
-            <w:rFonts w:ascii="Arial" w:eastAsia="Arial" w:hAnsi="Arial" w:cs="Arial"/>
-          </w:rPr>
-          <w:t>https://code.visualstudio.com/docs</w:t>
-        </w:r>
-      </w:hyperlink>
+      <w:r>
+        <w:rPr>
+          <w:rFonts w:ascii="Arial" w:eastAsia="Arial" w:hAnsi="Arial" w:cs="Arial"/>
+        </w:rPr>
+        <w:t>https://code.visualstudio.com/docs</w:t>
+      </w:r>
       <w:r>
         <w:rPr>
           <w:rFonts w:ascii="Arial" w:eastAsia="Arial" w:hAnsi="Arial" w:cs="Arial"/>
@@ -6178,15 +6230,12 @@
         </w:rPr>
         <w:t xml:space="preserve">. Disponível em: </w:t>
       </w:r>
-      <w:hyperlink r:id="rId16">
-        <w:r>
-          <w:rPr>
-            <w:rStyle w:val="Hyperlink"/>
-            <w:rFonts w:ascii="Arial" w:eastAsia="Arial" w:hAnsi="Arial" w:cs="Arial"/>
-          </w:rPr>
-          <w:t>https://learn.microsoft.com/pt-br/training/modules/introduction-to-visual-studio-code/</w:t>
-        </w:r>
-      </w:hyperlink>
+      <w:r>
+        <w:rPr>
+          <w:rFonts w:ascii="Arial" w:eastAsia="Arial" w:hAnsi="Arial" w:cs="Arial"/>
+        </w:rPr>
+        <w:t>https://learn.microsoft.com/pt-br/training/modules/introduction-to-visual-studio-code/</w:t>
+      </w:r>
       <w:r>
         <w:rPr>
           <w:rFonts w:ascii="Arial" w:eastAsia="Arial" w:hAnsi="Arial" w:cs="Arial"/>
@@ -6253,15 +6302,12 @@
         </w:rPr>
         <w:t xml:space="preserve"> Disponível em: </w:t>
       </w:r>
-      <w:hyperlink r:id="rId17">
-        <w:r>
-          <w:rPr>
-            <w:rStyle w:val="Hyperlink"/>
-            <w:rFonts w:ascii="Arial" w:eastAsia="Arial" w:hAnsi="Arial" w:cs="Arial"/>
-          </w:rPr>
-          <w:t>https://aws.amazon.com/pt/what-is/api/</w:t>
-        </w:r>
-      </w:hyperlink>
+      <w:r>
+        <w:rPr>
+          <w:rFonts w:ascii="Arial" w:eastAsia="Arial" w:hAnsi="Arial" w:cs="Arial"/>
+        </w:rPr>
+        <w:t>https://aws.amazon.com/pt/what-is/api/</w:t>
+      </w:r>
       <w:r>
         <w:rPr>
           <w:rFonts w:ascii="Arial" w:eastAsia="Arial" w:hAnsi="Arial" w:cs="Arial"/>
@@ -6320,15 +6366,12 @@
         </w:rPr>
         <w:t xml:space="preserve">. Disponível em: </w:t>
       </w:r>
-      <w:hyperlink r:id="rId18">
-        <w:r>
-          <w:rPr>
-            <w:rStyle w:val="Hyperlink"/>
-            <w:rFonts w:ascii="Arial" w:eastAsia="Arial" w:hAnsi="Arial" w:cs="Arial"/>
-          </w:rPr>
-          <w:t>https://developer.mozilla.org/pt-BR/docs/Learn/JavaScript/Client-side_web_APIs/Introduction</w:t>
-        </w:r>
-      </w:hyperlink>
+      <w:r>
+        <w:rPr>
+          <w:rFonts w:ascii="Arial" w:eastAsia="Arial" w:hAnsi="Arial" w:cs="Arial"/>
+        </w:rPr>
+        <w:t>https://developer.mozilla.org/pt-BR/docs/Learn/JavaScript/Client-side_web_APIs/Introduction</w:t>
+      </w:r>
       <w:r>
         <w:rPr>
           <w:rFonts w:ascii="Arial" w:eastAsia="Arial" w:hAnsi="Arial" w:cs="Arial"/>
@@ -6387,15 +6430,12 @@
         </w:rPr>
         <w:t xml:space="preserve"> Disponível em: </w:t>
       </w:r>
-      <w:hyperlink r:id="rId19">
-        <w:r>
-          <w:rPr>
-            <w:rStyle w:val="Hyperlink"/>
-            <w:rFonts w:ascii="Arial" w:eastAsia="Arial" w:hAnsi="Arial" w:cs="Arial"/>
-          </w:rPr>
-          <w:t>https://www.redhat.com/pt-br/topics/application-modernization/what-is-a-framework</w:t>
-        </w:r>
-      </w:hyperlink>
+      <w:r>
+        <w:rPr>
+          <w:rFonts w:ascii="Arial" w:eastAsia="Arial" w:hAnsi="Arial" w:cs="Arial"/>
+        </w:rPr>
+        <w:t>https://www.redhat.com/pt-br/topics/application-modernization/what-is-a-framework</w:t>
+      </w:r>
       <w:r>
         <w:rPr>
           <w:rFonts w:ascii="Arial" w:eastAsia="Arial" w:hAnsi="Arial" w:cs="Arial"/>
@@ -6454,15 +6494,12 @@
         </w:rPr>
         <w:t xml:space="preserve">. Disponível em: </w:t>
       </w:r>
-      <w:hyperlink r:id="rId20">
-        <w:r>
-          <w:rPr>
-            <w:rStyle w:val="Hyperlink"/>
-            <w:rFonts w:ascii="Arial" w:eastAsia="Arial" w:hAnsi="Arial" w:cs="Arial"/>
-          </w:rPr>
-          <w:t>https://developer.mozilla.org/pt-BR/docs/Learn/Tools_and_testing/Client-side_JavaScript_frameworks/Introduction</w:t>
-        </w:r>
-      </w:hyperlink>
+      <w:r>
+        <w:rPr>
+          <w:rFonts w:ascii="Arial" w:eastAsia="Arial" w:hAnsi="Arial" w:cs="Arial"/>
+        </w:rPr>
+        <w:t>https://developer.mozilla.org/pt-BR/docs/Learn/Tools_and_testing/Client-side_JavaScript_frameworks/Introduction</w:t>
+      </w:r>
       <w:r>
         <w:rPr>
           <w:rFonts w:ascii="Arial" w:eastAsia="Arial" w:hAnsi="Arial" w:cs="Arial"/>
@@ -6520,15 +6557,12 @@
         </w:rPr>
         <w:t xml:space="preserve"> Disponível em: </w:t>
       </w:r>
-      <w:hyperlink r:id="rId21">
-        <w:r>
-          <w:rPr>
-            <w:rStyle w:val="Hyperlink"/>
-            <w:rFonts w:ascii="Arial" w:eastAsia="Arial" w:hAnsi="Arial" w:cs="Arial"/>
-          </w:rPr>
-          <w:t>https://reactnative.dev/docs/getting-started</w:t>
-        </w:r>
-      </w:hyperlink>
+      <w:r>
+        <w:rPr>
+          <w:rFonts w:ascii="Arial" w:eastAsia="Arial" w:hAnsi="Arial" w:cs="Arial"/>
+        </w:rPr>
+        <w:t>https://reactnative.dev/docs/getting-started</w:t>
+      </w:r>
       <w:r>
         <w:rPr>
           <w:rFonts w:ascii="Arial" w:eastAsia="Arial" w:hAnsi="Arial" w:cs="Arial"/>
@@ -6594,15 +6628,12 @@
         </w:rPr>
         <w:t xml:space="preserve"> Disponível em: </w:t>
       </w:r>
-      <w:hyperlink r:id="rId22">
-        <w:r>
-          <w:rPr>
-            <w:rStyle w:val="Hyperlink"/>
-            <w:rFonts w:ascii="Arial" w:eastAsia="Arial" w:hAnsi="Arial" w:cs="Arial"/>
-          </w:rPr>
-          <w:t>https://www.ibm.com/topics/react-native</w:t>
-        </w:r>
-      </w:hyperlink>
+      <w:r>
+        <w:rPr>
+          <w:rFonts w:ascii="Arial" w:eastAsia="Arial" w:hAnsi="Arial" w:cs="Arial"/>
+        </w:rPr>
+        <w:t>https://www.ibm.com/topics/react-native</w:t>
+      </w:r>
       <w:r>
         <w:rPr>
           <w:rFonts w:ascii="Arial" w:eastAsia="Arial" w:hAnsi="Arial" w:cs="Arial"/>
@@ -6660,15 +6691,12 @@
         </w:rPr>
         <w:t xml:space="preserve">. Disponível em: </w:t>
       </w:r>
-      <w:hyperlink r:id="rId23">
-        <w:r>
-          <w:rPr>
-            <w:rStyle w:val="Hyperlink"/>
-            <w:rFonts w:ascii="Arial" w:eastAsia="Arial" w:hAnsi="Arial" w:cs="Arial"/>
-          </w:rPr>
-          <w:t>https://developer.mozilla.org/pt-BR/docs/Web/JavaScript</w:t>
-        </w:r>
-      </w:hyperlink>
+      <w:r>
+        <w:rPr>
+          <w:rFonts w:ascii="Arial" w:eastAsia="Arial" w:hAnsi="Arial" w:cs="Arial"/>
+        </w:rPr>
+        <w:t>https://developer.mozilla.org/pt-BR/docs/Web/JavaScript</w:t>
+      </w:r>
       <w:r>
         <w:rPr>
           <w:rFonts w:ascii="Arial" w:eastAsia="Arial" w:hAnsi="Arial" w:cs="Arial"/>
@@ -6726,15 +6754,12 @@
         </w:rPr>
         <w:t xml:space="preserve">. Disponível em: </w:t>
       </w:r>
-      <w:hyperlink r:id="rId24">
-        <w:r>
-          <w:rPr>
-            <w:rStyle w:val="Hyperlink"/>
-            <w:rFonts w:ascii="Arial" w:eastAsia="Arial" w:hAnsi="Arial" w:cs="Arial"/>
-          </w:rPr>
-          <w:t>https://www.w3schools.com/js/</w:t>
-        </w:r>
-      </w:hyperlink>
+      <w:r>
+        <w:rPr>
+          <w:rFonts w:ascii="Arial" w:eastAsia="Arial" w:hAnsi="Arial" w:cs="Arial"/>
+        </w:rPr>
+        <w:t>https://www.w3schools.com/js/</w:t>
+      </w:r>
       <w:r>
         <w:rPr>
           <w:rFonts w:ascii="Arial" w:eastAsia="Arial" w:hAnsi="Arial" w:cs="Arial"/>
@@ -6812,15 +6837,12 @@
         </w:rPr>
         <w:t xml:space="preserve"> Disponível em: </w:t>
       </w:r>
-      <w:hyperlink r:id="rId25">
-        <w:r>
-          <w:rPr>
-            <w:rStyle w:val="Hyperlink"/>
-            <w:rFonts w:ascii="Arial" w:eastAsia="Arial" w:hAnsi="Arial" w:cs="Arial"/>
-          </w:rPr>
-          <w:t>https://nodejs.org/en/docs/</w:t>
-        </w:r>
-      </w:hyperlink>
+      <w:r>
+        <w:rPr>
+          <w:rFonts w:ascii="Arial" w:eastAsia="Arial" w:hAnsi="Arial" w:cs="Arial"/>
+        </w:rPr>
+        <w:t>https://nodejs.org/en/docs/</w:t>
+      </w:r>
       <w:r>
         <w:rPr>
           <w:rFonts w:ascii="Arial" w:eastAsia="Arial" w:hAnsi="Arial" w:cs="Arial"/>
@@ -6898,15 +6920,12 @@
         </w:rPr>
         <w:t xml:space="preserve"> Disponível em: </w:t>
       </w:r>
-      <w:hyperlink r:id="rId26">
-        <w:r>
-          <w:rPr>
-            <w:rStyle w:val="Hyperlink"/>
-            <w:rFonts w:ascii="Arial" w:eastAsia="Arial" w:hAnsi="Arial" w:cs="Arial"/>
-          </w:rPr>
-          <w:t>https://www.ibm.com/topics/node-js</w:t>
-        </w:r>
-      </w:hyperlink>
+      <w:r>
+        <w:rPr>
+          <w:rFonts w:ascii="Arial" w:eastAsia="Arial" w:hAnsi="Arial" w:cs="Arial"/>
+        </w:rPr>
+        <w:t>https://www.ibm.com/topics/node-js</w:t>
+      </w:r>
       <w:r>
         <w:rPr>
           <w:rFonts w:ascii="Arial" w:eastAsia="Arial" w:hAnsi="Arial" w:cs="Arial"/>
@@ -6948,6 +6967,7 @@
         <w:rPr>
           <w:rFonts w:ascii="Arial" w:eastAsia="Arial" w:hAnsi="Arial" w:cs="Arial"/>
         </w:rPr>
+        <w:lastRenderedPageBreak/>
         <w:t xml:space="preserve">SCRUM.ORG. </w:t>
       </w:r>
       <w:r>
@@ -6978,15 +6998,12 @@
         </w:rPr>
         <w:t xml:space="preserve"> Disponível em: </w:t>
       </w:r>
-      <w:hyperlink r:id="rId27">
-        <w:r>
-          <w:rPr>
-            <w:rStyle w:val="Hyperlink"/>
-            <w:rFonts w:ascii="Arial" w:eastAsia="Arial" w:hAnsi="Arial" w:cs="Arial"/>
-          </w:rPr>
-          <w:t>https://www.scrum.org/resources/what-is-scrum</w:t>
-        </w:r>
-      </w:hyperlink>
+      <w:r>
+        <w:rPr>
+          <w:rFonts w:ascii="Arial" w:eastAsia="Arial" w:hAnsi="Arial" w:cs="Arial"/>
+        </w:rPr>
+        <w:t>https://www.scrum.org/resources/what-is-scrum</w:t>
+      </w:r>
       <w:r>
         <w:rPr>
           <w:rFonts w:ascii="Arial" w:eastAsia="Arial" w:hAnsi="Arial" w:cs="Arial"/>
@@ -7052,15 +7069,12 @@
         </w:rPr>
         <w:t xml:space="preserve"> Disponível em: </w:t>
       </w:r>
-      <w:hyperlink r:id="rId28">
-        <w:r>
-          <w:rPr>
-            <w:rStyle w:val="Hyperlink"/>
-            <w:rFonts w:ascii="Arial" w:eastAsia="Arial" w:hAnsi="Arial" w:cs="Arial"/>
-          </w:rPr>
-          <w:t>https://www.atlassian.com/br/agile/scrum</w:t>
-        </w:r>
-      </w:hyperlink>
+      <w:r>
+        <w:rPr>
+          <w:rFonts w:ascii="Arial" w:eastAsia="Arial" w:hAnsi="Arial" w:cs="Arial"/>
+        </w:rPr>
+        <w:t>https://www.atlassian.com/br/agile/scrum</w:t>
+      </w:r>
       <w:r>
         <w:rPr>
           <w:rFonts w:ascii="Arial" w:eastAsia="Arial" w:hAnsi="Arial" w:cs="Arial"/>
@@ -7118,15 +7132,12 @@
         </w:rPr>
         <w:t xml:space="preserve">. Disponível em: </w:t>
       </w:r>
-      <w:hyperlink r:id="rId29">
-        <w:r>
-          <w:rPr>
-            <w:rStyle w:val="Hyperlink"/>
-            <w:rFonts w:ascii="Arial" w:eastAsia="Arial" w:hAnsi="Arial" w:cs="Arial"/>
-          </w:rPr>
-          <w:t>https://jestjs.io/docs/getting-started</w:t>
-        </w:r>
-      </w:hyperlink>
+      <w:r>
+        <w:rPr>
+          <w:rFonts w:ascii="Arial" w:eastAsia="Arial" w:hAnsi="Arial" w:cs="Arial"/>
+        </w:rPr>
+        <w:t>https://jestjs.io/docs/getting-started</w:t>
+      </w:r>
       <w:r>
         <w:rPr>
           <w:rFonts w:ascii="Arial" w:eastAsia="Arial" w:hAnsi="Arial" w:cs="Arial"/>
@@ -7187,15 +7198,12 @@
         </w:rPr>
         <w:t xml:space="preserve"> Disponível em: </w:t>
       </w:r>
-      <w:hyperlink r:id="rId30">
-        <w:r>
-          <w:rPr>
-            <w:rStyle w:val="Hyperlink"/>
-            <w:rFonts w:ascii="Arial" w:eastAsia="Arial" w:hAnsi="Arial" w:cs="Arial"/>
-          </w:rPr>
-          <w:t>https://www.freecodecamp.org/news/what-is-jest/</w:t>
-        </w:r>
-      </w:hyperlink>
+      <w:r>
+        <w:rPr>
+          <w:rFonts w:ascii="Arial" w:eastAsia="Arial" w:hAnsi="Arial" w:cs="Arial"/>
+        </w:rPr>
+        <w:t>https://www.freecodecamp.org/news/what-is-jest/</w:t>
+      </w:r>
       <w:r>
         <w:rPr>
           <w:rFonts w:ascii="Arial" w:eastAsia="Arial" w:hAnsi="Arial" w:cs="Arial"/>
@@ -7253,15 +7261,12 @@
         </w:rPr>
         <w:t xml:space="preserve">. Disponível em: </w:t>
       </w:r>
-      <w:hyperlink r:id="rId31">
-        <w:r>
-          <w:rPr>
-            <w:rStyle w:val="Hyperlink"/>
-            <w:rFonts w:ascii="Arial" w:eastAsia="Arial" w:hAnsi="Arial" w:cs="Arial"/>
-          </w:rPr>
-          <w:t>https://help.figma.com/hc/en-us</w:t>
-        </w:r>
-      </w:hyperlink>
+      <w:r>
+        <w:rPr>
+          <w:rFonts w:ascii="Arial" w:eastAsia="Arial" w:hAnsi="Arial" w:cs="Arial"/>
+        </w:rPr>
+        <w:t>https://help.figma.com/hc/en-us</w:t>
+      </w:r>
       <w:r>
         <w:rPr>
           <w:rFonts w:ascii="Arial" w:eastAsia="Arial" w:hAnsi="Arial" w:cs="Arial"/>
@@ -7308,15 +7313,12 @@
         </w:rPr>
         <w:t xml:space="preserve">. Disponível em: </w:t>
       </w:r>
-      <w:hyperlink r:id="rId32">
-        <w:r>
-          <w:rPr>
-            <w:rStyle w:val="Hyperlink"/>
-            <w:rFonts w:ascii="Arial" w:eastAsia="Arial" w:hAnsi="Arial" w:cs="Arial"/>
-          </w:rPr>
-          <w:t>https://www.figma.com/resources/learn-design/</w:t>
-        </w:r>
-      </w:hyperlink>
+      <w:r>
+        <w:rPr>
+          <w:rFonts w:ascii="Arial" w:eastAsia="Arial" w:hAnsi="Arial" w:cs="Arial"/>
+        </w:rPr>
+        <w:t>https://www.figma.com/resources/learn-design/</w:t>
+      </w:r>
       <w:r>
         <w:rPr>
           <w:rFonts w:ascii="Arial" w:eastAsia="Arial" w:hAnsi="Arial" w:cs="Arial"/>
@@ -7362,15 +7364,12 @@
         </w:rPr>
         <w:t xml:space="preserve">. Disponível em: </w:t>
       </w:r>
-      <w:hyperlink r:id="rId33">
-        <w:r>
-          <w:rPr>
-            <w:rStyle w:val="Hyperlink"/>
-            <w:rFonts w:ascii="Arial" w:eastAsia="Arial" w:hAnsi="Arial" w:cs="Arial"/>
-          </w:rPr>
-          <w:t>https://trello.com/guide</w:t>
-        </w:r>
-      </w:hyperlink>
+      <w:r>
+        <w:rPr>
+          <w:rFonts w:ascii="Arial" w:eastAsia="Arial" w:hAnsi="Arial" w:cs="Arial"/>
+        </w:rPr>
+        <w:t>https://trello.com/guide</w:t>
+      </w:r>
       <w:r>
         <w:rPr>
           <w:rFonts w:ascii="Arial" w:eastAsia="Arial" w:hAnsi="Arial" w:cs="Arial"/>
@@ -7417,15 +7416,12 @@
         </w:rPr>
         <w:t xml:space="preserve">. Disponível em: </w:t>
       </w:r>
-      <w:hyperlink r:id="rId34">
-        <w:r>
-          <w:rPr>
-            <w:rStyle w:val="Hyperlink"/>
-            <w:rFonts w:ascii="Arial" w:eastAsia="Arial" w:hAnsi="Arial" w:cs="Arial"/>
-          </w:rPr>
-          <w:t>https://www.atlassian.com/software/trello/guides</w:t>
-        </w:r>
-      </w:hyperlink>
+      <w:r>
+        <w:rPr>
+          <w:rFonts w:ascii="Arial" w:eastAsia="Arial" w:hAnsi="Arial" w:cs="Arial"/>
+        </w:rPr>
+        <w:t>https://www.atlassian.com/software/trello/guides</w:t>
+      </w:r>
       <w:r>
         <w:rPr>
           <w:rFonts w:ascii="Arial" w:eastAsia="Arial" w:hAnsi="Arial" w:cs="Arial"/>
@@ -7471,15 +7467,12 @@
         </w:rPr>
         <w:t xml:space="preserve">. Disponível em: </w:t>
       </w:r>
-      <w:hyperlink r:id="rId35">
-        <w:r>
-          <w:rPr>
-            <w:rStyle w:val="Hyperlink"/>
-            <w:rFonts w:ascii="Arial" w:eastAsia="Arial" w:hAnsi="Arial" w:cs="Arial"/>
-          </w:rPr>
-          <w:t>https://git-scm.com/docs</w:t>
-        </w:r>
-      </w:hyperlink>
+      <w:r>
+        <w:rPr>
+          <w:rFonts w:ascii="Arial" w:eastAsia="Arial" w:hAnsi="Arial" w:cs="Arial"/>
+        </w:rPr>
+        <w:t>https://git-scm.com/docs</w:t>
+      </w:r>
       <w:r>
         <w:rPr>
           <w:rFonts w:ascii="Arial" w:eastAsia="Arial" w:hAnsi="Arial" w:cs="Arial"/>
@@ -7526,15 +7519,12 @@
         </w:rPr>
         <w:t xml:space="preserve">. Disponível em: </w:t>
       </w:r>
-      <w:hyperlink r:id="rId36">
-        <w:r>
-          <w:rPr>
-            <w:rStyle w:val="Hyperlink"/>
-            <w:rFonts w:ascii="Arial" w:eastAsia="Arial" w:hAnsi="Arial" w:cs="Arial"/>
-          </w:rPr>
-          <w:t>https://docs.github.com/pt</w:t>
-        </w:r>
-      </w:hyperlink>
+      <w:r>
+        <w:rPr>
+          <w:rFonts w:ascii="Arial" w:eastAsia="Arial" w:hAnsi="Arial" w:cs="Arial"/>
+        </w:rPr>
+        <w:t>https://docs.github.com/pt</w:t>
+      </w:r>
       <w:r>
         <w:rPr>
           <w:rFonts w:ascii="Arial" w:eastAsia="Arial" w:hAnsi="Arial" w:cs="Arial"/>
@@ -7573,33 +7563,20 @@
           <w:b/>
           <w:bCs/>
         </w:rPr>
-        <w:t xml:space="preserve">Documentação do </w:t>
-      </w:r>
-      <w:proofErr w:type="gramStart"/>
-      <w:r>
-        <w:rPr>
-          <w:rFonts w:ascii="Arial" w:eastAsia="Arial" w:hAnsi="Arial" w:cs="Arial"/>
-          <w:b/>
-          <w:bCs/>
-        </w:rPr>
-        <w:t>package.json</w:t>
-      </w:r>
-      <w:proofErr w:type="gramEnd"/>
+        <w:t>Documentação do package.json</w:t>
+      </w:r>
       <w:r>
         <w:rPr>
           <w:rFonts w:ascii="Arial" w:eastAsia="Arial" w:hAnsi="Arial" w:cs="Arial"/>
         </w:rPr>
         <w:t xml:space="preserve">. Disponível em: </w:t>
       </w:r>
-      <w:hyperlink r:id="rId37">
-        <w:r>
-          <w:rPr>
-            <w:rStyle w:val="Hyperlink"/>
-            <w:rFonts w:ascii="Arial" w:eastAsia="Arial" w:hAnsi="Arial" w:cs="Arial"/>
-          </w:rPr>
-          <w:t>https://docs.npmjs.com/cli/v10/configuring-npm/package-json</w:t>
-        </w:r>
-      </w:hyperlink>
+      <w:r>
+        <w:rPr>
+          <w:rFonts w:ascii="Arial" w:eastAsia="Arial" w:hAnsi="Arial" w:cs="Arial"/>
+        </w:rPr>
+        <w:t>https://docs.npmjs.com/cli/v10/configuring-npm/package-json</w:t>
+      </w:r>
       <w:r>
         <w:rPr>
           <w:rFonts w:ascii="Arial" w:eastAsia="Arial" w:hAnsi="Arial" w:cs="Arial"/>
@@ -7645,15 +7622,12 @@
         </w:rPr>
         <w:t xml:space="preserve">. Disponível em: </w:t>
       </w:r>
-      <w:hyperlink r:id="rId38">
-        <w:r>
-          <w:rPr>
-            <w:rStyle w:val="Hyperlink"/>
-            <w:rFonts w:ascii="Arial" w:eastAsia="Arial" w:hAnsi="Arial" w:cs="Arial"/>
-          </w:rPr>
-          <w:t>https://nodejs.org/en/learn</w:t>
-        </w:r>
-      </w:hyperlink>
+      <w:r>
+        <w:rPr>
+          <w:rFonts w:ascii="Arial" w:eastAsia="Arial" w:hAnsi="Arial" w:cs="Arial"/>
+        </w:rPr>
+        <w:t>https://nodejs.org/en/learn</w:t>
+      </w:r>
       <w:r>
         <w:rPr>
           <w:rFonts w:ascii="Arial" w:eastAsia="Arial" w:hAnsi="Arial" w:cs="Arial"/>
@@ -7684,7 +7658,6 @@
         <w:rPr>
           <w:rFonts w:ascii="Arial" w:eastAsia="Arial" w:hAnsi="Arial" w:cs="Arial"/>
         </w:rPr>
-        <w:lastRenderedPageBreak/>
         <w:t xml:space="preserve">ORACLE. </w:t>
       </w:r>
       <w:r>
@@ -7701,15 +7674,12 @@
         </w:rPr>
         <w:t xml:space="preserve"> Disponível em: </w:t>
       </w:r>
-      <w:hyperlink r:id="rId39">
-        <w:r>
-          <w:rPr>
-            <w:rStyle w:val="Hyperlink"/>
-            <w:rFonts w:ascii="Arial" w:eastAsia="Arial" w:hAnsi="Arial" w:cs="Arial"/>
-          </w:rPr>
-          <w:t>https://www.oracle.com/br/database/what-is-database/</w:t>
-        </w:r>
-      </w:hyperlink>
+      <w:r>
+        <w:rPr>
+          <w:rFonts w:ascii="Arial" w:eastAsia="Arial" w:hAnsi="Arial" w:cs="Arial"/>
+        </w:rPr>
+        <w:t>https://www.oracle.com/br/database/what-is-database/</w:t>
+      </w:r>
       <w:r>
         <w:rPr>
           <w:rFonts w:ascii="Arial" w:eastAsia="Arial" w:hAnsi="Arial" w:cs="Arial"/>
@@ -7755,15 +7725,12 @@
         </w:rPr>
         <w:t xml:space="preserve"> Disponível em: </w:t>
       </w:r>
-      <w:hyperlink r:id="rId40">
-        <w:r>
-          <w:rPr>
-            <w:rStyle w:val="Hyperlink"/>
-            <w:rFonts w:ascii="Arial" w:eastAsia="Arial" w:hAnsi="Arial" w:cs="Arial"/>
-          </w:rPr>
-          <w:t>https://www.ibm.com/topics/databases</w:t>
-        </w:r>
-      </w:hyperlink>
+      <w:r>
+        <w:rPr>
+          <w:rFonts w:ascii="Arial" w:eastAsia="Arial" w:hAnsi="Arial" w:cs="Arial"/>
+        </w:rPr>
+        <w:t>https://www.ibm.com/topics/databases</w:t>
+      </w:r>
       <w:r>
         <w:rPr>
           <w:rFonts w:ascii="Arial" w:eastAsia="Arial" w:hAnsi="Arial" w:cs="Arial"/>
@@ -7791,6 +7758,7 @@
           <w:szCs w:val="28"/>
           <w:lang w:val="en-US"/>
         </w:rPr>
+        <w:lastRenderedPageBreak/>
         <w:t>APÊNDICE A – BIBLIOTECAS UTILIZADAS NO PROJETO</w:t>
       </w:r>
     </w:p>
@@ -8199,7 +8167,6 @@
           <w:color w:val="000000" w:themeColor="text1"/>
           <w:lang w:eastAsia="pt-BR"/>
         </w:rPr>
-        <w:lastRenderedPageBreak/>
         <w:t>    "@vitejs/plugin-react": "^5.1.1",</w:t>
       </w:r>
     </w:p>
@@ -8285,6 +8252,7 @@
           <w:color w:val="000000" w:themeColor="text1"/>
           <w:lang w:eastAsia="pt-BR"/>
         </w:rPr>
+        <w:lastRenderedPageBreak/>
         <w:t>    "vite": "^7.3.1"</w:t>
       </w:r>
     </w:p>
@@ -8680,6 +8648,7 @@
           <w:szCs w:val="28"/>
           <w:lang w:val="en-US"/>
         </w:rPr>
+        <w:lastRenderedPageBreak/>
         <w:t>APÊNDICE B – DIAGRAMA DO BANCO DE DADOS</w:t>
       </w:r>
     </w:p>
@@ -8699,14 +8668,15 @@
         <w:rPr>
           <w:rFonts w:ascii="Arial" w:eastAsia="Arial" w:hAnsi="Arial" w:cs="Arial"/>
           <w:b/>
+          <w:noProof/>
           <w:sz w:val="28"/>
           <w:szCs w:val="28"/>
           <w:lang w:val="en-US"/>
         </w:rPr>
         <w:drawing>
-          <wp:inline distT="0" distB="0" distL="0" distR="0" wp14:anchorId="453F370F" wp14:editId="3F265B64">
+          <wp:inline distT="0" distB="0" distL="0" distR="0" wp14:anchorId="453F370F" wp14:editId="46A92423">
             <wp:extent cx="5731510" cy="3877310"/>
-            <wp:effectExtent l="76200" t="76200" r="135890" b="142240"/>
+            <wp:effectExtent l="38100" t="38100" r="40640" b="46990"/>
             <wp:docPr id="9" name="Imagem 9"/>
             <wp:cNvGraphicFramePr>
               <a:graphicFrameLocks xmlns:a="http://schemas.openxmlformats.org/drawingml/2006/main" noChangeAspect="1"/>
@@ -8719,7 +8689,7 @@
                     <pic:cNvPicPr/>
                   </pic:nvPicPr>
                   <pic:blipFill>
-                    <a:blip r:embed="rId41"/>
+                    <a:blip r:embed="rId15"/>
                     <a:stretch>
                       <a:fillRect/>
                     </a:stretch>
@@ -8732,17 +8702,13 @@
                     <a:prstGeom prst="rect">
                       <a:avLst/>
                     </a:prstGeom>
-                    <a:ln w="38100" cap="sq">
-                      <a:solidFill>
-                        <a:srgbClr val="000000"/>
-                      </a:solidFill>
-                      <a:prstDash val="solid"/>
-                      <a:miter lim="800000"/>
+                    <a:ln>
+                      <a:noFill/>
                     </a:ln>
                     <a:effectLst>
-                      <a:outerShdw blurRad="50800" dist="38100" dir="2700000" algn="tl" rotWithShape="0">
-                        <a:srgbClr val="000000">
-                          <a:alpha val="43000"/>
+                      <a:outerShdw blurRad="292100" dist="139700" dir="2700000" algn="tl" rotWithShape="0">
+                        <a:srgbClr val="333333">
+                          <a:alpha val="0"/>
                         </a:srgbClr>
                       </a:outerShdw>
                     </a:effectLst>
@@ -8966,14 +8932,28 @@
           <w:lang w:val="en-US"/>
         </w:rPr>
       </w:pPr>
-      <w:r>
-        <w:rPr>
-          <w:rFonts w:ascii="Arial" w:eastAsia="Arial" w:hAnsi="Arial" w:cs="Arial"/>
-          <w:b/>
-          <w:sz w:val="28"/>
-          <w:szCs w:val="28"/>
-          <w:lang w:val="en-US"/>
-        </w:rPr>
+    </w:p>
+    <w:p>
+      <w:pPr>
+        <w:spacing w:after="0" w:line="360" w:lineRule="auto"/>
+        <w:contextualSpacing/>
+        <w:rPr>
+          <w:rFonts w:ascii="Arial" w:eastAsia="Arial" w:hAnsi="Arial" w:cs="Arial"/>
+          <w:b/>
+          <w:sz w:val="28"/>
+          <w:szCs w:val="28"/>
+          <w:lang w:val="en-US"/>
+        </w:rPr>
+      </w:pPr>
+      <w:r>
+        <w:rPr>
+          <w:rFonts w:ascii="Arial" w:eastAsia="Arial" w:hAnsi="Arial" w:cs="Arial"/>
+          <w:b/>
+          <w:sz w:val="28"/>
+          <w:szCs w:val="28"/>
+          <w:lang w:val="en-US"/>
+        </w:rPr>
+        <w:lastRenderedPageBreak/>
         <w:t>APÊNDICE C – PROTOTIPAÇÃO DAS TELAS DO APP</w:t>
       </w:r>
     </w:p>
@@ -8990,9 +8970,54 @@
         </w:rPr>
       </w:pPr>
     </w:p>
+    <w:p>
+      <w:pPr>
+        <w:spacing w:after="0" w:line="360" w:lineRule="auto"/>
+        <w:contextualSpacing/>
+        <w:rPr>
+          <w:rFonts w:ascii="Arial" w:eastAsia="Arial" w:hAnsi="Arial" w:cs="Arial"/>
+          <w:sz w:val="20"/>
+          <w:szCs w:val="20"/>
+          <w:lang w:val="en-US"/>
+        </w:rPr>
+      </w:pPr>
+      <w:r>
+        <w:rPr>
+          <w:rFonts w:ascii="Arial" w:eastAsia="Arial" w:hAnsi="Arial" w:cs="Arial"/>
+          <w:b/>
+          <w:sz w:val="20"/>
+          <w:szCs w:val="20"/>
+          <w:lang w:val="en-US"/>
+        </w:rPr>
+        <w:t xml:space="preserve">Fonte: </w:t>
+      </w:r>
+      <w:r>
+        <w:rPr>
+          <w:rFonts w:ascii="Arial" w:eastAsia="Arial" w:hAnsi="Arial" w:cs="Arial"/>
+          <w:sz w:val="20"/>
+          <w:szCs w:val="20"/>
+          <w:lang w:val="en-US"/>
+        </w:rPr>
+        <w:t>Os Autores</w:t>
+      </w:r>
+    </w:p>
+    <w:p>
+      <w:pPr>
+        <w:spacing w:after="0" w:line="360" w:lineRule="auto"/>
+        <w:contextualSpacing/>
+        <w:rPr>
+          <w:rFonts w:ascii="Arial" w:eastAsia="Arial" w:hAnsi="Arial" w:cs="Arial"/>
+          <w:b/>
+          <w:sz w:val="28"/>
+          <w:szCs w:val="28"/>
+          <w:lang w:val="en-US"/>
+        </w:rPr>
+      </w:pPr>
+    </w:p>
     <w:sectPr>
-      <w:footerReference w:type="default" r:id="rId42"/>
-      <w:footerReference w:type="first" r:id="rId43"/>
+      <w:headerReference w:type="default" r:id="rId16"/>
+      <w:footerReference w:type="default" r:id="rId17"/>
+      <w:footerReference w:type="first" r:id="rId18"/>
       <w:pgSz w:w="11906" w:h="16838"/>
       <w:pgMar w:top="1440" w:right="1440" w:bottom="1440" w:left="1440" w:header="720" w:footer="720" w:gutter="0"/>
       <w:pgNumType w:start="1"/>
@@ -9172,6 +9197,48 @@
     </w:p>
   </w:footnote>
 </w:footnotes>
+</file>
+
+<file path=word/header1.xml><?xml version="1.0" encoding="utf-8"?>
+<w:hdr xmlns:wpc="http://schemas.microsoft.com/office/word/2010/wordprocessingCanvas" xmlns:cx="http://schemas.microsoft.com/office/drawing/2014/chartex" xmlns:cx1="http://schemas.microsoft.com/office/drawing/2015/9/8/chartex" xmlns:cx2="http://schemas.microsoft.com/office/drawing/2015/10/21/chartex" xmlns:cx3="http://schemas.microsoft.com/office/drawing/2016/5/9/chartex" xmlns:cx4="http://schemas.microsoft.com/office/drawing/2016/5/10/chartex" xmlns:cx5="http://schemas.microsoft.com/office/drawing/2016/5/11/chartex" xmlns:cx6="http://schemas.microsoft.com/office/drawing/2016/5/12/chartex" xmlns:cx7="http://schemas.microsoft.com/office/drawing/2016/5/13/chartex" xmlns:cx8="http://schemas.microsoft.com/office/drawing/2016/5/14/chartex" xmlns:mc="http://schemas.openxmlformats.org/markup-compatibility/2006" xmlns:aink="http://schemas.microsoft.com/office/drawing/2016/ink" xmlns:am3d="http://schemas.microsoft.com/office/drawing/2017/model3d" xmlns:o="urn:schemas-microsoft-com:office:office" xmlns:r="http://schemas.openxmlformats.org/officeDocument/2006/relationships" xmlns:m="http://schemas.openxmlformats.org/officeDocument/2006/math" xmlns:v="urn:schemas-microsoft-com:vml" xmlns:wp14="http://schemas.microsoft.com/office/word/2010/wordprocessingDrawing" xmlns:wp="http://schemas.openxmlformats.org/drawingml/2006/wordprocessingDrawing" xmlns:w10="urn:schemas-microsoft-com:office:word" xmlns:w="http://schemas.openxmlformats.org/wordprocessingml/2006/main" xmlns:w14="http://schemas.microsoft.com/office/word/2010/wordml" xmlns:w15="http://schemas.microsoft.com/office/word/2012/wordml" xmlns:w16cid="http://schemas.microsoft.com/office/word/2016/wordml/cid" xmlns:w16se="http://schemas.microsoft.com/office/word/2015/wordml/symex" xmlns:wpg="http://schemas.microsoft.com/office/word/2010/wordprocessingGroup" xmlns:wpi="http://schemas.microsoft.com/office/word/2010/wordprocessingInk" xmlns:wne="http://schemas.microsoft.com/office/word/2006/wordml" xmlns:wps="http://schemas.microsoft.com/office/word/2010/wordprocessingShape" mc:Ignorable="w14 w15 w16se w16cid wp14">
+  <w:sdt>
+    <w:sdtPr>
+      <w:id w:val="378129115"/>
+      <w:docPartObj>
+        <w:docPartGallery w:val="Page Numbers (Top of Page)"/>
+        <w:docPartUnique/>
+      </w:docPartObj>
+    </w:sdtPr>
+    <w:sdtContent>
+      <w:p>
+        <w:pPr>
+          <w:pStyle w:val="Cabealho"/>
+          <w:jc w:val="right"/>
+        </w:pPr>
+        <w:r>
+          <w:fldChar w:fldCharType="begin"/>
+        </w:r>
+        <w:r>
+          <w:instrText>PAGE   \* MERGEFORMAT</w:instrText>
+        </w:r>
+        <w:r>
+          <w:fldChar w:fldCharType="separate"/>
+        </w:r>
+        <w:r>
+          <w:t>2</w:t>
+        </w:r>
+        <w:r>
+          <w:fldChar w:fldCharType="end"/>
+        </w:r>
+      </w:p>
+    </w:sdtContent>
+  </w:sdt>
+  <w:p>
+    <w:pPr>
+      <w:pStyle w:val="Cabealho"/>
+    </w:pPr>
+  </w:p>
+</w:hdr>
 </file>
 
 <file path=word/intelligence2.xml><?xml version="1.0" encoding="utf-8"?>
@@ -10031,7 +10098,7 @@
   <w:style w:type="paragraph" w:default="1" w:styleId="Normal">
     <w:name w:val="Normal"/>
     <w:qFormat/>
-    <w:rsid w:val="7DB4426E"/>
+    <w:rsid w:val="007C7372"/>
   </w:style>
   <w:style w:type="paragraph" w:styleId="Ttulo1">
     <w:name w:val="heading 1"/>
@@ -10095,6 +10162,7 @@
   <w:style w:type="paragraph" w:styleId="Cabealho">
     <w:name w:val="header"/>
     <w:basedOn w:val="Normal"/>
+    <w:link w:val="CabealhoChar"/>
     <w:uiPriority w:val="99"/>
     <w:unhideWhenUsed/>
     <w:rsid w:val="7DB4426E"/>
@@ -10258,6 +10326,25 @@
       <w:color w:val="467886"/>
       <w:u w:val="single"/>
     </w:rPr>
+  </w:style>
+  <w:style w:type="character" w:styleId="MenoPendente">
+    <w:name w:val="Unresolved Mention"/>
+    <w:basedOn w:val="Fontepargpadro"/>
+    <w:uiPriority w:val="99"/>
+    <w:semiHidden/>
+    <w:unhideWhenUsed/>
+    <w:rsid w:val="00DA23B4"/>
+    <w:rPr>
+      <w:color w:val="605E5C"/>
+      <w:shd w:val="clear" w:color="auto" w:fill="E1DFDD"/>
+    </w:rPr>
+  </w:style>
+  <w:style w:type="character" w:customStyle="1" w:styleId="CabealhoChar">
+    <w:name w:val="Cabeçalho Char"/>
+    <w:basedOn w:val="Fontepargpadro"/>
+    <w:link w:val="Cabealho"/>
+    <w:uiPriority w:val="99"/>
+    <w:rsid w:val="002A2699"/>
   </w:style>
 </w:styles>
 </file>
@@ -10528,7 +10615,7 @@
 </file>
 
 <file path=customXml/itemProps1.xml><?xml version="1.0" encoding="utf-8"?>
-<ds:datastoreItem xmlns:ds="http://schemas.openxmlformats.org/officeDocument/2006/customXml" ds:itemID="{C230A5F5-2BE1-4D28-9A97-0C92F4BB674F}">
+<ds:datastoreItem xmlns:ds="http://schemas.openxmlformats.org/officeDocument/2006/customXml" ds:itemID="{9E11E1BB-6AB2-4F4C-9FEB-E308002085E3}">
   <ds:schemaRefs>
     <ds:schemaRef ds:uri="http://schemas.openxmlformats.org/officeDocument/2006/bibliography"/>
   </ds:schemaRefs>

</xml_diff>